<commit_message>
updated draft nov 2025 and sent to andreas and kyle
</commit_message>
<xml_diff>
--- a/drafts/pnas:ecolets/old/SISep2025_KO.docx
+++ b/drafts/pnas:ecolets/old/SISep2025_KO.docx
@@ -1,52 +1,1251 @@
 
 <file path=word/document.xml><?xml version="1.0" encoding="utf-8"?>
-<w:document xmlns:w="http://schemas.openxmlformats.org/wordprocessingml/2006/main" xmlns:m="http://schemas.openxmlformats.org/officeDocument/2006/math" xmlns:r="http://schemas.openxmlformats.org/officeDocument/2006/relationships" xmlns:o="urn:schemas-microsoft-com:office:office" xmlns:v="urn:schemas-microsoft-com:vml" xmlns:w10="urn:schemas-microsoft-com:office:word" xmlns:a="http://schemas.openxmlformats.org/drawingml/2006/main" xmlns:pic="http://schemas.openxmlformats.org/drawingml/2006/picture" xmlns:wp="http://schemas.openxmlformats.org/drawingml/2006/wordprocessingDrawing">
+<w:document xmlns:wpc="http://schemas.microsoft.com/office/word/2010/wordprocessingCanvas" xmlns:cx="http://schemas.microsoft.com/office/drawing/2014/chartex" xmlns:cx1="http://schemas.microsoft.com/office/drawing/2015/9/8/chartex" xmlns:cx2="http://schemas.microsoft.com/office/drawing/2015/10/21/chartex" xmlns:cx3="http://schemas.microsoft.com/office/drawing/2016/5/9/chartex" xmlns:cx4="http://schemas.microsoft.com/office/drawing/2016/5/10/chartex" xmlns:cx5="http://schemas.microsoft.com/office/drawing/2016/5/11/chartex" xmlns:cx6="http://schemas.microsoft.com/office/drawing/2016/5/12/chartex" xmlns:cx7="http://schemas.microsoft.com/office/drawing/2016/5/13/chartex" xmlns:cx8="http://schemas.microsoft.com/office/drawing/2016/5/14/chartex" xmlns:mc="http://schemas.openxmlformats.org/markup-compatibility/2006" xmlns:aink="http://schemas.microsoft.com/office/drawing/2016/ink" xmlns:am3d="http://schemas.microsoft.com/office/drawing/2017/model3d" xmlns:o="urn:schemas-microsoft-com:office:office" xmlns:oel="http://schemas.microsoft.com/office/2019/extlst" xmlns:r="http://schemas.openxmlformats.org/officeDocument/2006/relationships" xmlns:m="http://schemas.openxmlformats.org/officeDocument/2006/math" xmlns:v="urn:schemas-microsoft-com:vml" xmlns:wp14="http://schemas.microsoft.com/office/word/2010/wordprocessingDrawing" xmlns:wp="http://schemas.openxmlformats.org/drawingml/2006/wordprocessingDrawing" xmlns:w10="urn:schemas-microsoft-com:office:word" xmlns:w="http://schemas.openxmlformats.org/wordprocessingml/2006/main" xmlns:w14="http://schemas.microsoft.com/office/word/2010/wordml" xmlns:w15="http://schemas.microsoft.com/office/word/2012/wordml" xmlns:w16cex="http://schemas.microsoft.com/office/word/2018/wordml/cex" xmlns:w16cid="http://schemas.microsoft.com/office/word/2016/wordml/cid" xmlns:w16="http://schemas.microsoft.com/office/word/2018/wordml" xmlns:w16du="http://schemas.microsoft.com/office/word/2023/wordml/word16du" xmlns:w16sdtdh="http://schemas.microsoft.com/office/word/2020/wordml/sdtdatahash" xmlns:w16sdtfl="http://schemas.microsoft.com/office/word/2024/wordml/sdtformatlock" xmlns:w16se="http://schemas.microsoft.com/office/word/2015/wordml/symex" xmlns:wpg="http://schemas.microsoft.com/office/word/2010/wordprocessingGroup" xmlns:wpi="http://schemas.microsoft.com/office/word/2010/wordprocessingInk" xmlns:wne="http://schemas.microsoft.com/office/word/2006/wordml" xmlns:wps="http://schemas.microsoft.com/office/word/2010/wordprocessingShape" mc:Ignorable="w14 w15 w16se w16cid w16 w16cex w16sdtdh w16sdtfl w16du wp14">
   <w:body>
     <w:p>
       <w:pPr>
         <w:pStyle w:val="Title"/>
+      </w:pPr>
+      <w:r>
+        <w:rPr>
+          <w:b/>
+        </w:rPr>
+        <w:t>Supporting Information for</w:t>
+      </w:r>
+      <w:r>
+        <w:rPr>
+          <w:b/>
+        </w:rPr>
+        <w:t>:</w:t>
+      </w:r>
+      <w:r>
+        <w:t xml:space="preserve"> </w:t>
+      </w:r>
+      <w:r>
+        <w:rPr>
+          <w:bCs w:val="0"/>
+          <w:szCs w:val="24"/>
+        </w:rPr>
+        <w:t xml:space="preserve"> </w:t>
+      </w:r>
+      <w:r>
+        <w:t xml:space="preserve">Caching in: Quantifying the temporal relationships of seed dispersal interactions </w:t>
+      </w:r>
+    </w:p>
+    <w:p>
+      <w:pPr>
+        <w:pStyle w:val="BodyText"/>
+      </w:pPr>
+    </w:p>
+    <w:p>
+      <w:pPr>
+        <w:pStyle w:val="FirstParagraph"/>
       </w:pPr>
       <w:r>
         <w:rPr>
           <w:b/>
           <w:bCs/>
         </w:rPr>
-        <w:t xml:space="preserve">Supporting Information for</w:t>
-      </w:r>
-      <w:r>
-        <w:t xml:space="preserve">: The relationship between an avian seed disperser and seed availability in the Southwest USA is lagged and dependent on climate and habitat context</w:t>
-      </w:r>
-    </w:p>
-    <w:bookmarkStart w:id="38" w:name="si-figures"/>
+        <w:t>Author List</w:t>
+      </w:r>
+      <w:r>
+        <w:t>: Ana Miller-ter Kuile</w:t>
+      </w:r>
+      <w:r>
+        <w:rPr>
+          <w:vertAlign w:val="superscript"/>
+        </w:rPr>
+        <w:t>1,2</w:t>
+      </w:r>
+      <w:r>
+        <w:t>, Andreas P. Wion</w:t>
+      </w:r>
+      <w:r>
+        <w:rPr>
+          <w:vertAlign w:val="superscript"/>
+        </w:rPr>
+        <w:t>3</w:t>
+      </w:r>
+      <w:r>
+        <w:t>, Kyle C. Rodman</w:t>
+      </w:r>
+      <w:r>
+        <w:rPr>
+          <w:vertAlign w:val="superscript"/>
+        </w:rPr>
+        <w:t>4</w:t>
+      </w:r>
+      <w:r>
+        <w:t>, Kiona Ogle</w:t>
+      </w:r>
+      <w:r>
+        <w:rPr>
+          <w:vertAlign w:val="superscript"/>
+        </w:rPr>
+        <w:t>1</w:t>
+      </w:r>
+      <w:r>
+        <w:t>, Jamie S. Sanderlin</w:t>
+      </w:r>
+      <w:r>
+        <w:rPr>
+          <w:vertAlign w:val="superscript"/>
+        </w:rPr>
+        <w:t>2</w:t>
+      </w:r>
+    </w:p>
+    <w:p>
+      <w:pPr>
+        <w:pStyle w:val="BodyText"/>
+      </w:pPr>
+      <w:r>
+        <w:rPr>
+          <w:b/>
+          <w:bCs/>
+        </w:rPr>
+        <w:t>Author Affiliations</w:t>
+      </w:r>
+      <w:r>
+        <w:t>:</w:t>
+      </w:r>
+    </w:p>
+    <w:p>
+      <w:pPr>
+        <w:pStyle w:val="BodyText"/>
+      </w:pPr>
+      <w:r>
+        <w:rPr>
+          <w:vertAlign w:val="superscript"/>
+        </w:rPr>
+        <w:t>1</w:t>
+      </w:r>
+      <w:r>
+        <w:t xml:space="preserve"> Northern Arizona University School of Informatics, Computing, and Cyber Systems, Flagstaff, Arizona, USA</w:t>
+      </w:r>
+    </w:p>
+    <w:p>
+      <w:pPr>
+        <w:pStyle w:val="BodyText"/>
+      </w:pPr>
+      <w:r>
+        <w:rPr>
+          <w:vertAlign w:val="superscript"/>
+        </w:rPr>
+        <w:t>2</w:t>
+      </w:r>
+      <w:r>
+        <w:t xml:space="preserve"> USDA Forest Service Rocky Mountain Research Station, Flagstaff, Arizona, USA</w:t>
+      </w:r>
+    </w:p>
+    <w:p>
+      <w:pPr>
+        <w:pStyle w:val="BodyText"/>
+      </w:pPr>
+      <w:r>
+        <w:rPr>
+          <w:vertAlign w:val="superscript"/>
+        </w:rPr>
+        <w:t>3</w:t>
+      </w:r>
+      <w:r>
+        <w:t xml:space="preserve"> Forest Stewards Guild, Santa Fe, New Mexico, USA</w:t>
+      </w:r>
+    </w:p>
+    <w:p>
+      <w:pPr>
+        <w:pStyle w:val="BodyText"/>
+      </w:pPr>
+      <w:r>
+        <w:rPr>
+          <w:vertAlign w:val="superscript"/>
+        </w:rPr>
+        <w:t>4</w:t>
+      </w:r>
+      <w:r>
+        <w:t xml:space="preserve"> Ecological Restoration Institute, Northern Arizona University, Flagstaff, Arizona, USA</w:t>
+      </w:r>
+    </w:p>
+    <w:p>
+      <w:pPr>
+        <w:pStyle w:val="BodyText"/>
+      </w:pPr>
+      <w:r>
+        <w:rPr>
+          <w:b/>
+          <w:bCs/>
+        </w:rPr>
+        <w:t>Corresponding author:</w:t>
+      </w:r>
+      <w:r>
+        <w:t xml:space="preserve"> Ana Miller-ter Kuile, ana.miller-ter-kuile@nau.edu, Northern Arizona University School of Informatics, Computing, and Cyber Systems, 1295 Knoles Drive, Flagstaff, Arizona 86011</w:t>
+      </w:r>
+    </w:p>
+    <w:p>
+      <w:pPr>
+        <w:pStyle w:val="BodyText"/>
+      </w:pPr>
+    </w:p>
+    <w:p>
+      <w:pPr>
+        <w:rPr>
+          <w:rFonts w:ascii="Times New Roman" w:eastAsiaTheme="majorEastAsia" w:hAnsi="Times New Roman" w:cstheme="majorBidi"/>
+          <w:b/>
+          <w:bCs/>
+          <w:color w:val="000000" w:themeColor="text1"/>
+          <w:szCs w:val="32"/>
+        </w:rPr>
+      </w:pPr>
+      <w:bookmarkStart w:id="0" w:name="si-figures"/>
+      <w:r>
+        <w:br w:type="page"/>
+      </w:r>
+    </w:p>
     <w:p>
       <w:pPr>
         <w:pStyle w:val="Heading1"/>
       </w:pPr>
       <w:r>
-        <w:t xml:space="preserve">SI Figures</w:t>
+        <w:lastRenderedPageBreak/>
+        <w:t>SI Methods</w:t>
+      </w:r>
+    </w:p>
+    <w:p>
+      <w:pPr>
+        <w:pStyle w:val="FirstParagraph"/>
+        <w:ind w:firstLine="720"/>
+      </w:pPr>
+      <w:r>
+        <w:t xml:space="preserve">We implemented the above model in the Bayesian software JAGS </w:t>
+      </w:r>
+      <w:r>
+        <w:fldChar w:fldCharType="begin"/>
+      </w:r>
+      <w:r>
+        <w:instrText xml:space="preserve"> ADDIN ZOTERO_ITEM CSL_CITATION {"citationID":"TZ9juuFg","properties":{"formattedCitation":"(Plummer, 2003)","plainCitation":"(Plummer, 2003)","dontUpdate":true,"noteIndex":0},"citationItems":[{"id":2379,"uris":["http://zotero.org/users/6391447/items/9RSFP5EG"],"itemData":{"id":2379,"type":"article-journal","container-title":"Proceedings of the 3rd international workshop on distributed statistical computing","issue":"125.10","title":"JAGS: A program for analysis of Bayesian graphical models using Gibbs sampling","volume":"124","author":[{"family":"Plummer","given":"Martyn"}],"issued":{"date-parts":[["2003"]]}}}],"schema":"https://github.com/citation-style-language/schema/raw/master/csl-citation.json"} </w:instrText>
+      </w:r>
+      <w:r>
+        <w:fldChar w:fldCharType="separate"/>
+      </w:r>
+      <w:r>
+        <w:rPr>
+          <w:noProof/>
+        </w:rPr>
+        <w:t>(Plummer, 2003, version 4.3.0)</w:t>
+      </w:r>
+      <w:r>
+        <w:fldChar w:fldCharType="end"/>
+      </w:r>
+      <w:r>
+        <w:t xml:space="preserve"> using R </w:t>
+      </w:r>
+      <w:r>
+        <w:fldChar w:fldCharType="begin"/>
+      </w:r>
+      <w:r>
+        <w:instrText xml:space="preserve"> ADDIN ZOTERO_ITEM CSL_CITATION {"citationID":"U3P1MDVz","properties":{"formattedCitation":"(R Core Team, 2020)","plainCitation":"(R Core Team, 2020)","dontUpdate":true,"noteIndex":0},"citationItems":[{"id":104,"uris":["http://zotero.org/users/6391447/items/V7TK7J44"],"itemData":{"id":104,"type":"software","event-place":"Vienna, Austria","publisher":"R Foundation for Statistical Computing","publisher-place":"Vienna, Austria","title":"R: A language and environment for statistical computing","URL":"https://www.R-project.org/","author":[{"family":"R Core Team","given":""}],"issued":{"date-parts":[["2020"]]}}}],"schema":"https://github.com/citation-style-language/schema/raw/master/csl-citation.json"} </w:instrText>
+      </w:r>
+      <w:r>
+        <w:fldChar w:fldCharType="separate"/>
+      </w:r>
+      <w:r>
+        <w:rPr>
+          <w:noProof/>
+        </w:rPr>
+        <w:t>(R Core Team, 2020, version 4.5.1)</w:t>
+      </w:r>
+      <w:r>
+        <w:fldChar w:fldCharType="end"/>
+      </w:r>
+      <w:r>
+        <w:t xml:space="preserve"> and the </w:t>
+      </w:r>
+      <w:proofErr w:type="spellStart"/>
+      <w:r>
+        <w:t>jagsUI</w:t>
+      </w:r>
+      <w:proofErr w:type="spellEnd"/>
+      <w:r>
+        <w:t xml:space="preserve"> wrapper package </w:t>
+      </w:r>
+      <w:r>
+        <w:fldChar w:fldCharType="begin"/>
+      </w:r>
+      <w:r>
+        <w:instrText xml:space="preserve"> ADDIN ZOTERO_ITEM CSL_CITATION {"citationID":"J4TKAO6M","properties":{"formattedCitation":"(Kellner, 2021)","plainCitation":"(Kellner, 2021)","dontUpdate":true,"noteIndex":0},"citationItems":[{"id":2380,"uris":["http://zotero.org/users/6391447/items/3FKABM4L"],"itemData":{"id":2380,"type":"software","genre":"R","title":"jagsUI: a wrapper around 'rjags' to streamline JAGS analyses","URL":"https://CRAN.R-project.org/package=jagsUI","version":"1.5.2","author":[{"family":"Kellner","given":"K"}],"issued":{"date-parts":[["2021"]]}}}],"schema":"https://github.com/citation-style-language/schema/raw/master/csl-citation.json"} </w:instrText>
+      </w:r>
+      <w:r>
+        <w:fldChar w:fldCharType="separate"/>
+      </w:r>
+      <w:r>
+        <w:rPr>
+          <w:noProof/>
+        </w:rPr>
+        <w:t>(Kellner, 2021, version 1.6.2)</w:t>
+      </w:r>
+      <w:r>
+        <w:fldChar w:fldCharType="end"/>
+      </w:r>
+      <w:r>
+        <w:t xml:space="preserve">. We prepared data using the here </w:t>
+      </w:r>
+      <w:r>
+        <w:fldChar w:fldCharType="begin"/>
+      </w:r>
+      <w:r>
+        <w:instrText xml:space="preserve"> ADDIN ZOTERO_ITEM CSL_CITATION {"citationID":"Va8Ahm78","properties":{"formattedCitation":"(Muller, 2020)","plainCitation":"(Muller, 2020)","dontUpdate":true,"noteIndex":0},"citationItems":[{"id":101,"uris":["http://zotero.org/users/6391447/items/QLQDJ9T4"],"itemData":{"id":101,"type":"software","genre":"R","title":"here: A simpler way to find your files","URL":"https://CRAN.R-project.org/package=here","version":"1.0.1","author":[{"family":"Muller","given":"Kirill"}],"issued":{"date-parts":[["2020"]]}}}],"schema":"https://github.com/citation-style-language/schema/raw/master/csl-citation.json"} </w:instrText>
+      </w:r>
+      <w:r>
+        <w:fldChar w:fldCharType="separate"/>
+      </w:r>
+      <w:r>
+        <w:rPr>
+          <w:noProof/>
+        </w:rPr>
+        <w:t>(Muller, 2020, version 1.0.1)</w:t>
+      </w:r>
+      <w:r>
+        <w:fldChar w:fldCharType="end"/>
+      </w:r>
+      <w:r>
+        <w:t xml:space="preserve">, </w:t>
+      </w:r>
+      <w:proofErr w:type="spellStart"/>
+      <w:r>
+        <w:t>tidyverse</w:t>
+      </w:r>
+      <w:proofErr w:type="spellEnd"/>
+      <w:r>
+        <w:t xml:space="preserve"> </w:t>
+      </w:r>
+      <w:r>
+        <w:fldChar w:fldCharType="begin"/>
+      </w:r>
+      <w:r>
+        <w:instrText xml:space="preserve"> ADDIN ZOTERO_ITEM CSL_CITATION {"citationID":"jDQX3ElH","properties":{"formattedCitation":"(Wickham et al., 2019)","plainCitation":"(Wickham et al., 2019)","dontUpdate":true,"noteIndex":0},"citationItems":[{"id":103,"uris":["http://zotero.org/users/6391447/items/Z5MZP2MP"],"itemData":{"id":103,"type":"article-journal","abstract":"At a high level, the tidyverse is a language for solving data science challenges with R code. Its primary goal is to facilitate a conversation between a human and a computer about data. Less abstractly, the tidyverse is a collection of R packages that share a high-level design philosophy and low-level grammar and data structures, so that learning one package makes it easier to learn the next.","container-title":"Journal of Open Source Software","DOI":"10.21105/joss.01686","ISSN":"2475-9066","issue":"43","journalAbbreviation":"JOSS","language":"en","page":"1686","source":"DOI.org (Crossref)","title":"Welcome to the Tidyverse","volume":"4","author":[{"family":"Wickham","given":"Hadley"},{"family":"Averick","given":"Mara"},{"family":"Bryan","given":"Jennifer"},{"family":"Chang","given":"Winston"},{"family":"McGowan","given":"Lucy"},{"family":"François","given":"Romain"},{"family":"Grolemund","given":"Garrett"},{"family":"Hayes","given":"Alex"},{"family":"Henry","given":"Lionel"},{"family":"Hester","given":"Jim"},{"family":"Kuhn","given":"Max"},{"family":"Pedersen","given":"Thomas"},{"family":"Miller","given":"Evan"},{"family":"Bache","given":"Stephan"},{"family":"Müller","given":"Kirill"},{"family":"Ooms","given":"Jeroen"},{"family":"Robinson","given":"David"},{"family":"Seidel","given":"Dana"},{"family":"Spinu","given":"Vitalie"},{"family":"Takahashi","given":"Kohske"},{"family":"Vaughan","given":"Davis"},{"family":"Wilke","given":"Claus"},{"family":"Woo","given":"Kara"},{"family":"Yutani","given":"Hiroaki"}],"issued":{"date-parts":[["2019",11,21]]}}}],"schema":"https://github.com/citation-style-language/schema/raw/master/csl-citation.json"} </w:instrText>
+      </w:r>
+      <w:r>
+        <w:fldChar w:fldCharType="separate"/>
+      </w:r>
+      <w:r>
+        <w:rPr>
+          <w:noProof/>
+        </w:rPr>
+        <w:t>(Wickham et al., 2019, version 2.0.0)</w:t>
+      </w:r>
+      <w:r>
+        <w:fldChar w:fldCharType="end"/>
+      </w:r>
+      <w:r>
+        <w:t xml:space="preserve">, sf </w:t>
+      </w:r>
+      <w:r>
+        <w:fldChar w:fldCharType="begin"/>
+      </w:r>
+      <w:r>
+        <w:instrText xml:space="preserve"> ADDIN ZOTERO_ITEM CSL_CITATION {"citationID":"NjWnVWRa","properties":{"formattedCitation":"(Pebesma &amp; Bivand, 2023)","plainCitation":"(Pebesma &amp; Bivand, 2023)","dontUpdate":true,"noteIndex":0},"citationItems":[{"id":2884,"uris":["http://zotero.org/groups/5634119/items/R9PIG4SB"],"itemData":{"id":2884,"type":"book","edition":"1","event-place":"New York","ISBN":"978-0-429-45901-6","language":"en","note":"DOI: 10.1201/9780429459016","publisher":"Chapman and Hall/CRC","publisher-place":"New York","source":"Crossref","title":"Spatial Data Science: With Applications in R","title-short":"Spatial Data Science","URL":"https://www.taylorfrancis.com/books/9780429459016","author":[{"family":"Pebesma","given":"Edzer"},{"family":"Bivand","given":"Roger"}],"accessed":{"date-parts":[["2025",7,16]]},"issued":{"date-parts":[["2023",5,10]]}}}],"schema":"https://github.com/citation-style-language/schema/raw/master/csl-citation.json"} </w:instrText>
+      </w:r>
+      <w:r>
+        <w:fldChar w:fldCharType="separate"/>
+      </w:r>
+      <w:r>
+        <w:rPr>
+          <w:noProof/>
+        </w:rPr>
+        <w:t>(Pebesma &amp; Bivand, 2023, version 1.0.21)</w:t>
+      </w:r>
+      <w:r>
+        <w:fldChar w:fldCharType="end"/>
+      </w:r>
+      <w:r>
+        <w:t xml:space="preserve">, terra </w:t>
+      </w:r>
+      <w:r>
+        <w:fldChar w:fldCharType="begin"/>
+      </w:r>
+      <w:r>
+        <w:instrText xml:space="preserve"> ADDIN ZOTERO_ITEM CSL_CITATION {"citationID":"VKB8UVpX","properties":{"formattedCitation":"(Hijmans, 2020)","plainCitation":"(Hijmans, 2020)","dontUpdate":true,"noteIndex":0},"citationItems":[{"id":2885,"uris":["http://zotero.org/groups/5634119/items/7HSV3ZUH"],"itemData":{"id":2885,"type":"dataset","DOI":"10.32614/cran.package.terra","note":"collection-title: CRAN: Contributed Packages","publisher":"The R Foundation","source":"Crossref","title":"terra: Spatial Data Analysis","title-short":"terra","URL":"https://CRAN.R-project.org/package=terra","author":[{"family":"Hijmans","given":"Robert J."}],"accessed":{"date-parts":[["2025",7,16]]},"issued":{"date-parts":[["2020",3,20]]}}}],"schema":"https://github.com/citation-style-language/schema/raw/master/csl-citation.json"} </w:instrText>
+      </w:r>
+      <w:r>
+        <w:fldChar w:fldCharType="separate"/>
+      </w:r>
+      <w:r>
+        <w:rPr>
+          <w:noProof/>
+        </w:rPr>
+        <w:t>(Hijmans, 2020, version 1.8.54)</w:t>
+      </w:r>
+      <w:r>
+        <w:fldChar w:fldCharType="end"/>
+      </w:r>
+      <w:r>
+        <w:t xml:space="preserve">, </w:t>
+      </w:r>
+      <w:proofErr w:type="spellStart"/>
+      <w:r>
+        <w:t>readxl</w:t>
+      </w:r>
+      <w:proofErr w:type="spellEnd"/>
+      <w:r>
+        <w:t xml:space="preserve"> </w:t>
+      </w:r>
+      <w:r>
+        <w:fldChar w:fldCharType="begin"/>
+      </w:r>
+      <w:r>
+        <w:instrText xml:space="preserve"> ADDIN ZOTERO_ITEM CSL_CITATION {"citationID":"92lam9QR","properties":{"formattedCitation":"(Wickham &amp; Bryan, 2015)","plainCitation":"(Wickham &amp; Bryan, 2015)","dontUpdate":true,"noteIndex":0},"citationItems":[{"id":2745,"uris":["http://zotero.org/users/6391447/items/IBQSLUBY"],"itemData":{"id":2745,"type":"dataset","abstract":"Import excel files into R. Supports '.xls' via the embedded 'libxls' C library &lt;https://github.com/libxls/libxls&gt; and '.xlsx' via the embedded 'RapidXML' C++ library &lt;https://rapidxml.sourceforge.net/&gt;. Works on Windows, Mac and Linux without external dependencies.","DOI":"10.32614/CRAN.package.readxl","language":"en","note":"Institution: Comprehensive R Archive Network\npage: 1.4.3","source":"DOI.org (Crossref)","title":"readxl: Read Excel Files","title-short":"readxl","URL":"https://CRAN.R-project.org/package=readxl","author":[{"family":"Wickham","given":"Hadley"},{"family":"Bryan","given":"Jennifer"}],"accessed":{"date-parts":[["2025",2,24]]},"issued":{"date-parts":[["2015",4,14]]}}}],"schema":"https://github.com/citation-style-language/schema/raw/master/csl-citation.json"} </w:instrText>
+      </w:r>
+      <w:r>
+        <w:fldChar w:fldCharType="separate"/>
+      </w:r>
+      <w:r>
+        <w:rPr>
+          <w:noProof/>
+        </w:rPr>
+        <w:t>(Wickham &amp; Bryan, 2015, version 1.4.5)</w:t>
+      </w:r>
+      <w:r>
+        <w:fldChar w:fldCharType="end"/>
+      </w:r>
+      <w:r>
+        <w:t xml:space="preserve">, </w:t>
+      </w:r>
+      <w:proofErr w:type="spellStart"/>
+      <w:r>
+        <w:t>exactextractr</w:t>
+      </w:r>
+      <w:proofErr w:type="spellEnd"/>
+      <w:r>
+        <w:t xml:space="preserve"> </w:t>
+      </w:r>
+      <w:r>
+        <w:fldChar w:fldCharType="begin"/>
+      </w:r>
+      <w:r>
+        <w:instrText xml:space="preserve"> ADDIN ZOTERO_ITEM CSL_CITATION {"citationID":"z3f7F387","properties":{"formattedCitation":"(Daniel Baston, 2019)","plainCitation":"(Daniel Baston, 2019)","dontUpdate":true,"noteIndex":0},"citationItems":[{"id":2887,"uris":["http://zotero.org/users/6391447/items/E2DRXRIV"],"itemData":{"id":2887,"type":"dataset","DOI":"10.32614/cran.package.exactextractr","note":"collection-title: CRAN: Contributed Packages","publisher":"The R Foundation","source":"Crossref","title":"exactextractr: Fast Extraction from Raster Datasets using Polygons","title-short":"exactextractr","URL":"https://CRAN.R-project.org/package=exactextractr","author":[{"literal":"Daniel Baston"}],"accessed":{"date-parts":[["2025",7,16]]},"issued":{"date-parts":[["2019",8,1]]}}}],"schema":"https://github.com/citation-style-language/schema/raw/master/csl-citation.json"} </w:instrText>
+      </w:r>
+      <w:r>
+        <w:fldChar w:fldCharType="separate"/>
+      </w:r>
+      <w:r>
+        <w:rPr>
+          <w:noProof/>
+        </w:rPr>
+        <w:t>(Daniel Baston, 2019, version 0.10.0)</w:t>
+      </w:r>
+      <w:r>
+        <w:fldChar w:fldCharType="end"/>
+      </w:r>
+      <w:r>
+        <w:t xml:space="preserve">, </w:t>
+      </w:r>
+      <w:proofErr w:type="spellStart"/>
+      <w:r>
+        <w:t>spatialEco</w:t>
+      </w:r>
+      <w:proofErr w:type="spellEnd"/>
+      <w:r>
+        <w:t xml:space="preserve"> </w:t>
+      </w:r>
+      <w:r>
+        <w:fldChar w:fldCharType="begin"/>
+      </w:r>
+      <w:r>
+        <w:instrText xml:space="preserve"> ADDIN ZOTERO_ITEM CSL_CITATION {"citationID":"UBNSVsAy","properties":{"formattedCitation":"(Evans &amp; Murphy, 2023)","plainCitation":"(Evans &amp; Murphy, 2023)","dontUpdate":true,"noteIndex":0},"citationItems":[{"id":2890,"uris":["http://zotero.org/users/6391447/items/ST4LHMBV"],"itemData":{"id":2890,"type":"software","title":"spatialEco","version":"2.0-2","author":[{"family":"Evans","given":"Jeffrey S"},{"family":"Murphy","given":"Melanie A"}],"issued":{"date-parts":[["2023"]]}}}],"schema":"https://github.com/citation-style-language/schema/raw/master/csl-citation.json"} </w:instrText>
+      </w:r>
+      <w:r>
+        <w:fldChar w:fldCharType="separate"/>
+      </w:r>
+      <w:r>
+        <w:rPr>
+          <w:noProof/>
+        </w:rPr>
+        <w:t>(Evans &amp; Murphy, 2023, version 2.0-2)</w:t>
+      </w:r>
+      <w:r>
+        <w:fldChar w:fldCharType="end"/>
+      </w:r>
+      <w:r>
+        <w:t xml:space="preserve">, </w:t>
+      </w:r>
+      <w:proofErr w:type="spellStart"/>
+      <w:r>
+        <w:t>nngeo</w:t>
+      </w:r>
+      <w:proofErr w:type="spellEnd"/>
+      <w:r>
+        <w:t xml:space="preserve"> </w:t>
+      </w:r>
+      <w:r>
+        <w:fldChar w:fldCharType="begin"/>
+      </w:r>
+      <w:r>
+        <w:instrText xml:space="preserve"> ADDIN ZOTERO_ITEM CSL_CITATION {"citationID":"jEIMje0w","properties":{"formattedCitation":"(Dorman, 2018)","plainCitation":"(Dorman, 2018)","dontUpdate":true,"noteIndex":0},"citationItems":[{"id":2891,"uris":["http://zotero.org/users/6391447/items/JAZVYA8W"],"itemData":{"id":2891,"type":"dataset","DOI":"10.32614/cran.package.nngeo","note":"collection-title: CRAN: Contributed Packages","publisher":"The R Foundation","source":"Crossref","title":"nngeo: k-Nearest Neighbor Join for Spatial Data","title-short":"nngeo","URL":"https://CRAN.R-project.org/package=nngeo","author":[{"family":"Dorman","given":"Michael"}],"accessed":{"date-parts":[["2025",7,16]]},"issued":{"date-parts":[["2018",1,16]]}}}],"schema":"https://github.com/citation-style-language/schema/raw/master/csl-citation.json"} </w:instrText>
+      </w:r>
+      <w:r>
+        <w:fldChar w:fldCharType="separate"/>
+      </w:r>
+      <w:r>
+        <w:rPr>
+          <w:noProof/>
+        </w:rPr>
+        <w:t>(Dorman, 2018, version 0.4.8)</w:t>
+      </w:r>
+      <w:r>
+        <w:fldChar w:fldCharType="end"/>
+      </w:r>
+      <w:r>
+        <w:t xml:space="preserve">, auk </w:t>
+      </w:r>
+      <w:r>
+        <w:fldChar w:fldCharType="begin"/>
+      </w:r>
+      <w:r>
+        <w:instrText xml:space="preserve"> ADDIN ZOTERO_ITEM CSL_CITATION {"citationID":"gsLo05wM","properties":{"formattedCitation":"(Strimas-Mackey et al., 2017)","plainCitation":"(Strimas-Mackey et al., 2017)","dontUpdate":true,"noteIndex":0},"citationItems":[{"id":2893,"uris":["http://zotero.org/users/6391447/items/L83D3JCT"],"itemData":{"id":2893,"type":"dataset","DOI":"10.32614/cran.package.auk","note":"collection-title: CRAN: Contributed Packages","publisher":"The R Foundation","source":"Crossref","title":"auk: eBird Data Extraction and Processing in R","title-short":"auk","URL":"https://CRAN.R-project.org/package=auk","author":[{"family":"Strimas-Mackey","given":"Matthew"},{"family":"Miller","given":"Eliot"},{"family":"Hochachka","given":"Wesley"}],"accessed":{"date-parts":[["2025",7,16]]},"issued":{"date-parts":[["2017",7,5]]}}}],"schema":"https://github.com/citation-style-language/schema/raw/master/csl-citation.json"} </w:instrText>
+      </w:r>
+      <w:r>
+        <w:fldChar w:fldCharType="separate"/>
+      </w:r>
+      <w:r>
+        <w:rPr>
+          <w:noProof/>
+        </w:rPr>
+        <w:t>(Strimas-Mackey et al., 2017, version 0.8.2)</w:t>
+      </w:r>
+      <w:r>
+        <w:fldChar w:fldCharType="end"/>
+      </w:r>
+      <w:r>
+        <w:t xml:space="preserve">, </w:t>
+      </w:r>
+      <w:proofErr w:type="spellStart"/>
+      <w:r>
+        <w:t>lubridate</w:t>
+      </w:r>
+      <w:proofErr w:type="spellEnd"/>
+      <w:r>
+        <w:t xml:space="preserve"> </w:t>
+      </w:r>
+      <w:r>
+        <w:fldChar w:fldCharType="begin"/>
+      </w:r>
+      <w:r>
+        <w:instrText xml:space="preserve"> ADDIN ZOTERO_ITEM CSL_CITATION {"citationID":"gYbIPxjJ","properties":{"formattedCitation":"(Grolemund &amp; Wickham, 2011)","plainCitation":"(Grolemund &amp; Wickham, 2011)","dontUpdate":true,"noteIndex":0},"citationItems":[{"id":2895,"uris":["http://zotero.org/users/6391447/items/DX7GM6WB"],"itemData":{"id":2895,"type":"article-journal","container-title":"Journal of Statistical Software","DOI":"10.18637/jss.v040.i03","ISSN":"1548-7660","issue":"3","journalAbbreviation":"J. Stat. Soft.","language":"en","note":"publisher: Foundation for Open Access Statistic","source":"Crossref","title":"Dates and Times Made Easy with&lt;b&gt;lubridate&lt;/b&gt;","URL":"http://www.jstatsoft.org/v40/i03/","volume":"40","author":[{"family":"Grolemund","given":"Garrett"},{"family":"Wickham","given":"Hadley"}],"accessed":{"date-parts":[["2025",7,16]]},"issued":{"date-parts":[["2011"]]}}}],"schema":"https://github.com/citation-style-language/schema/raw/master/csl-citation.json"} </w:instrText>
+      </w:r>
+      <w:r>
+        <w:fldChar w:fldCharType="separate"/>
+      </w:r>
+      <w:r>
+        <w:rPr>
+          <w:noProof/>
+        </w:rPr>
+        <w:t>(Grolemund &amp; Wickham, 2011, version 1.9.4)</w:t>
+      </w:r>
+      <w:r>
+        <w:fldChar w:fldCharType="end"/>
+      </w:r>
+      <w:r>
+        <w:t xml:space="preserve">, prism </w:t>
+      </w:r>
+      <w:r>
+        <w:fldChar w:fldCharType="begin"/>
+      </w:r>
+      <w:r>
+        <w:instrText xml:space="preserve"> ADDIN ZOTERO_ITEM CSL_CITATION {"citationID":"smccobBF","properties":{"formattedCitation":"(Hart &amp; Bell, 2015)","plainCitation":"(Hart &amp; Bell, 2015)","dontUpdate":true,"noteIndex":0},"citationItems":[{"id":2896,"uris":["http://zotero.org/users/6391447/items/GFDELV22"],"itemData":{"id":2896,"type":"software","abstract":"Allows users to access the Oregon State Prism climate data. Using the webservice API data can easily downloaded in bulk and loaded into R for spatial analysis. Some user friendly visualizations are also provided.","license":"MIT License, Open Access","note":"DOI: 10.5281/ZENODO.33663","publisher":"Zenodo","source":"DOI.org (Datacite)","title":"prism: Access data from the Oregon State Prism climate project","title-short":"prism","URL":"https://zenodo.org/record/33663","author":[{"family":"Hart","given":"Edmund"},{"family":"Bell","given":"Kendon"}],"accessed":{"date-parts":[["2025",7,16]]},"issued":{"date-parts":[["2015",11,12]]}}}],"schema":"https://github.com/citation-style-language/schema/raw/master/csl-citation.json"} </w:instrText>
+      </w:r>
+      <w:r>
+        <w:fldChar w:fldCharType="separate"/>
+      </w:r>
+      <w:r>
+        <w:rPr>
+          <w:noProof/>
+        </w:rPr>
+        <w:t>(Hart &amp; Bell, 2015, version 0.0.6)</w:t>
+      </w:r>
+      <w:r>
+        <w:fldChar w:fldCharType="end"/>
+      </w:r>
+      <w:r>
+        <w:t xml:space="preserve">, FNN </w:t>
+      </w:r>
+      <w:r>
+        <w:fldChar w:fldCharType="begin"/>
+      </w:r>
+      <w:r>
+        <w:instrText xml:space="preserve"> ADDIN ZOTERO_ITEM CSL_CITATION {"citationID":"2atpAqRi","properties":{"formattedCitation":"(Beygelzimer et al., 2010)","plainCitation":"(Beygelzimer et al., 2010)","dontUpdate":true,"noteIndex":0},"citationItems":[{"id":2897,"uris":["http://zotero.org/users/6391447/items/986APTZN"],"itemData":{"id":2897,"type":"dataset","DOI":"10.32614/cran.package.fnn","note":"collection-title: CRAN: Contributed Packages","publisher":"The R Foundation","source":"Crossref","title":"FNN: Fast Nearest Neighbor Search Algorithms and Applications","title-short":"FNN","URL":"https://CRAN.R-project.org/package=FNN","author":[{"family":"Beygelzimer","given":"Alina"},{"family":"Kakadet","given":"Sham"},{"family":"Langford","given":"John"},{"family":"Arya","given":"Sunil"},{"family":"Mount","given":"David"},{"family":"Li","given":"Shengqiao"}],"accessed":{"date-parts":[["2025",7,16]]},"issued":{"date-parts":[["2010",3,17]]}}}],"schema":"https://github.com/citation-style-language/schema/raw/master/csl-citation.json"} </w:instrText>
+      </w:r>
+      <w:r>
+        <w:fldChar w:fldCharType="separate"/>
+      </w:r>
+      <w:r>
+        <w:rPr>
+          <w:noProof/>
+        </w:rPr>
+        <w:t>(Beygelzimer et al., 2010, version 1.1.4.1)</w:t>
+      </w:r>
+      <w:r>
+        <w:fldChar w:fldCharType="end"/>
+      </w:r>
+      <w:r>
+        <w:t xml:space="preserve">, and </w:t>
+      </w:r>
+      <w:proofErr w:type="spellStart"/>
+      <w:r>
+        <w:t>data.table</w:t>
+      </w:r>
+      <w:proofErr w:type="spellEnd"/>
+      <w:r>
+        <w:t xml:space="preserve"> </w:t>
+      </w:r>
+      <w:r>
+        <w:fldChar w:fldCharType="begin"/>
+      </w:r>
+      <w:r>
+        <w:instrText xml:space="preserve"> ADDIN ZOTERO_ITEM CSL_CITATION {"citationID":"kaFAuBDu","properties":{"formattedCitation":"(Barrett et al., 2006)","plainCitation":"(Barrett et al., 2006)","dontUpdate":true,"noteIndex":0},"citationItems":[{"id":2817,"uris":["http://zotero.org/users/6391447/items/G7RZHXS7"],"itemData":{"id":2817,"type":"dataset","DOI":"10.32614/cran.package.data.table","note":"collection-title: CRAN: Contributed Packages","publisher":"The R Foundation","source":"Crossref","title":"data.table: Extension of `data.frame`","title-short":"data.table","URL":"https://CRAN.R-project.org/package=data.table","author":[{"family":"Barrett","given":"Tyson"},{"family":"Dowle","given":"Matt"},{"family":"Srinivasan","given":"Arun"},{"family":"Gorecki","given":"Jan"},{"family":"Chirico","given":"Michael"},{"family":"Hocking","given":"Toby"},{"family":"Schwendinger","given":"Benjamin"},{"family":"Krylov","given":"Ivan"}],"accessed":{"date-parts":[["2025",7,7]]},"issued":{"date-parts":[["2006",4,15]]}}}],"schema":"https://github.com/citation-style-language/schema/raw/master/csl-citation.json"} </w:instrText>
+      </w:r>
+      <w:r>
+        <w:fldChar w:fldCharType="separate"/>
+      </w:r>
+      <w:r>
+        <w:rPr>
+          <w:noProof/>
+        </w:rPr>
+        <w:t>(Barrett et al., 2006, version 1.17.6)</w:t>
+      </w:r>
+      <w:r>
+        <w:fldChar w:fldCharType="end"/>
+      </w:r>
+      <w:r>
+        <w:t xml:space="preserve"> packages.</w:t>
+      </w:r>
+    </w:p>
+    <w:p>
+      <w:pPr>
+        <w:pStyle w:val="Heading1"/>
+      </w:pPr>
+      <w:r>
+        <w:lastRenderedPageBreak/>
+        <w:t>SI Figures</w:t>
       </w:r>
     </w:p>
     <w:p>
       <w:pPr>
         <w:pStyle w:val="CaptionedFigure"/>
-      </w:pPr>
-      <w:r>
+        <w:jc w:val="center"/>
+      </w:pPr>
+      <w:r>
+        <w:rPr>
+          <w:noProof/>
+        </w:rPr>
         <w:drawing>
-          <wp:inline>
-            <wp:extent cx="3810000" cy="2540000"/>
-            <wp:effectExtent b="0" l="0" r="0" t="0"/>
-            <wp:docPr descr="SI Figure 1: Validation for use of space-for-time substitution of replicate checklists within sampling polygons. To use replicate eBird surveys within a year at a location in models such as N-mixture or occupancy models, checklists need to represent sites that display the full range of values for covariates of interest. In general, checklists in our dataset do; for the two covariates for which we are missing the upper tails (cone availability and pinyon basal area, panels a and e), these represent extreme outliers (&lt;1% of total values in the dataset)." title="" id="21" name="Picture"/>
-            <a:graphic>
+          <wp:inline distT="0" distB="0" distL="0" distR="0" wp14:anchorId="5CB2D1D1" wp14:editId="5E679C4D">
+            <wp:extent cx="2933530" cy="1955685"/>
+            <wp:effectExtent l="0" t="0" r="0" b="0"/>
+            <wp:docPr id="508403668" name="Picture 1" descr="A graph showing a checklist present in grid&#10;&#10;AI-generated content may be incorrect."/>
+            <wp:cNvGraphicFramePr>
+              <a:graphicFrameLocks xmlns:a="http://schemas.openxmlformats.org/drawingml/2006/main" noChangeAspect="1"/>
+            </wp:cNvGraphicFramePr>
+            <a:graphic xmlns:a="http://schemas.openxmlformats.org/drawingml/2006/main">
               <a:graphicData uri="http://schemas.openxmlformats.org/drawingml/2006/picture">
-                <pic:pic>
+                <pic:pic xmlns:pic="http://schemas.openxmlformats.org/drawingml/2006/picture">
                   <pic:nvPicPr>
-                    <pic:cNvPr descr="../pictures/final/space_for_time.jpg" id="22" name="Picture"/>
+                    <pic:cNvPr id="508403668" name="Picture 1" descr="A graph showing a checklist present in grid&#10;&#10;AI-generated content may be incorrect."/>
+                    <pic:cNvPicPr/>
+                  </pic:nvPicPr>
+                  <pic:blipFill>
+                    <a:blip r:embed="rId8" cstate="print">
+                      <a:extLst>
+                        <a:ext uri="{28A0092B-C50C-407E-A947-70E740481C1C}">
+                          <a14:useLocalDpi xmlns:a14="http://schemas.microsoft.com/office/drawing/2010/main" val="0"/>
+                        </a:ext>
+                      </a:extLst>
+                    </a:blip>
+                    <a:stretch>
+                      <a:fillRect/>
+                    </a:stretch>
+                  </pic:blipFill>
+                  <pic:spPr>
+                    <a:xfrm>
+                      <a:off x="0" y="0"/>
+                      <a:ext cx="2990844" cy="1993894"/>
+                    </a:xfrm>
+                    <a:prstGeom prst="rect">
+                      <a:avLst/>
+                    </a:prstGeom>
+                  </pic:spPr>
+                </pic:pic>
+              </a:graphicData>
+            </a:graphic>
+          </wp:inline>
+        </w:drawing>
+      </w:r>
+      <w:r>
+        <w:rPr>
+          <w:noProof/>
+        </w:rPr>
+        <w:drawing>
+          <wp:inline distT="0" distB="0" distL="0" distR="0" wp14:anchorId="01FA6F03" wp14:editId="04D79B25">
+            <wp:extent cx="2938072" cy="1958715"/>
+            <wp:effectExtent l="0" t="0" r="0" b="0"/>
+            <wp:docPr id="1550281196" name="Picture 2" descr="A graph showing a checklist present in grid&#10;&#10;AI-generated content may be incorrect."/>
+            <wp:cNvGraphicFramePr>
+              <a:graphicFrameLocks xmlns:a="http://schemas.openxmlformats.org/drawingml/2006/main" noChangeAspect="1"/>
+            </wp:cNvGraphicFramePr>
+            <a:graphic xmlns:a="http://schemas.openxmlformats.org/drawingml/2006/main">
+              <a:graphicData uri="http://schemas.openxmlformats.org/drawingml/2006/picture">
+                <pic:pic xmlns:pic="http://schemas.openxmlformats.org/drawingml/2006/picture">
+                  <pic:nvPicPr>
+                    <pic:cNvPr id="1550281196" name="Picture 2" descr="A graph showing a checklist present in grid&#10;&#10;AI-generated content may be incorrect."/>
+                    <pic:cNvPicPr/>
+                  </pic:nvPicPr>
+                  <pic:blipFill>
+                    <a:blip r:embed="rId9" cstate="print">
+                      <a:extLst>
+                        <a:ext uri="{28A0092B-C50C-407E-A947-70E740481C1C}">
+                          <a14:useLocalDpi xmlns:a14="http://schemas.microsoft.com/office/drawing/2010/main" val="0"/>
+                        </a:ext>
+                      </a:extLst>
+                    </a:blip>
+                    <a:stretch>
+                      <a:fillRect/>
+                    </a:stretch>
+                  </pic:blipFill>
+                  <pic:spPr>
+                    <a:xfrm>
+                      <a:off x="0" y="0"/>
+                      <a:ext cx="2955793" cy="1970529"/>
+                    </a:xfrm>
+                    <a:prstGeom prst="rect">
+                      <a:avLst/>
+                    </a:prstGeom>
+                  </pic:spPr>
+                </pic:pic>
+              </a:graphicData>
+            </a:graphic>
+          </wp:inline>
+        </w:drawing>
+      </w:r>
+      <w:r>
+        <w:rPr>
+          <w:noProof/>
+        </w:rPr>
+        <w:drawing>
+          <wp:inline distT="0" distB="0" distL="0" distR="0" wp14:anchorId="7CDB2241" wp14:editId="7BE7C0AD">
+            <wp:extent cx="2925971" cy="1950647"/>
+            <wp:effectExtent l="0" t="0" r="0" b="0"/>
+            <wp:docPr id="1339106722" name="Picture 3" descr="A graph showing a checklist present in grid&#10;&#10;AI-generated content may be incorrect."/>
+            <wp:cNvGraphicFramePr>
+              <a:graphicFrameLocks xmlns:a="http://schemas.openxmlformats.org/drawingml/2006/main" noChangeAspect="1"/>
+            </wp:cNvGraphicFramePr>
+            <a:graphic xmlns:a="http://schemas.openxmlformats.org/drawingml/2006/main">
+              <a:graphicData uri="http://schemas.openxmlformats.org/drawingml/2006/picture">
+                <pic:pic xmlns:pic="http://schemas.openxmlformats.org/drawingml/2006/picture">
+                  <pic:nvPicPr>
+                    <pic:cNvPr id="1339106722" name="Picture 3" descr="A graph showing a checklist present in grid&#10;&#10;AI-generated content may be incorrect."/>
+                    <pic:cNvPicPr/>
+                  </pic:nvPicPr>
+                  <pic:blipFill>
+                    <a:blip r:embed="rId10" cstate="print">
+                      <a:extLst>
+                        <a:ext uri="{28A0092B-C50C-407E-A947-70E740481C1C}">
+                          <a14:useLocalDpi xmlns:a14="http://schemas.microsoft.com/office/drawing/2010/main" val="0"/>
+                        </a:ext>
+                      </a:extLst>
+                    </a:blip>
+                    <a:stretch>
+                      <a:fillRect/>
+                    </a:stretch>
+                  </pic:blipFill>
+                  <pic:spPr>
+                    <a:xfrm>
+                      <a:off x="0" y="0"/>
+                      <a:ext cx="2974129" cy="1982752"/>
+                    </a:xfrm>
+                    <a:prstGeom prst="rect">
+                      <a:avLst/>
+                    </a:prstGeom>
+                  </pic:spPr>
+                </pic:pic>
+              </a:graphicData>
+            </a:graphic>
+          </wp:inline>
+        </w:drawing>
+      </w:r>
+      <w:r>
+        <w:rPr>
+          <w:noProof/>
+        </w:rPr>
+        <w:drawing>
+          <wp:inline distT="0" distB="0" distL="0" distR="0" wp14:anchorId="37CBA9B2" wp14:editId="67712D67">
+            <wp:extent cx="3008417" cy="2005611"/>
+            <wp:effectExtent l="0" t="0" r="0" b="0"/>
+            <wp:docPr id="1594835475" name="Picture 4" descr="A graph of a checklist present in grid&#10;&#10;AI-generated content may be incorrect."/>
+            <wp:cNvGraphicFramePr>
+              <a:graphicFrameLocks xmlns:a="http://schemas.openxmlformats.org/drawingml/2006/main" noChangeAspect="1"/>
+            </wp:cNvGraphicFramePr>
+            <a:graphic xmlns:a="http://schemas.openxmlformats.org/drawingml/2006/main">
+              <a:graphicData uri="http://schemas.openxmlformats.org/drawingml/2006/picture">
+                <pic:pic xmlns:pic="http://schemas.openxmlformats.org/drawingml/2006/picture">
+                  <pic:nvPicPr>
+                    <pic:cNvPr id="1594835475" name="Picture 4" descr="A graph of a checklist present in grid&#10;&#10;AI-generated content may be incorrect."/>
+                    <pic:cNvPicPr/>
+                  </pic:nvPicPr>
+                  <pic:blipFill>
+                    <a:blip r:embed="rId11" cstate="print">
+                      <a:extLst>
+                        <a:ext uri="{28A0092B-C50C-407E-A947-70E740481C1C}">
+                          <a14:useLocalDpi xmlns:a14="http://schemas.microsoft.com/office/drawing/2010/main" val="0"/>
+                        </a:ext>
+                      </a:extLst>
+                    </a:blip>
+                    <a:stretch>
+                      <a:fillRect/>
+                    </a:stretch>
+                  </pic:blipFill>
+                  <pic:spPr>
+                    <a:xfrm>
+                      <a:off x="0" y="0"/>
+                      <a:ext cx="3055262" cy="2036841"/>
+                    </a:xfrm>
+                    <a:prstGeom prst="rect">
+                      <a:avLst/>
+                    </a:prstGeom>
+                  </pic:spPr>
+                </pic:pic>
+              </a:graphicData>
+            </a:graphic>
+          </wp:inline>
+        </w:drawing>
+      </w:r>
+      <w:r>
+        <w:rPr>
+          <w:noProof/>
+        </w:rPr>
+        <w:drawing>
+          <wp:inline distT="0" distB="0" distL="0" distR="0" wp14:anchorId="5DFF3477" wp14:editId="1716F993">
+            <wp:extent cx="2855626" cy="1903750"/>
+            <wp:effectExtent l="0" t="0" r="0" b="0"/>
+            <wp:docPr id="1574000738" name="Picture 5" descr="A graph showing a checklist&#10;&#10;AI-generated content may be incorrect."/>
+            <wp:cNvGraphicFramePr>
+              <a:graphicFrameLocks xmlns:a="http://schemas.openxmlformats.org/drawingml/2006/main" noChangeAspect="1"/>
+            </wp:cNvGraphicFramePr>
+            <a:graphic xmlns:a="http://schemas.openxmlformats.org/drawingml/2006/main">
+              <a:graphicData uri="http://schemas.openxmlformats.org/drawingml/2006/picture">
+                <pic:pic xmlns:pic="http://schemas.openxmlformats.org/drawingml/2006/picture">
+                  <pic:nvPicPr>
+                    <pic:cNvPr id="1574000738" name="Picture 5" descr="A graph showing a checklist&#10;&#10;AI-generated content may be incorrect."/>
+                    <pic:cNvPicPr/>
+                  </pic:nvPicPr>
+                  <pic:blipFill>
+                    <a:blip r:embed="rId12" cstate="print">
+                      <a:extLst>
+                        <a:ext uri="{28A0092B-C50C-407E-A947-70E740481C1C}">
+                          <a14:useLocalDpi xmlns:a14="http://schemas.microsoft.com/office/drawing/2010/main" val="0"/>
+                        </a:ext>
+                      </a:extLst>
+                    </a:blip>
+                    <a:stretch>
+                      <a:fillRect/>
+                    </a:stretch>
+                  </pic:blipFill>
+                  <pic:spPr>
+                    <a:xfrm>
+                      <a:off x="0" y="0"/>
+                      <a:ext cx="2886258" cy="1924172"/>
+                    </a:xfrm>
+                    <a:prstGeom prst="rect">
+                      <a:avLst/>
+                    </a:prstGeom>
+                  </pic:spPr>
+                </pic:pic>
+              </a:graphicData>
+            </a:graphic>
+          </wp:inline>
+        </w:drawing>
+      </w:r>
+    </w:p>
+    <w:p>
+      <w:pPr>
+        <w:pStyle w:val="ImageCaption"/>
+      </w:pPr>
+      <w:r>
+        <w:rPr>
+          <w:b/>
+          <w:bCs/>
+        </w:rPr>
+        <w:t>SI Figure 1</w:t>
+      </w:r>
+      <w:r>
+        <w:rPr>
+          <w:b/>
+          <w:bCs/>
+        </w:rPr>
+        <w:t>.</w:t>
+      </w:r>
+      <w:r>
+        <w:t xml:space="preserve"> Validation </w:t>
+      </w:r>
+      <w:r>
+        <w:t>results supporting the</w:t>
+      </w:r>
+      <w:r>
+        <w:t xml:space="preserve"> use of space-for-time substitution of replicate checklists within sampling polygons. To use replicate eBird surveys within a year at a location in models such as N-mixture or occupancy models, checklists need to represent sites that display the full range of values for covariates of interest. In general, checklists in our dataset </w:t>
+      </w:r>
+      <w:r>
+        <w:t>meet th</w:t>
+      </w:r>
+      <w:r>
+        <w:t>ese</w:t>
+      </w:r>
+      <w:r>
+        <w:t xml:space="preserve"> criteria</w:t>
+      </w:r>
+      <w:r>
+        <w:t>. Data represented here are values for all raster grid cells for all years (</w:t>
+      </w:r>
+      <w:r>
+        <w:t>~1 million grid cells, depending on covariate</w:t>
+      </w:r>
+      <w:r>
+        <w:t xml:space="preserve">). Thus, </w:t>
+      </w:r>
+      <w:r>
+        <w:t>for the two covariates for which we are missing the upper tails</w:t>
+      </w:r>
+      <w:r>
+        <w:t xml:space="preserve">, (a) </w:t>
+      </w:r>
+      <w:r>
+        <w:t xml:space="preserve">cone availability and </w:t>
+      </w:r>
+      <w:r>
+        <w:t xml:space="preserve">(e) </w:t>
+      </w:r>
+      <w:r>
+        <w:t>pinyon basal area,</w:t>
+      </w:r>
+      <w:r>
+        <w:t xml:space="preserve"> </w:t>
+      </w:r>
+      <w:r>
+        <w:t>these represent extreme outliers (&lt;1% of total values in the dataset</w:t>
+      </w:r>
+      <w:r>
+        <w:t xml:space="preserve">; </w:t>
+      </w:r>
+      <w:r>
+        <w:t>22 for cone abundance and 225 for basal area</w:t>
+      </w:r>
+      <w:r>
+        <w:t>).</w:t>
+      </w:r>
+    </w:p>
+    <w:p>
+      <w:pPr>
+        <w:pStyle w:val="CaptionedFigure"/>
+        <w:sectPr>
+          <w:footerReference w:type="even" r:id="rId13"/>
+          <w:footerReference w:type="default" r:id="rId14"/>
+          <w:pgSz w:w="12240" w:h="15840"/>
+          <w:pgMar w:top="1440" w:right="1440" w:bottom="1440" w:left="1440" w:header="720" w:footer="720" w:gutter="0"/>
+          <w:lnNumType w:countBy="1" w:restart="continuous"/>
+          <w:cols w:space="720"/>
+          <w:titlePg/>
+          <w:docGrid w:linePitch="326"/>
+        </w:sectPr>
+      </w:pPr>
+    </w:p>
+    <w:p>
+      <w:pPr>
+        <w:pStyle w:val="CaptionedFigure"/>
+        <w:jc w:val="center"/>
+      </w:pPr>
+      <w:r>
+        <w:rPr>
+          <w:noProof/>
+        </w:rPr>
+        <w:lastRenderedPageBreak/>
+        <w:drawing>
+          <wp:inline distT="0" distB="0" distL="0" distR="0" wp14:anchorId="00FA87A5" wp14:editId="510C9D15">
+            <wp:extent cx="5943600" cy="4754880"/>
+            <wp:effectExtent l="0" t="0" r="0" b="0"/>
+            <wp:docPr id="240208013" name="Picture 7" descr="A graph of different numbers&#10;&#10;AI-generated content may be incorrect."/>
+            <wp:cNvGraphicFramePr>
+              <a:graphicFrameLocks xmlns:a="http://schemas.openxmlformats.org/drawingml/2006/main" noChangeAspect="1"/>
+            </wp:cNvGraphicFramePr>
+            <a:graphic xmlns:a="http://schemas.openxmlformats.org/drawingml/2006/main">
+              <a:graphicData uri="http://schemas.openxmlformats.org/drawingml/2006/picture">
+                <pic:pic xmlns:pic="http://schemas.openxmlformats.org/drawingml/2006/picture">
+                  <pic:nvPicPr>
+                    <pic:cNvPr id="240208013" name="Picture 7" descr="A graph of different numbers&#10;&#10;AI-generated content may be incorrect."/>
+                    <pic:cNvPicPr/>
+                  </pic:nvPicPr>
+                  <pic:blipFill>
+                    <a:blip r:embed="rId15" cstate="print">
+                      <a:extLst>
+                        <a:ext uri="{28A0092B-C50C-407E-A947-70E740481C1C}">
+                          <a14:useLocalDpi xmlns:a14="http://schemas.microsoft.com/office/drawing/2010/main" val="0"/>
+                        </a:ext>
+                      </a:extLst>
+                    </a:blip>
+                    <a:stretch>
+                      <a:fillRect/>
+                    </a:stretch>
+                  </pic:blipFill>
+                  <pic:spPr>
+                    <a:xfrm>
+                      <a:off x="0" y="0"/>
+                      <a:ext cx="5943600" cy="4754880"/>
+                    </a:xfrm>
+                    <a:prstGeom prst="rect">
+                      <a:avLst/>
+                    </a:prstGeom>
+                  </pic:spPr>
+                </pic:pic>
+              </a:graphicData>
+            </a:graphic>
+          </wp:inline>
+        </w:drawing>
+      </w:r>
+    </w:p>
+    <w:p>
+      <w:pPr>
+        <w:pStyle w:val="ImageCaption"/>
+        <w:sectPr>
+          <w:pgSz w:w="12240" w:h="15840"/>
+          <w:pgMar w:top="1440" w:right="1440" w:bottom="1440" w:left="1440" w:header="720" w:footer="720" w:gutter="0"/>
+          <w:lnNumType w:countBy="1" w:restart="continuous"/>
+          <w:cols w:space="720"/>
+          <w:titlePg/>
+          <w:docGrid w:linePitch="326"/>
+        </w:sectPr>
+      </w:pPr>
+      <w:r>
+        <w:rPr>
+          <w:b/>
+          <w:bCs/>
+        </w:rPr>
+        <w:t>SI Figure 2</w:t>
+      </w:r>
+      <w:r>
+        <w:rPr>
+          <w:b/>
+          <w:bCs/>
+        </w:rPr>
+        <w:t>.</w:t>
+      </w:r>
+      <w:r>
+        <w:t xml:space="preserve"> Convergence statistics for </w:t>
+      </w:r>
+      <w:r>
+        <w:t xml:space="preserve">stochastic parameters in the N-mixture for representing </w:t>
+      </w:r>
+      <w:r>
+        <w:t>biological (</w:t>
+      </w:r>
+      <m:oMath>
+        <m:r>
+          <w:rPr>
+            <w:rFonts w:ascii="Cambria Math" w:hAnsi="Cambria Math"/>
+          </w:rPr>
+          <m:t>α</m:t>
+        </m:r>
+      </m:oMath>
+      <w:r>
+        <w:t xml:space="preserve"> and </w:t>
+      </w:r>
+      <m:oMath>
+        <m:sSub>
+          <m:sSubPr>
+            <m:ctrlPr>
+              <w:rPr>
+                <w:rFonts w:ascii="Cambria Math" w:hAnsi="Cambria Math"/>
+                <w:i/>
+              </w:rPr>
+            </m:ctrlPr>
+          </m:sSubPr>
+          <m:e>
+            <m:r>
+              <w:rPr>
+                <w:rFonts w:ascii="Cambria Math" w:hAnsi="Cambria Math"/>
+              </w:rPr>
+              <m:t>α</m:t>
+            </m:r>
+          </m:e>
+          <m:sub>
+            <m:r>
+              <w:rPr>
+                <w:rFonts w:ascii="Cambria Math" w:hAnsi="Cambria Math"/>
+              </w:rPr>
+              <m:t>0</m:t>
+            </m:r>
+          </m:sub>
+        </m:sSub>
+      </m:oMath>
+      <w:r>
+        <w:t>) and detection (</w:t>
+      </w:r>
+      <m:oMath>
+        <m:r>
+          <w:rPr>
+            <w:rFonts w:ascii="Cambria Math" w:hAnsi="Cambria Math"/>
+          </w:rPr>
+          <m:t>γ</m:t>
+        </m:r>
+      </m:oMath>
+      <w:r>
+        <w:t xml:space="preserve"> and </w:t>
+      </w:r>
+      <m:oMath>
+        <m:sSub>
+          <m:sSubPr>
+            <m:ctrlPr>
+              <w:rPr>
+                <w:rFonts w:ascii="Cambria Math" w:hAnsi="Cambria Math"/>
+                <w:i/>
+              </w:rPr>
+            </m:ctrlPr>
+          </m:sSubPr>
+          <m:e>
+            <m:r>
+              <w:rPr>
+                <w:rFonts w:ascii="Cambria Math" w:hAnsi="Cambria Math"/>
+              </w:rPr>
+              <m:t>γ</m:t>
+            </m:r>
+          </m:e>
+          <m:sub>
+            <m:r>
+              <w:rPr>
+                <w:rFonts w:ascii="Cambria Math" w:hAnsi="Cambria Math"/>
+              </w:rPr>
+              <m:t>0</m:t>
+            </m:r>
+          </m:sub>
+        </m:sSub>
+      </m:oMath>
+      <w:r>
+        <w:t>) covariate effects, deviance</w:t>
+      </w:r>
+      <w:r>
+        <w:t xml:space="preserve"> (an overall index of model fit)</w:t>
+      </w:r>
+      <w:r>
+        <w:t>, and the cone and climate weights (w</w:t>
+      </w:r>
+      <w:r>
+        <w:rPr>
+          <w:vertAlign w:val="subscript"/>
+        </w:rPr>
+        <w:t>1</w:t>
+      </w:r>
+      <w:r>
+        <w:t>, w</w:t>
+      </w:r>
+      <w:r>
+        <w:rPr>
+          <w:vertAlign w:val="subscript"/>
+        </w:rPr>
+        <w:t>2</w:t>
+      </w:r>
+      <w:r>
+        <w:t>, and w</w:t>
+      </w:r>
+      <w:r>
+        <w:rPr>
+          <w:vertAlign w:val="subscript"/>
+        </w:rPr>
+        <w:t>3</w:t>
+      </w:r>
+      <w:r>
+        <w:t>)</w:t>
+      </w:r>
+      <w:r>
+        <w:t xml:space="preserve">. All parameters converged with </w:t>
+      </w:r>
+      <w:r>
+        <w:t>potential scale reduction (</w:t>
+      </w:r>
+      <m:oMath>
+        <m:acc>
+          <m:accPr>
+            <m:ctrlPr>
+              <w:rPr>
+                <w:rFonts w:ascii="Cambria Math" w:hAnsi="Cambria Math"/>
+                <w:i/>
+              </w:rPr>
+            </m:ctrlPr>
+          </m:accPr>
+          <m:e>
+            <m:r>
+              <w:rPr>
+                <w:rFonts w:ascii="Cambria Math" w:hAnsi="Cambria Math"/>
+              </w:rPr>
+              <m:t>R</m:t>
+            </m:r>
+          </m:e>
+        </m:acc>
+      </m:oMath>
+      <w:r>
+        <w:t>)</w:t>
+      </w:r>
+      <w:r>
+        <w:t xml:space="preserve"> values </w:t>
+      </w:r>
+      <w:r>
+        <w:rPr>
+          <w:u w:val="single"/>
+        </w:rPr>
+        <w:t>&lt;</w:t>
+      </w:r>
+      <w:r>
+        <w:t xml:space="preserve"> 1.1 (dashed lin</w:t>
+      </w:r>
+      <w:r>
+        <w:t>e).</w:t>
+      </w:r>
+    </w:p>
+    <w:p>
+      <w:pPr>
+        <w:tabs>
+          <w:tab w:val="left" w:pos="1464"/>
+        </w:tabs>
+        <w:sectPr>
+          <w:pgSz w:w="12240" w:h="15840"/>
+          <w:pgMar w:top="1440" w:right="1440" w:bottom="1440" w:left="1440" w:header="720" w:footer="720" w:gutter="0"/>
+          <w:lnNumType w:countBy="1" w:restart="continuous"/>
+          <w:cols w:space="720"/>
+          <w:titlePg/>
+          <w:docGrid w:linePitch="326"/>
+        </w:sectPr>
+      </w:pPr>
+    </w:p>
+    <w:p>
+      <w:pPr>
+        <w:pStyle w:val="CaptionedFigure"/>
+        <w:jc w:val="center"/>
+      </w:pPr>
+      <w:r>
+        <w:rPr>
+          <w:noProof/>
+        </w:rPr>
+        <w:lastRenderedPageBreak/>
+        <w:drawing>
+          <wp:inline distT="0" distB="0" distL="0" distR="0" wp14:anchorId="2DD62F39" wp14:editId="46836654">
+            <wp:extent cx="5029200" cy="2542032"/>
+            <wp:effectExtent l="0" t="0" r="0" b="0"/>
+            <wp:docPr id="30" name="Picture" descr="SI Figure 4: As an evaluation of goodness-of-fit, we examined a) the relationship between observed pinyon jay counts and counts predicted from the model (median and 95% Bayesian Credible Interval) and b) the R2 of this relationship from ~1000 posterior samples. In a), the dashed line represents the 1:1 line where predictions exactly match. In b) the dashed vertical line represents the mean R2."/>
+            <wp:cNvGraphicFramePr/>
+            <a:graphic xmlns:a="http://schemas.openxmlformats.org/drawingml/2006/main">
+              <a:graphicData uri="http://schemas.openxmlformats.org/drawingml/2006/picture">
+                <pic:pic xmlns:pic="http://schemas.openxmlformats.org/drawingml/2006/picture">
+                  <pic:nvPicPr>
+                    <pic:cNvPr id="31" name="Picture" descr="../pictures/final/y_yrep_linearr2.jpg"/>
                     <pic:cNvPicPr>
-                      <a:picLocks noChangeArrowheads="1" noChangeAspect="1"/>
+                      <a:picLocks noChangeAspect="1" noChangeArrowheads="1"/>
                     </pic:cNvPicPr>
                   </pic:nvPicPr>
                   <pic:blipFill>
-                    <a:blip r:embed="rId20"/>
+                    <a:blip r:embed="rId16"/>
                     <a:stretch>
                       <a:fillRect/>
                     </a:stretch>
@@ -54,7 +1253,7 @@
                   <pic:spPr bwMode="auto">
                     <a:xfrm>
                       <a:off x="0" y="0"/>
-                      <a:ext cx="3810000" cy="2540000"/>
+                      <a:ext cx="5029200" cy="2542032"/>
                     </a:xfrm>
                     <a:prstGeom prst="rect">
                       <a:avLst/>
@@ -78,30 +1277,210 @@
         <w:pStyle w:val="ImageCaption"/>
       </w:pPr>
       <w:r>
-        <w:t xml:space="preserve">SI Figure 1: Validation for use of space-for-time substitution of replicate checklists within sampling polygons. To use replicate eBird surveys within a year at a location in models such as N-mixture or occupancy models, checklists need to represent sites that display the full range of values for covariates of interest. In general, checklists in our dataset do; for the two covariates for which we are missing the upper tails (cone availability and pinyon basal area, panels a and e), these represent extreme outliers (&lt;1% of total values in the dataset).</w:t>
+        <w:rPr>
+          <w:b/>
+          <w:bCs/>
+        </w:rPr>
+        <w:t>SI Figure 4</w:t>
+      </w:r>
+      <w:r>
+        <w:rPr>
+          <w:b/>
+          <w:bCs/>
+        </w:rPr>
+        <w:t>.</w:t>
+      </w:r>
+      <w:r>
+        <w:t xml:space="preserve"> As an evaluation of goodness-of-fit, we examined a) the relationship between observed pinyon jay counts and counts predicted from the model (median and 95% Bayesian Credible Interval) and b) the R2 of this relationship from ~1000 posterior samples. In a), the dashed line represents the 1:1 line where predictions exactly match. In b) the dashed vertical line represents the mean R2.</w:t>
       </w:r>
     </w:p>
     <w:p>
       <w:pPr>
         <w:pStyle w:val="CaptionedFigure"/>
-      </w:pPr>
-      <w:r>
+        <w:sectPr>
+          <w:pgSz w:w="12240" w:h="15840"/>
+          <w:pgMar w:top="1440" w:right="1440" w:bottom="1440" w:left="1440" w:header="720" w:footer="720" w:gutter="0"/>
+          <w:lnNumType w:countBy="1" w:restart="continuous"/>
+          <w:cols w:space="720"/>
+          <w:titlePg/>
+          <w:docGrid w:linePitch="326"/>
+        </w:sectPr>
+      </w:pPr>
+    </w:p>
+    <w:p>
+      <w:pPr>
+        <w:pStyle w:val="CaptionedFigure"/>
+        <w:jc w:val="center"/>
+      </w:pPr>
+      <w:r>
+        <w:rPr>
+          <w:noProof/>
+        </w:rPr>
+        <w:lastRenderedPageBreak/>
         <w:drawing>
-          <wp:inline>
-            <wp:extent cx="3810000" cy="2540000"/>
-            <wp:effectExtent b="0" l="0" r="0" t="0"/>
-            <wp:docPr descr="SI Figure 2: Convergence statistics for biological (a and a0) and detection (c and c0) covariate effects, deviance, and the cone and climate weights (wA, wB, and wC). All covariate effects and parameters converged with Rhat values &lt;= 1.1 (dashed line)." title="" id="24" name="Picture"/>
-            <a:graphic>
+          <wp:inline distT="0" distB="0" distL="0" distR="0" wp14:anchorId="5B54BC79" wp14:editId="683B8C36">
+            <wp:extent cx="5943600" cy="5943600"/>
+            <wp:effectExtent l="0" t="0" r="0" b="0"/>
+            <wp:docPr id="13776016" name="Picture 6" descr="A graph with a line graph and a line graph&#10;&#10;AI-generated content may be incorrect."/>
+            <wp:cNvGraphicFramePr>
+              <a:graphicFrameLocks xmlns:a="http://schemas.openxmlformats.org/drawingml/2006/main" noChangeAspect="1"/>
+            </wp:cNvGraphicFramePr>
+            <a:graphic xmlns:a="http://schemas.openxmlformats.org/drawingml/2006/main">
               <a:graphicData uri="http://schemas.openxmlformats.org/drawingml/2006/picture">
-                <pic:pic>
+                <pic:pic xmlns:pic="http://schemas.openxmlformats.org/drawingml/2006/picture">
                   <pic:nvPicPr>
-                    <pic:cNvPr descr="../pictures/final/rhat.jpg" id="25" name="Picture"/>
+                    <pic:cNvPr id="13776016" name="Picture 6" descr="A graph with a line graph and a line graph&#10;&#10;AI-generated content may be incorrect."/>
+                    <pic:cNvPicPr/>
+                  </pic:nvPicPr>
+                  <pic:blipFill>
+                    <a:blip r:embed="rId17">
+                      <a:extLst>
+                        <a:ext uri="{28A0092B-C50C-407E-A947-70E740481C1C}">
+                          <a14:useLocalDpi xmlns:a14="http://schemas.microsoft.com/office/drawing/2010/main" val="0"/>
+                        </a:ext>
+                      </a:extLst>
+                    </a:blip>
+                    <a:stretch>
+                      <a:fillRect/>
+                    </a:stretch>
+                  </pic:blipFill>
+                  <pic:spPr>
+                    <a:xfrm>
+                      <a:off x="0" y="0"/>
+                      <a:ext cx="5943600" cy="5943600"/>
+                    </a:xfrm>
+                    <a:prstGeom prst="rect">
+                      <a:avLst/>
+                    </a:prstGeom>
+                  </pic:spPr>
+                </pic:pic>
+              </a:graphicData>
+            </a:graphic>
+          </wp:inline>
+        </w:drawing>
+      </w:r>
+    </w:p>
+    <w:p>
+      <w:pPr>
+        <w:pStyle w:val="ImageCaption"/>
+      </w:pPr>
+      <w:r>
+        <w:rPr>
+          <w:b/>
+          <w:bCs/>
+        </w:rPr>
+        <w:t>SI Figure 5</w:t>
+      </w:r>
+      <w:r>
+        <w:rPr>
+          <w:b/>
+          <w:bCs/>
+        </w:rPr>
+        <w:t>.</w:t>
+      </w:r>
+      <w:r>
+        <w:t xml:space="preserve"> </w:t>
+      </w:r>
+      <w:r>
+        <w:t>Root mean squared error (</w:t>
+      </w:r>
+      <w:r>
+        <w:t>RMSE</w:t>
+      </w:r>
+      <w:r>
+        <w:t>)</w:t>
+      </w:r>
+      <w:r>
+        <w:t xml:space="preserve"> </w:t>
+      </w:r>
+      <w:r>
+        <w:t>to evaluate the predictive ability of the model applied to the</w:t>
+      </w:r>
+      <w:r>
+        <w:t xml:space="preserve"> in-sample</w:t>
+      </w:r>
+      <w:r>
+        <w:t xml:space="preserve"> </w:t>
+      </w:r>
+      <w:r>
+        <w:t>(“</w:t>
+      </w:r>
+      <w:r>
+        <w:t>test</w:t>
+      </w:r>
+      <w:r>
+        <w:t>”)</w:t>
+      </w:r>
+      <w:r>
+        <w:t xml:space="preserve"> and out</w:t>
+      </w:r>
+      <w:r>
+        <w:t>-</w:t>
+      </w:r>
+      <w:r>
+        <w:t>of</w:t>
+      </w:r>
+      <w:r>
+        <w:t>-</w:t>
+      </w:r>
+      <w:r>
+        <w:t>sample datasets. Values for RMSE are on the scale of the data (counts of pinyon jays</w:t>
+      </w:r>
+      <w:r>
+        <w:t xml:space="preserve"> per </w:t>
+      </w:r>
+      <w:r>
+        <w:t>square kilometer</w:t>
+      </w:r>
+      <w:r>
+        <w:t xml:space="preserve">). </w:t>
+      </w:r>
+      <w:r>
+        <w:t>The RMSE values</w:t>
+      </w:r>
+      <w:r>
+        <w:t xml:space="preserve"> are relatively small compared to the range of possible counts in a checklist (0 </w:t>
+      </w:r>
+      <w:r>
+        <w:t>to</w:t>
+      </w:r>
+      <w:r>
+        <w:t xml:space="preserve"> 350 birds</w:t>
+      </w:r>
+      <w:r>
+        <w:t xml:space="preserve"> per hectare</w:t>
+      </w:r>
+      <w:r>
+        <w:t xml:space="preserve"> in our test dataset).</w:t>
+      </w:r>
+    </w:p>
+    <w:p>
+      <w:pPr>
+        <w:pStyle w:val="CaptionedFigure"/>
+      </w:pPr>
+      <w:r>
+        <w:rPr>
+          <w:noProof/>
+        </w:rPr>
+        <w:lastRenderedPageBreak/>
+        <w:drawing>
+          <wp:inline distT="0" distB="0" distL="0" distR="0" wp14:anchorId="0A32CFE7" wp14:editId="0FAF314C">
+            <wp:extent cx="5838669" cy="2948668"/>
+            <wp:effectExtent l="0" t="0" r="0" b="0"/>
+            <wp:docPr id="1247477363" name="Picture" descr="SI Figure 6: Evaluation of spatial autocorrelation (Pearson correlation on the y-axis) for residuals in each year (1 = 2010; 13 = 2022). There was no consistent evidence of spatial autocorrelation of residuals."/>
+            <wp:cNvGraphicFramePr/>
+            <a:graphic xmlns:a="http://schemas.openxmlformats.org/drawingml/2006/main">
+              <a:graphicData uri="http://schemas.openxmlformats.org/drawingml/2006/picture">
+                <pic:pic xmlns:pic="http://schemas.openxmlformats.org/drawingml/2006/picture">
+                  <pic:nvPicPr>
+                    <pic:cNvPr id="37" name="Picture" descr="../pictures/final/spatial_autocorrelation_yrly.jpg"/>
                     <pic:cNvPicPr>
-                      <a:picLocks noChangeArrowheads="1" noChangeAspect="1"/>
+                      <a:picLocks noChangeAspect="1" noChangeArrowheads="1"/>
                     </pic:cNvPicPr>
                   </pic:nvPicPr>
-                  <pic:blipFill>
-                    <a:blip r:embed="rId23"/>
+                  <pic:blipFill rotWithShape="1">
+                    <a:blip r:embed="rId18"/>
+                    <a:srcRect r="35409" b="79274"/>
                     <a:stretch>
                       <a:fillRect/>
                     </a:stretch>
@@ -109,7 +1488,562 @@
                   <pic:spPr bwMode="auto">
                     <a:xfrm>
                       <a:off x="0" y="0"/>
-                      <a:ext cx="3810000" cy="2540000"/>
+                      <a:ext cx="5892372" cy="2975789"/>
+                    </a:xfrm>
+                    <a:prstGeom prst="rect">
+                      <a:avLst/>
+                    </a:prstGeom>
+                    <a:noFill/>
+                    <a:ln>
+                      <a:noFill/>
+                    </a:ln>
+                    <a:extLst>
+                      <a:ext uri="{53640926-AAD7-44D8-BBD7-CCE9431645EC}">
+                        <a14:shadowObscured xmlns:a14="http://schemas.microsoft.com/office/drawing/2010/main"/>
+                      </a:ext>
+                    </a:extLst>
+                  </pic:spPr>
+                </pic:pic>
+              </a:graphicData>
+            </a:graphic>
+          </wp:inline>
+        </w:drawing>
+      </w:r>
+      <w:r>
+        <w:rPr>
+          <w:noProof/>
+        </w:rPr>
+        <w:drawing>
+          <wp:inline distT="0" distB="0" distL="0" distR="0" wp14:anchorId="60EFA28F" wp14:editId="6F5F75AF">
+            <wp:extent cx="2938072" cy="2922708"/>
+            <wp:effectExtent l="0" t="0" r="0" b="0"/>
+            <wp:docPr id="371452505" name="Picture" descr="SI Figure 6: Evaluation of spatial autocorrelation (Pearson correlation on the y-axis) for residuals in each year (1 = 2010; 13 = 2022). There was no consistent evidence of spatial autocorrelation of residuals."/>
+            <wp:cNvGraphicFramePr/>
+            <a:graphic xmlns:a="http://schemas.openxmlformats.org/drawingml/2006/main">
+              <a:graphicData uri="http://schemas.openxmlformats.org/drawingml/2006/picture">
+                <pic:pic xmlns:pic="http://schemas.openxmlformats.org/drawingml/2006/picture">
+                  <pic:nvPicPr>
+                    <pic:cNvPr id="37" name="Picture" descr="../pictures/final/spatial_autocorrelation_yrly.jpg"/>
+                    <pic:cNvPicPr>
+                      <a:picLocks noChangeAspect="1" noChangeArrowheads="1"/>
+                    </pic:cNvPicPr>
+                  </pic:nvPicPr>
+                  <pic:blipFill rotWithShape="1">
+                    <a:blip r:embed="rId18"/>
+                    <a:srcRect l="64568" r="2975" b="79485"/>
+                    <a:stretch>
+                      <a:fillRect/>
+                    </a:stretch>
+                  </pic:blipFill>
+                  <pic:spPr bwMode="auto">
+                    <a:xfrm>
+                      <a:off x="0" y="0"/>
+                      <a:ext cx="2985342" cy="2969731"/>
+                    </a:xfrm>
+                    <a:prstGeom prst="rect">
+                      <a:avLst/>
+                    </a:prstGeom>
+                    <a:noFill/>
+                    <a:ln>
+                      <a:noFill/>
+                    </a:ln>
+                    <a:extLst>
+                      <a:ext uri="{53640926-AAD7-44D8-BBD7-CCE9431645EC}">
+                        <a14:shadowObscured xmlns:a14="http://schemas.microsoft.com/office/drawing/2010/main"/>
+                      </a:ext>
+                    </a:extLst>
+                  </pic:spPr>
+                </pic:pic>
+              </a:graphicData>
+            </a:graphic>
+          </wp:inline>
+        </w:drawing>
+      </w:r>
+      <w:r>
+        <w:rPr>
+          <w:noProof/>
+        </w:rPr>
+        <w:drawing>
+          <wp:inline distT="0" distB="0" distL="0" distR="0" wp14:anchorId="6AEE4D82" wp14:editId="05F7D9B6">
+            <wp:extent cx="2930577" cy="2946005"/>
+            <wp:effectExtent l="0" t="0" r="0" b="0"/>
+            <wp:docPr id="1965667638" name="Picture" descr="SI Figure 6: Evaluation of spatial autocorrelation (Pearson correlation on the y-axis) for residuals in each year (1 = 2010; 13 = 2022). There was no consistent evidence of spatial autocorrelation of residuals."/>
+            <wp:cNvGraphicFramePr/>
+            <a:graphic xmlns:a="http://schemas.openxmlformats.org/drawingml/2006/main">
+              <a:graphicData uri="http://schemas.openxmlformats.org/drawingml/2006/picture">
+                <pic:pic xmlns:pic="http://schemas.openxmlformats.org/drawingml/2006/picture">
+                  <pic:nvPicPr>
+                    <pic:cNvPr id="37" name="Picture" descr="../pictures/final/spatial_autocorrelation_yrly.jpg"/>
+                    <pic:cNvPicPr>
+                      <a:picLocks noChangeAspect="1" noChangeArrowheads="1"/>
+                    </pic:cNvPicPr>
+                  </pic:nvPicPr>
+                  <pic:blipFill rotWithShape="1">
+                    <a:blip r:embed="rId18"/>
+                    <a:srcRect t="19872" r="67545" b="59398"/>
+                    <a:stretch>
+                      <a:fillRect/>
+                    </a:stretch>
+                  </pic:blipFill>
+                  <pic:spPr bwMode="auto">
+                    <a:xfrm>
+                      <a:off x="0" y="0"/>
+                      <a:ext cx="2930577" cy="2946005"/>
+                    </a:xfrm>
+                    <a:prstGeom prst="rect">
+                      <a:avLst/>
+                    </a:prstGeom>
+                    <a:noFill/>
+                    <a:ln>
+                      <a:noFill/>
+                    </a:ln>
+                    <a:extLst>
+                      <a:ext uri="{53640926-AAD7-44D8-BBD7-CCE9431645EC}">
+                        <a14:shadowObscured xmlns:a14="http://schemas.microsoft.com/office/drawing/2010/main"/>
+                      </a:ext>
+                    </a:extLst>
+                  </pic:spPr>
+                </pic:pic>
+              </a:graphicData>
+            </a:graphic>
+          </wp:inline>
+        </w:drawing>
+      </w:r>
+      <w:r>
+        <w:rPr>
+          <w:noProof/>
+        </w:rPr>
+        <w:lastRenderedPageBreak/>
+        <w:drawing>
+          <wp:inline distT="0" distB="0" distL="0" distR="0" wp14:anchorId="4B0176F5" wp14:editId="43C5CB67">
+            <wp:extent cx="6056026" cy="2745287"/>
+            <wp:effectExtent l="0" t="0" r="0" b="0"/>
+            <wp:docPr id="36" name="Picture" descr="SI Figure 6: Evaluation of spatial autocorrelation (Pearson correlation on the y-axis) for residuals in each year (1 = 2010; 13 = 2022). There was no consistent evidence of spatial autocorrelation of residuals."/>
+            <wp:cNvGraphicFramePr/>
+            <a:graphic xmlns:a="http://schemas.openxmlformats.org/drawingml/2006/main">
+              <a:graphicData uri="http://schemas.openxmlformats.org/drawingml/2006/picture">
+                <pic:pic xmlns:pic="http://schemas.openxmlformats.org/drawingml/2006/picture">
+                  <pic:nvPicPr>
+                    <pic:cNvPr id="37" name="Picture" descr="../pictures/final/spatial_autocorrelation_yrly.jpg"/>
+                    <pic:cNvPicPr>
+                      <a:picLocks noChangeAspect="1" noChangeArrowheads="1"/>
+                    </pic:cNvPicPr>
+                  </pic:nvPicPr>
+                  <pic:blipFill rotWithShape="1">
+                    <a:blip r:embed="rId18"/>
+                    <a:srcRect l="32116" t="20514" b="59934"/>
+                    <a:stretch>
+                      <a:fillRect/>
+                    </a:stretch>
+                  </pic:blipFill>
+                  <pic:spPr bwMode="auto">
+                    <a:xfrm>
+                      <a:off x="0" y="0"/>
+                      <a:ext cx="6114106" cy="2771616"/>
+                    </a:xfrm>
+                    <a:prstGeom prst="rect">
+                      <a:avLst/>
+                    </a:prstGeom>
+                    <a:noFill/>
+                    <a:ln>
+                      <a:noFill/>
+                    </a:ln>
+                    <a:extLst>
+                      <a:ext uri="{53640926-AAD7-44D8-BBD7-CCE9431645EC}">
+                        <a14:shadowObscured xmlns:a14="http://schemas.microsoft.com/office/drawing/2010/main"/>
+                      </a:ext>
+                    </a:extLst>
+                  </pic:spPr>
+                </pic:pic>
+              </a:graphicData>
+            </a:graphic>
+          </wp:inline>
+        </w:drawing>
+      </w:r>
+    </w:p>
+    <w:p>
+      <w:pPr>
+        <w:pStyle w:val="CaptionedFigure"/>
+      </w:pPr>
+    </w:p>
+    <w:p>
+      <w:pPr>
+        <w:pStyle w:val="CaptionedFigure"/>
+      </w:pPr>
+      <w:r>
+        <w:rPr>
+          <w:noProof/>
+        </w:rPr>
+        <w:drawing>
+          <wp:inline distT="0" distB="0" distL="0" distR="0" wp14:anchorId="3011E069" wp14:editId="2B110801">
+            <wp:extent cx="5936105" cy="2929728"/>
+            <wp:effectExtent l="0" t="0" r="0" b="0"/>
+            <wp:docPr id="2008807953" name="Picture" descr="SI Figure 6: Evaluation of spatial autocorrelation (Pearson correlation on the y-axis) for residuals in each year (1 = 2010; 13 = 2022). There was no consistent evidence of spatial autocorrelation of residuals."/>
+            <wp:cNvGraphicFramePr/>
+            <a:graphic xmlns:a="http://schemas.openxmlformats.org/drawingml/2006/main">
+              <a:graphicData uri="http://schemas.openxmlformats.org/drawingml/2006/picture">
+                <pic:pic xmlns:pic="http://schemas.openxmlformats.org/drawingml/2006/picture">
+                  <pic:nvPicPr>
+                    <pic:cNvPr id="37" name="Picture" descr="../pictures/final/spatial_autocorrelation_yrly.jpg"/>
+                    <pic:cNvPicPr>
+                      <a:picLocks noChangeAspect="1" noChangeArrowheads="1"/>
+                    </pic:cNvPicPr>
+                  </pic:nvPicPr>
+                  <pic:blipFill rotWithShape="1">
+                    <a:blip r:embed="rId18"/>
+                    <a:srcRect t="40384" r="35594" b="39419"/>
+                    <a:stretch>
+                      <a:fillRect/>
+                    </a:stretch>
+                  </pic:blipFill>
+                  <pic:spPr bwMode="auto">
+                    <a:xfrm>
+                      <a:off x="0" y="0"/>
+                      <a:ext cx="5991985" cy="2957307"/>
+                    </a:xfrm>
+                    <a:prstGeom prst="rect">
+                      <a:avLst/>
+                    </a:prstGeom>
+                    <a:noFill/>
+                    <a:ln>
+                      <a:noFill/>
+                    </a:ln>
+                    <a:extLst>
+                      <a:ext uri="{53640926-AAD7-44D8-BBD7-CCE9431645EC}">
+                        <a14:shadowObscured xmlns:a14="http://schemas.microsoft.com/office/drawing/2010/main"/>
+                      </a:ext>
+                    </a:extLst>
+                  </pic:spPr>
+                </pic:pic>
+              </a:graphicData>
+            </a:graphic>
+          </wp:inline>
+        </w:drawing>
+      </w:r>
+    </w:p>
+    <w:p>
+      <w:pPr>
+        <w:pStyle w:val="CaptionedFigure"/>
+      </w:pPr>
+    </w:p>
+    <w:p>
+      <w:pPr>
+        <w:pStyle w:val="CaptionedFigure"/>
+      </w:pPr>
+      <w:r>
+        <w:rPr>
+          <w:noProof/>
+        </w:rPr>
+        <w:lastRenderedPageBreak/>
+        <w:drawing>
+          <wp:inline distT="0" distB="0" distL="0" distR="0" wp14:anchorId="7BE0AB3E" wp14:editId="4A136532">
+            <wp:extent cx="2900597" cy="2760980"/>
+            <wp:effectExtent l="0" t="0" r="0" b="0"/>
+            <wp:docPr id="1141514968" name="Picture" descr="SI Figure 6: Evaluation of spatial autocorrelation (Pearson correlation on the y-axis) for residuals in each year (1 = 2010; 13 = 2022). There was no consistent evidence of spatial autocorrelation of residuals."/>
+            <wp:cNvGraphicFramePr/>
+            <a:graphic xmlns:a="http://schemas.openxmlformats.org/drawingml/2006/main">
+              <a:graphicData uri="http://schemas.openxmlformats.org/drawingml/2006/picture">
+                <pic:pic xmlns:pic="http://schemas.openxmlformats.org/drawingml/2006/picture">
+                  <pic:nvPicPr>
+                    <pic:cNvPr id="37" name="Picture" descr="../pictures/final/spatial_autocorrelation_yrly.jpg"/>
+                    <pic:cNvPicPr>
+                      <a:picLocks noChangeAspect="1" noChangeArrowheads="1"/>
+                    </pic:cNvPicPr>
+                  </pic:nvPicPr>
+                  <pic:blipFill rotWithShape="1">
+                    <a:blip r:embed="rId18"/>
+                    <a:srcRect l="64904" t="40946" r="3281" b="39812"/>
+                    <a:stretch>
+                      <a:fillRect/>
+                    </a:stretch>
+                  </pic:blipFill>
+                  <pic:spPr bwMode="auto">
+                    <a:xfrm>
+                      <a:off x="0" y="0"/>
+                      <a:ext cx="2953127" cy="2810982"/>
+                    </a:xfrm>
+                    <a:prstGeom prst="rect">
+                      <a:avLst/>
+                    </a:prstGeom>
+                    <a:noFill/>
+                    <a:ln>
+                      <a:noFill/>
+                    </a:ln>
+                    <a:extLst>
+                      <a:ext uri="{53640926-AAD7-44D8-BBD7-CCE9431645EC}">
+                        <a14:shadowObscured xmlns:a14="http://schemas.microsoft.com/office/drawing/2010/main"/>
+                      </a:ext>
+                    </a:extLst>
+                  </pic:spPr>
+                </pic:pic>
+              </a:graphicData>
+            </a:graphic>
+          </wp:inline>
+        </w:drawing>
+      </w:r>
+      <w:r>
+        <w:rPr>
+          <w:noProof/>
+        </w:rPr>
+        <w:drawing>
+          <wp:inline distT="0" distB="0" distL="0" distR="0" wp14:anchorId="2CC6CB39" wp14:editId="65DE7BE4">
+            <wp:extent cx="3020518" cy="2959539"/>
+            <wp:effectExtent l="0" t="0" r="0" b="0"/>
+            <wp:docPr id="1010215091" name="Picture" descr="SI Figure 6: Evaluation of spatial autocorrelation (Pearson correlation on the y-axis) for residuals in each year (1 = 2010; 13 = 2022). There was no consistent evidence of spatial autocorrelation of residuals."/>
+            <wp:cNvGraphicFramePr/>
+            <a:graphic xmlns:a="http://schemas.openxmlformats.org/drawingml/2006/main">
+              <a:graphicData uri="http://schemas.openxmlformats.org/drawingml/2006/picture">
+                <pic:pic xmlns:pic="http://schemas.openxmlformats.org/drawingml/2006/picture">
+                  <pic:nvPicPr>
+                    <pic:cNvPr id="37" name="Picture" descr="../pictures/final/spatial_autocorrelation_yrly.jpg"/>
+                    <pic:cNvPicPr>
+                      <a:picLocks noChangeAspect="1" noChangeArrowheads="1"/>
+                    </pic:cNvPicPr>
+                  </pic:nvPicPr>
+                  <pic:blipFill rotWithShape="1">
+                    <a:blip r:embed="rId18"/>
+                    <a:srcRect t="59957" r="67380" b="19735"/>
+                    <a:stretch>
+                      <a:fillRect/>
+                    </a:stretch>
+                  </pic:blipFill>
+                  <pic:spPr bwMode="auto">
+                    <a:xfrm>
+                      <a:off x="0" y="0"/>
+                      <a:ext cx="3076404" cy="3014297"/>
+                    </a:xfrm>
+                    <a:prstGeom prst="rect">
+                      <a:avLst/>
+                    </a:prstGeom>
+                    <a:noFill/>
+                    <a:ln>
+                      <a:noFill/>
+                    </a:ln>
+                    <a:extLst>
+                      <a:ext uri="{53640926-AAD7-44D8-BBD7-CCE9431645EC}">
+                        <a14:shadowObscured xmlns:a14="http://schemas.microsoft.com/office/drawing/2010/main"/>
+                      </a:ext>
+                    </a:extLst>
+                  </pic:spPr>
+                </pic:pic>
+              </a:graphicData>
+            </a:graphic>
+          </wp:inline>
+        </w:drawing>
+      </w:r>
+    </w:p>
+    <w:p>
+      <w:pPr>
+        <w:pStyle w:val="CaptionedFigure"/>
+      </w:pPr>
+      <w:r>
+        <w:rPr>
+          <w:noProof/>
+        </w:rPr>
+        <w:drawing>
+          <wp:inline distT="0" distB="0" distL="0" distR="0" wp14:anchorId="209AC52B" wp14:editId="3AAF8FF3">
+            <wp:extent cx="6063521" cy="3000649"/>
+            <wp:effectExtent l="0" t="0" r="0" b="0"/>
+            <wp:docPr id="1510419402" name="Picture" descr="SI Figure 6: Evaluation of spatial autocorrelation (Pearson correlation on the y-axis) for residuals in each year (1 = 2010; 13 = 2022). There was no consistent evidence of spatial autocorrelation of residuals."/>
+            <wp:cNvGraphicFramePr/>
+            <a:graphic xmlns:a="http://schemas.openxmlformats.org/drawingml/2006/main">
+              <a:graphicData uri="http://schemas.openxmlformats.org/drawingml/2006/picture">
+                <pic:pic xmlns:pic="http://schemas.openxmlformats.org/drawingml/2006/picture">
+                  <pic:nvPicPr>
+                    <pic:cNvPr id="37" name="Picture" descr="../pictures/final/spatial_autocorrelation_yrly.jpg"/>
+                    <pic:cNvPicPr>
+                      <a:picLocks noChangeAspect="1" noChangeArrowheads="1"/>
+                    </pic:cNvPicPr>
+                  </pic:nvPicPr>
+                  <pic:blipFill rotWithShape="1">
+                    <a:blip r:embed="rId18"/>
+                    <a:srcRect l="32451" t="59740" r="1290" b="19426"/>
+                    <a:stretch>
+                      <a:fillRect/>
+                    </a:stretch>
+                  </pic:blipFill>
+                  <pic:spPr bwMode="auto">
+                    <a:xfrm>
+                      <a:off x="0" y="0"/>
+                      <a:ext cx="6126665" cy="3031897"/>
+                    </a:xfrm>
+                    <a:prstGeom prst="rect">
+                      <a:avLst/>
+                    </a:prstGeom>
+                    <a:noFill/>
+                    <a:ln>
+                      <a:noFill/>
+                    </a:ln>
+                    <a:extLst>
+                      <a:ext uri="{53640926-AAD7-44D8-BBD7-CCE9431645EC}">
+                        <a14:shadowObscured xmlns:a14="http://schemas.microsoft.com/office/drawing/2010/main"/>
+                      </a:ext>
+                    </a:extLst>
+                  </pic:spPr>
+                </pic:pic>
+              </a:graphicData>
+            </a:graphic>
+          </wp:inline>
+        </w:drawing>
+      </w:r>
+    </w:p>
+    <w:p>
+      <w:pPr>
+        <w:pStyle w:val="CaptionedFigure"/>
+      </w:pPr>
+    </w:p>
+    <w:p>
+      <w:pPr>
+        <w:pStyle w:val="CaptionedFigure"/>
+      </w:pPr>
+      <w:r>
+        <w:rPr>
+          <w:noProof/>
+        </w:rPr>
+        <w:lastRenderedPageBreak/>
+        <w:drawing>
+          <wp:inline distT="0" distB="0" distL="0" distR="0" wp14:anchorId="513C18BC" wp14:editId="1D0AE5AF">
+            <wp:extent cx="3492708" cy="3106297"/>
+            <wp:effectExtent l="0" t="0" r="0" b="0"/>
+            <wp:docPr id="1984066139" name="Picture" descr="SI Figure 6: Evaluation of spatial autocorrelation (Pearson correlation on the y-axis) for residuals in each year (1 = 2010; 13 = 2022). There was no consistent evidence of spatial autocorrelation of residuals."/>
+            <wp:cNvGraphicFramePr/>
+            <a:graphic xmlns:a="http://schemas.openxmlformats.org/drawingml/2006/main">
+              <a:graphicData uri="http://schemas.openxmlformats.org/drawingml/2006/picture">
+                <pic:pic xmlns:pic="http://schemas.openxmlformats.org/drawingml/2006/picture">
+                  <pic:nvPicPr>
+                    <pic:cNvPr id="37" name="Picture" descr="../pictures/final/spatial_autocorrelation_yrly.jpg"/>
+                    <pic:cNvPicPr>
+                      <a:picLocks noChangeAspect="1" noChangeArrowheads="1"/>
+                    </pic:cNvPicPr>
+                  </pic:nvPicPr>
+                  <pic:blipFill rotWithShape="1">
+                    <a:blip r:embed="rId18"/>
+                    <a:srcRect t="80047" r="64690"/>
+                    <a:stretch>
+                      <a:fillRect/>
+                    </a:stretch>
+                  </pic:blipFill>
+                  <pic:spPr bwMode="auto">
+                    <a:xfrm>
+                      <a:off x="0" y="0"/>
+                      <a:ext cx="3546272" cy="3153935"/>
+                    </a:xfrm>
+                    <a:prstGeom prst="rect">
+                      <a:avLst/>
+                    </a:prstGeom>
+                    <a:noFill/>
+                    <a:ln>
+                      <a:noFill/>
+                    </a:ln>
+                    <a:extLst>
+                      <a:ext uri="{53640926-AAD7-44D8-BBD7-CCE9431645EC}">
+                        <a14:shadowObscured xmlns:a14="http://schemas.microsoft.com/office/drawing/2010/main"/>
+                      </a:ext>
+                    </a:extLst>
+                  </pic:spPr>
+                </pic:pic>
+              </a:graphicData>
+            </a:graphic>
+          </wp:inline>
+        </w:drawing>
+      </w:r>
+    </w:p>
+    <w:p>
+      <w:pPr>
+        <w:pStyle w:val="ImageCaption"/>
+        <w:rPr>
+          <w:noProof/>
+        </w:rPr>
+      </w:pPr>
+      <w:r>
+        <w:rPr>
+          <w:b/>
+          <w:bCs/>
+        </w:rPr>
+        <w:t>SI Figure 6</w:t>
+      </w:r>
+      <w:r>
+        <w:rPr>
+          <w:b/>
+          <w:bCs/>
+        </w:rPr>
+        <w:t>.</w:t>
+      </w:r>
+      <w:r>
+        <w:t xml:space="preserve"> Evaluation of spatial autocorrelation (Pearson correlation on the y-axis) for residuals in each year (</w:t>
+      </w:r>
+      <w:r>
+        <w:t xml:space="preserve">year indices are indicated above each figure panel, where </w:t>
+      </w:r>
+      <w:r>
+        <w:t>1 = 2010</w:t>
+      </w:r>
+      <w:r>
+        <w:t>, 2 = 2011, …,</w:t>
+      </w:r>
+      <w:r>
+        <w:t xml:space="preserve"> 13 = 2022). There was no consistent evidence of spatial autocorrelation of residuals.</w:t>
+      </w:r>
+      <w:bookmarkEnd w:id="0"/>
+      <w:r>
+        <w:rPr>
+          <w:noProof/>
+        </w:rPr>
+        <w:t xml:space="preserve"> </w:t>
+      </w:r>
+    </w:p>
+    <w:p>
+      <w:pPr>
+        <w:pStyle w:val="ImageCaption"/>
+        <w:rPr>
+          <w:noProof/>
+        </w:rPr>
+      </w:pPr>
+    </w:p>
+    <w:p>
+      <w:pPr>
+        <w:pStyle w:val="ImageCaption"/>
+        <w:rPr>
+          <w:noProof/>
+        </w:rPr>
+      </w:pPr>
+    </w:p>
+    <w:p>
+      <w:pPr>
+        <w:pStyle w:val="CaptionedFigure"/>
+        <w:jc w:val="center"/>
+      </w:pPr>
+      <w:r>
+        <w:rPr>
+          <w:noProof/>
+        </w:rPr>
+        <w:drawing>
+          <wp:inline distT="0" distB="0" distL="0" distR="0" wp14:anchorId="0616A675" wp14:editId="2DFC84E3">
+            <wp:extent cx="5029200" cy="3355848"/>
+            <wp:effectExtent l="0" t="0" r="0" b="0"/>
+            <wp:docPr id="27" name="Picture" descr="SI Figure 3: Seasonal weights for climate (precipitation and maximum temperature) in the model. The dashed line indicates the ‘null’ weight in which all time periods would have equal weights. Any weights that extend clearly above this line have significant importance to the climate variable. Seasons are based on bird biology and include Br: breeding (February - May), Fl: fledging (May - June), Su: summer localized foraging (July), SW: summer and winter dispersed foraging (‘irruption’; August - January)."/>
+            <wp:cNvGraphicFramePr>
+              <a:graphicFrameLocks xmlns:a="http://schemas.openxmlformats.org/drawingml/2006/main" noChangeAspect="1"/>
+            </wp:cNvGraphicFramePr>
+            <a:graphic xmlns:a="http://schemas.openxmlformats.org/drawingml/2006/main">
+              <a:graphicData uri="http://schemas.openxmlformats.org/drawingml/2006/picture">
+                <pic:pic xmlns:pic="http://schemas.openxmlformats.org/drawingml/2006/picture">
+                  <pic:nvPicPr>
+                    <pic:cNvPr id="28" name="Picture" descr="../pictures/final/climate_weight_plots.jpg"/>
+                    <pic:cNvPicPr>
+                      <a:picLocks noChangeAspect="1" noChangeArrowheads="1"/>
+                    </pic:cNvPicPr>
+                  </pic:nvPicPr>
+                  <pic:blipFill>
+                    <a:blip r:embed="rId19"/>
+                    <a:stretch>
+                      <a:fillRect/>
+                    </a:stretch>
+                  </pic:blipFill>
+                  <pic:spPr bwMode="auto">
+                    <a:xfrm>
+                      <a:off x="0" y="0"/>
+                      <a:ext cx="5029200" cy="3355848"/>
                     </a:xfrm>
                     <a:prstGeom prst="rect">
                       <a:avLst/>
@@ -133,253 +2067,46 @@
         <w:pStyle w:val="ImageCaption"/>
       </w:pPr>
       <w:r>
-        <w:t xml:space="preserve">SI Figure 2: Convergence statistics for biological (a and a0) and detection (c and c0) covariate effects, deviance, and the cone and climate weights (wA, wB, and wC). All covariate effects and parameters converged with Rhat values &lt;= 1.1 (dashed line).</w:t>
-      </w:r>
-    </w:p>
-    <w:p>
-      <w:pPr>
-        <w:pStyle w:val="CaptionedFigure"/>
-      </w:pPr>
-      <w:r>
-        <w:drawing>
-          <wp:inline>
-            <wp:extent cx="3810000" cy="2540000"/>
-            <wp:effectExtent b="0" l="0" r="0" t="0"/>
-            <wp:docPr descr="SI Figure 3: Seasonal weights for climate (precipitation and maximum temperature) in the model. The dashed line indicates the ‘null’ weight in which all time periods would have equal weights. Any weights that extend clearly above this line have significant importance to the climate variable. Seasons are based on bird biology and include Br: breeding (February - May), Fl: fledging (May - June), Su: summer localized foraging (July), SW: summer and winter dispersed foraging (‘irruption’; August - January)." title="" id="27" name="Picture"/>
-            <a:graphic>
-              <a:graphicData uri="http://schemas.openxmlformats.org/drawingml/2006/picture">
-                <pic:pic>
-                  <pic:nvPicPr>
-                    <pic:cNvPr descr="../pictures/final/climate_weight_plots.jpg" id="28" name="Picture"/>
-                    <pic:cNvPicPr>
-                      <a:picLocks noChangeArrowheads="1" noChangeAspect="1"/>
-                    </pic:cNvPicPr>
-                  </pic:nvPicPr>
-                  <pic:blipFill>
-                    <a:blip r:embed="rId26"/>
-                    <a:stretch>
-                      <a:fillRect/>
-                    </a:stretch>
-                  </pic:blipFill>
-                  <pic:spPr bwMode="auto">
-                    <a:xfrm>
-                      <a:off x="0" y="0"/>
-                      <a:ext cx="3810000" cy="2540000"/>
-                    </a:xfrm>
-                    <a:prstGeom prst="rect">
-                      <a:avLst/>
-                    </a:prstGeom>
-                    <a:noFill/>
-                    <a:ln w="9525">
-                      <a:noFill/>
-                      <a:headEnd/>
-                      <a:tailEnd/>
-                    </a:ln>
-                  </pic:spPr>
-                </pic:pic>
-              </a:graphicData>
-            </a:graphic>
-          </wp:inline>
-        </w:drawing>
+        <w:rPr>
+          <w:b/>
+          <w:bCs/>
+        </w:rPr>
+        <w:t>SI Figure 3.</w:t>
+      </w:r>
+      <w:r>
+        <w:t xml:space="preserve"> Posterior estimates (median and 95% CI) for the seasonal importance weights for climate (precipitation and maximum temperature; </w:t>
+      </w:r>
+      <w:r>
+        <w:rPr>
+          <w:i/>
+          <w:iCs/>
+        </w:rPr>
+        <w:t>w</w:t>
+      </w:r>
+      <w:r>
+        <w:t xml:space="preserve"> terms, see equation 5). The dashed </w:t>
+      </w:r>
+      <w:r>
+        <w:lastRenderedPageBreak/>
+        <w:t xml:space="preserve">horizontal line indicates the ‘null’ weight in which all time periods would have equal weights. Any weights that extend clearly above this line suggest significant importance of the corresponding climate variable during that season to pinyon jay abundance. Seasons are based on pinyon jay biology and </w:t>
+      </w:r>
+      <w:proofErr w:type="gramStart"/>
+      <w:r>
+        <w:t>include:</w:t>
+      </w:r>
+      <w:proofErr w:type="gramEnd"/>
+      <w:r>
+        <w:t xml:space="preserve"> Br (breeding; February - May), Fl (fledging; May - June), Su (summer localized foraging; July), and SW (summer and winter dispersed foraging or ‘irruption’ period; August - January).</w:t>
       </w:r>
     </w:p>
     <w:p>
       <w:pPr>
         <w:pStyle w:val="ImageCaption"/>
       </w:pPr>
-      <w:r>
-        <w:t xml:space="preserve">SI Figure 3: Seasonal weights for climate (precipitation and maximum temperature) in the model. The dashed line indicates the</w:t>
-      </w:r>
-      <w:r>
-        <w:t xml:space="preserve"> </w:t>
-      </w:r>
-      <w:r>
-        <w:t xml:space="preserve">‘null’</w:t>
-      </w:r>
-      <w:r>
-        <w:t xml:space="preserve"> </w:t>
-      </w:r>
-      <w:r>
-        <w:t xml:space="preserve">weight in which all time periods would have equal weights. Any weights that extend clearly above this line have significant importance to the climate variable. Seasons are based on bird biology and include Br: breeding (February - May), Fl: fledging (May - June), Su: summer localized foraging (July), SW: summer and winter dispersed foraging (</w:t>
-      </w:r>
-      <w:r>
-        <w:t xml:space="preserve">‘irruption’</w:t>
-      </w:r>
-      <w:r>
-        <w:t xml:space="preserve">; August - January).</w:t>
-      </w:r>
-    </w:p>
-    <w:p>
-      <w:pPr>
-        <w:pStyle w:val="CaptionedFigure"/>
-      </w:pPr>
-      <w:r>
-        <w:drawing>
-          <wp:inline>
-            <wp:extent cx="3810000" cy="2540000"/>
-            <wp:effectExtent b="0" l="0" r="0" t="0"/>
-            <wp:docPr descr="SI Figure 4: As an evaluation of goodness-of-fit, we examined a) the relationship between observed pinyon jay counts and counts predicted from the model (median and 95% Bayesian Credible Interval) and b) the R2 of this relationship from ~1000 posterior samples. In a), the dashed line represents the 1:1 line where predictions exactly match. In b) the dashed vertical line represents the mean R2." title="" id="30" name="Picture"/>
-            <a:graphic>
-              <a:graphicData uri="http://schemas.openxmlformats.org/drawingml/2006/picture">
-                <pic:pic>
-                  <pic:nvPicPr>
-                    <pic:cNvPr descr="../pictures/final/y_yrep_linearr2.jpg" id="31" name="Picture"/>
-                    <pic:cNvPicPr>
-                      <a:picLocks noChangeArrowheads="1" noChangeAspect="1"/>
-                    </pic:cNvPicPr>
-                  </pic:nvPicPr>
-                  <pic:blipFill>
-                    <a:blip r:embed="rId29"/>
-                    <a:stretch>
-                      <a:fillRect/>
-                    </a:stretch>
-                  </pic:blipFill>
-                  <pic:spPr bwMode="auto">
-                    <a:xfrm>
-                      <a:off x="0" y="0"/>
-                      <a:ext cx="3810000" cy="2540000"/>
-                    </a:xfrm>
-                    <a:prstGeom prst="rect">
-                      <a:avLst/>
-                    </a:prstGeom>
-                    <a:noFill/>
-                    <a:ln w="9525">
-                      <a:noFill/>
-                      <a:headEnd/>
-                      <a:tailEnd/>
-                    </a:ln>
-                  </pic:spPr>
-                </pic:pic>
-              </a:graphicData>
-            </a:graphic>
-          </wp:inline>
-        </w:drawing>
-      </w:r>
-    </w:p>
-    <w:p>
-      <w:pPr>
-        <w:pStyle w:val="ImageCaption"/>
-      </w:pPr>
-      <w:r>
-        <w:t xml:space="preserve">SI Figure 4: As an evaluation of goodness-of-fit, we examined a) the relationship between observed pinyon jay counts and counts predicted from the model (median and 95% Bayesian Credible Interval) and b) the R2 of this relationship from ~1000 posterior samples. In a), the dashed line represents the 1:1 line where predictions exactly match. In b) the dashed vertical line represents the mean R2.</w:t>
-      </w:r>
-    </w:p>
-    <w:p>
-      <w:pPr>
-        <w:pStyle w:val="CaptionedFigure"/>
-      </w:pPr>
-      <w:r>
-        <w:drawing>
-          <wp:inline>
-            <wp:extent cx="3810000" cy="2540000"/>
-            <wp:effectExtent b="0" l="0" r="0" t="0"/>
-            <wp:docPr descr="SI Figure 5: RMSE for the test and out of sample (oos) datasets. Values for RMSE are on the scale of the data (counts of pinyon jays). They are relatively small compared to the range of possible counts in a checklist (0 - 350 birds in our test dataset)." title="" id="33" name="Picture"/>
-            <a:graphic>
-              <a:graphicData uri="http://schemas.openxmlformats.org/drawingml/2006/picture">
-                <pic:pic>
-                  <pic:nvPicPr>
-                    <pic:cNvPr descr="../pictures/final/RMSE.jpg" id="34" name="Picture"/>
-                    <pic:cNvPicPr>
-                      <a:picLocks noChangeArrowheads="1" noChangeAspect="1"/>
-                    </pic:cNvPicPr>
-                  </pic:nvPicPr>
-                  <pic:blipFill>
-                    <a:blip r:embed="rId32"/>
-                    <a:stretch>
-                      <a:fillRect/>
-                    </a:stretch>
-                  </pic:blipFill>
-                  <pic:spPr bwMode="auto">
-                    <a:xfrm>
-                      <a:off x="0" y="0"/>
-                      <a:ext cx="3810000" cy="2540000"/>
-                    </a:xfrm>
-                    <a:prstGeom prst="rect">
-                      <a:avLst/>
-                    </a:prstGeom>
-                    <a:noFill/>
-                    <a:ln w="9525">
-                      <a:noFill/>
-                      <a:headEnd/>
-                      <a:tailEnd/>
-                    </a:ln>
-                  </pic:spPr>
-                </pic:pic>
-              </a:graphicData>
-            </a:graphic>
-          </wp:inline>
-        </w:drawing>
-      </w:r>
-    </w:p>
-    <w:p>
-      <w:pPr>
-        <w:pStyle w:val="ImageCaption"/>
-      </w:pPr>
-      <w:r>
-        <w:t xml:space="preserve">SI Figure 5: RMSE for the test and out of sample (oos) datasets. Values for RMSE are on the scale of the data (counts of pinyon jays). They are relatively small compared to the range of possible counts in a checklist (0 - 350 birds in our test dataset).</w:t>
-      </w:r>
-    </w:p>
-    <w:p>
-      <w:pPr>
-        <w:pStyle w:val="CaptionedFigure"/>
-      </w:pPr>
-      <w:r>
-        <w:drawing>
-          <wp:inline>
-            <wp:extent cx="4457700" cy="7015799"/>
-            <wp:effectExtent b="0" l="0" r="0" t="0"/>
-            <wp:docPr descr="SI Figure 6: Evaluation of spatial autocorrelation (Pearson correlation on the y-axis) for residuals in each year (1 = 2010; 13 = 2022). There was no consistent evidence of spatial autocorrelation of residuals." title="" id="36" name="Picture"/>
-            <a:graphic>
-              <a:graphicData uri="http://schemas.openxmlformats.org/drawingml/2006/picture">
-                <pic:pic>
-                  <pic:nvPicPr>
-                    <pic:cNvPr descr="../pictures/final/spatial_autocorrelation_yrly.jpg" id="37" name="Picture"/>
-                    <pic:cNvPicPr>
-                      <a:picLocks noChangeArrowheads="1" noChangeAspect="1"/>
-                    </pic:cNvPicPr>
-                  </pic:nvPicPr>
-                  <pic:blipFill>
-                    <a:blip r:embed="rId35"/>
-                    <a:stretch>
-                      <a:fillRect/>
-                    </a:stretch>
-                  </pic:blipFill>
-                  <pic:spPr bwMode="auto">
-                    <a:xfrm>
-                      <a:off x="0" y="0"/>
-                      <a:ext cx="4457700" cy="7015799"/>
-                    </a:xfrm>
-                    <a:prstGeom prst="rect">
-                      <a:avLst/>
-                    </a:prstGeom>
-                    <a:noFill/>
-                    <a:ln w="9525">
-                      <a:noFill/>
-                      <a:headEnd/>
-                      <a:tailEnd/>
-                    </a:ln>
-                  </pic:spPr>
-                </pic:pic>
-              </a:graphicData>
-            </a:graphic>
-          </wp:inline>
-        </w:drawing>
-      </w:r>
-    </w:p>
-    <w:p>
-      <w:pPr>
-        <w:pStyle w:val="ImageCaption"/>
-      </w:pPr>
-      <w:r>
-        <w:t xml:space="preserve">SI Figure 6: Evaluation of spatial autocorrelation (Pearson correlation on the y-axis) for residuals in each year (1 = 2010; 13 = 2022). There was no consistent evidence of spatial autocorrelation of residuals.</w:t>
-      </w:r>
-    </w:p>
-    <w:bookmarkEnd w:id="38"/>
+    </w:p>
     <w:sectPr>
-      <w:footerReference r:id="rId10" w:type="even"/>
-      <w:footerReference r:id="rId9" w:type="default"/>
-      <w:pgSz w:h="15840" w:w="12240"/>
-      <w:pgMar w:bottom="1440" w:footer="720" w:gutter="0" w:header="720" w:left="1440" w:right="1440" w:top="1440"/>
+      <w:pgSz w:w="12240" w:h="15840"/>
+      <w:pgMar w:top="1440" w:right="1440" w:bottom="1440" w:left="1440" w:header="720" w:footer="720" w:gutter="0"/>
       <w:lnNumType w:countBy="1" w:restart="continuous"/>
       <w:cols w:space="720"/>
       <w:titlePg/>
@@ -389,12 +2116,33 @@
 </w:document>
 </file>
 
-<file path=word/comments.xml><?xml version="1.0" encoding="utf-8"?>
-<w:comments xmlns:w="http://schemas.openxmlformats.org/wordprocessingml/2006/main" xmlns:m="http://schemas.openxmlformats.org/officeDocument/2006/math" xmlns:r="http://schemas.openxmlformats.org/officeDocument/2006/relationships" xmlns:o="urn:schemas-microsoft-com:office:office" xmlns:v="urn:schemas-microsoft-com:vml" xmlns:w10="urn:schemas-microsoft-com:office:word" xmlns:a="http://schemas.openxmlformats.org/drawingml/2006/main" xmlns:pic="http://schemas.openxmlformats.org/drawingml/2006/picture" xmlns:wp="http://schemas.openxmlformats.org/drawingml/2006/wordprocessingDrawing"/>
+<file path=word/endnotes.xml><?xml version="1.0" encoding="utf-8"?>
+<w:endnotes xmlns:wpc="http://schemas.microsoft.com/office/word/2010/wordprocessingCanvas" xmlns:cx="http://schemas.microsoft.com/office/drawing/2014/chartex" xmlns:cx1="http://schemas.microsoft.com/office/drawing/2015/9/8/chartex" xmlns:cx2="http://schemas.microsoft.com/office/drawing/2015/10/21/chartex" xmlns:cx3="http://schemas.microsoft.com/office/drawing/2016/5/9/chartex" xmlns:cx4="http://schemas.microsoft.com/office/drawing/2016/5/10/chartex" xmlns:cx5="http://schemas.microsoft.com/office/drawing/2016/5/11/chartex" xmlns:cx6="http://schemas.microsoft.com/office/drawing/2016/5/12/chartex" xmlns:cx7="http://schemas.microsoft.com/office/drawing/2016/5/13/chartex" xmlns:cx8="http://schemas.microsoft.com/office/drawing/2016/5/14/chartex" xmlns:mc="http://schemas.openxmlformats.org/markup-compatibility/2006" xmlns:aink="http://schemas.microsoft.com/office/drawing/2016/ink" xmlns:am3d="http://schemas.microsoft.com/office/drawing/2017/model3d" xmlns:o="urn:schemas-microsoft-com:office:office" xmlns:oel="http://schemas.microsoft.com/office/2019/extlst" xmlns:r="http://schemas.openxmlformats.org/officeDocument/2006/relationships" xmlns:m="http://schemas.openxmlformats.org/officeDocument/2006/math" xmlns:v="urn:schemas-microsoft-com:vml" xmlns:wp14="http://schemas.microsoft.com/office/word/2010/wordprocessingDrawing" xmlns:wp="http://schemas.openxmlformats.org/drawingml/2006/wordprocessingDrawing" xmlns:w10="urn:schemas-microsoft-com:office:word" xmlns:w="http://schemas.openxmlformats.org/wordprocessingml/2006/main" xmlns:w14="http://schemas.microsoft.com/office/word/2010/wordml" xmlns:w15="http://schemas.microsoft.com/office/word/2012/wordml" xmlns:w16cex="http://schemas.microsoft.com/office/word/2018/wordml/cex" xmlns:w16cid="http://schemas.microsoft.com/office/word/2016/wordml/cid" xmlns:w16="http://schemas.microsoft.com/office/word/2018/wordml" xmlns:w16du="http://schemas.microsoft.com/office/word/2023/wordml/word16du" xmlns:w16sdtdh="http://schemas.microsoft.com/office/word/2020/wordml/sdtdatahash" xmlns:w16sdtfl="http://schemas.microsoft.com/office/word/2024/wordml/sdtformatlock" xmlns:w16se="http://schemas.microsoft.com/office/word/2015/wordml/symex" xmlns:wpg="http://schemas.microsoft.com/office/word/2010/wordprocessingGroup" xmlns:wpi="http://schemas.microsoft.com/office/word/2010/wordprocessingInk" xmlns:wne="http://schemas.microsoft.com/office/word/2006/wordml" xmlns:wps="http://schemas.microsoft.com/office/word/2010/wordprocessingShape" mc:Ignorable="w14 w15 w16se w16cid w16 w16cex w16sdtdh w16sdtfl w16du wp14">
+  <w:endnote w:type="separator" w:id="-1">
+    <w:p>
+      <w:pPr>
+        <w:spacing w:after="0"/>
+      </w:pPr>
+      <w:r>
+        <w:separator/>
+      </w:r>
+    </w:p>
+  </w:endnote>
+  <w:endnote w:type="continuationSeparator" w:id="0">
+    <w:p>
+      <w:pPr>
+        <w:spacing w:after="0"/>
+      </w:pPr>
+      <w:r>
+        <w:continuationSeparator/>
+      </w:r>
+    </w:p>
+  </w:endnote>
+</w:endnotes>
 </file>
 
 <file path=word/footer1.xml><?xml version="1.0" encoding="utf-8"?>
-<w:ftr xmlns:wpc="http://schemas.microsoft.com/office/word/2010/wordprocessingCanvas" xmlns:cx="http://schemas.microsoft.com/office/drawing/2014/chartex" xmlns:cx1="http://schemas.microsoft.com/office/drawing/2015/9/8/chartex" xmlns:cx2="http://schemas.microsoft.com/office/drawing/2015/10/21/chartex" xmlns:cx3="http://schemas.microsoft.com/office/drawing/2016/5/9/chartex" xmlns:cx4="http://schemas.microsoft.com/office/drawing/2016/5/10/chartex" xmlns:cx5="http://schemas.microsoft.com/office/drawing/2016/5/11/chartex" xmlns:cx6="http://schemas.microsoft.com/office/drawing/2016/5/12/chartex" xmlns:cx7="http://schemas.microsoft.com/office/drawing/2016/5/13/chartex" xmlns:cx8="http://schemas.microsoft.com/office/drawing/2016/5/14/chartex" xmlns:mc="http://schemas.openxmlformats.org/markup-compatibility/2006" xmlns:aink="http://schemas.microsoft.com/office/drawing/2016/ink" xmlns:am3d="http://schemas.microsoft.com/office/drawing/2017/model3d" xmlns:o="urn:schemas-microsoft-com:office:office" xmlns:oel="http://schemas.microsoft.com/office/2019/extlst" xmlns:r="http://schemas.openxmlformats.org/officeDocument/2006/relationships" xmlns:m="http://schemas.openxmlformats.org/officeDocument/2006/math" xmlns:v="urn:schemas-microsoft-com:vml" xmlns:wp14="http://schemas.microsoft.com/office/word/2010/wordprocessingDrawing" xmlns:wp="http://schemas.openxmlformats.org/drawingml/2006/wordprocessingDrawing" xmlns:w10="urn:schemas-microsoft-com:office:word" xmlns:w="http://schemas.openxmlformats.org/wordprocessingml/2006/main" xmlns:w14="http://schemas.microsoft.com/office/word/2010/wordml" xmlns:w15="http://schemas.microsoft.com/office/word/2012/wordml" xmlns:w16cex="http://schemas.microsoft.com/office/word/2018/wordml/cex" xmlns:w16cid="http://schemas.microsoft.com/office/word/2016/wordml/cid" xmlns:w16="http://schemas.microsoft.com/office/word/2018/wordml" xmlns:w16du="http://schemas.microsoft.com/office/word/2023/wordml/word16du" xmlns:w16sdtdh="http://schemas.microsoft.com/office/word/2020/wordml/sdtdatahash" xmlns:w16se="http://schemas.microsoft.com/office/word/2015/wordml/symex" xmlns:wpg="http://schemas.microsoft.com/office/word/2010/wordprocessingGroup" xmlns:wpi="http://schemas.microsoft.com/office/word/2010/wordprocessingInk" xmlns:wne="http://schemas.microsoft.com/office/word/2006/wordml" xmlns:wps="http://schemas.microsoft.com/office/word/2010/wordprocessingShape" mc:Ignorable="w14 w15 w16se w16cid w16 w16cex w16sdtdh w16du wp14">
+<w:ftr xmlns:wpc="http://schemas.microsoft.com/office/word/2010/wordprocessingCanvas" xmlns:cx="http://schemas.microsoft.com/office/drawing/2014/chartex" xmlns:cx1="http://schemas.microsoft.com/office/drawing/2015/9/8/chartex" xmlns:cx2="http://schemas.microsoft.com/office/drawing/2015/10/21/chartex" xmlns:cx3="http://schemas.microsoft.com/office/drawing/2016/5/9/chartex" xmlns:cx4="http://schemas.microsoft.com/office/drawing/2016/5/10/chartex" xmlns:cx5="http://schemas.microsoft.com/office/drawing/2016/5/11/chartex" xmlns:cx6="http://schemas.microsoft.com/office/drawing/2016/5/12/chartex" xmlns:cx7="http://schemas.microsoft.com/office/drawing/2016/5/13/chartex" xmlns:cx8="http://schemas.microsoft.com/office/drawing/2016/5/14/chartex" xmlns:mc="http://schemas.openxmlformats.org/markup-compatibility/2006" xmlns:aink="http://schemas.microsoft.com/office/drawing/2016/ink" xmlns:am3d="http://schemas.microsoft.com/office/drawing/2017/model3d" xmlns:o="urn:schemas-microsoft-com:office:office" xmlns:oel="http://schemas.microsoft.com/office/2019/extlst" xmlns:r="http://schemas.openxmlformats.org/officeDocument/2006/relationships" xmlns:m="http://schemas.openxmlformats.org/officeDocument/2006/math" xmlns:v="urn:schemas-microsoft-com:vml" xmlns:wp14="http://schemas.microsoft.com/office/word/2010/wordprocessingDrawing" xmlns:wp="http://schemas.openxmlformats.org/drawingml/2006/wordprocessingDrawing" xmlns:w10="urn:schemas-microsoft-com:office:word" xmlns:w="http://schemas.openxmlformats.org/wordprocessingml/2006/main" xmlns:w14="http://schemas.microsoft.com/office/word/2010/wordml" xmlns:w15="http://schemas.microsoft.com/office/word/2012/wordml" xmlns:w16cex="http://schemas.microsoft.com/office/word/2018/wordml/cex" xmlns:w16cid="http://schemas.microsoft.com/office/word/2016/wordml/cid" xmlns:w16="http://schemas.microsoft.com/office/word/2018/wordml" xmlns:w16du="http://schemas.microsoft.com/office/word/2023/wordml/word16du" xmlns:w16sdtdh="http://schemas.microsoft.com/office/word/2020/wordml/sdtdatahash" xmlns:w16sdtfl="http://schemas.microsoft.com/office/word/2024/wordml/sdtformatlock" xmlns:w16se="http://schemas.microsoft.com/office/word/2015/wordml/symex" xmlns:wpg="http://schemas.microsoft.com/office/word/2010/wordprocessingGroup" xmlns:wpi="http://schemas.microsoft.com/office/word/2010/wordprocessingInk" xmlns:wne="http://schemas.microsoft.com/office/word/2006/wordml" xmlns:wps="http://schemas.microsoft.com/office/word/2010/wordprocessingShape" mc:Ignorable="w14 w15 w16se w16cid w16 w16cex w16sdtdh w16sdtfl w16du wp14">
   <w:sdt>
     <w:sdtPr>
       <w:rPr>
@@ -447,7 +2195,7 @@
 </file>
 
 <file path=word/footer2.xml><?xml version="1.0" encoding="utf-8"?>
-<w:ftr xmlns:wpc="http://schemas.microsoft.com/office/word/2010/wordprocessingCanvas" xmlns:cx="http://schemas.microsoft.com/office/drawing/2014/chartex" xmlns:cx1="http://schemas.microsoft.com/office/drawing/2015/9/8/chartex" xmlns:cx2="http://schemas.microsoft.com/office/drawing/2015/10/21/chartex" xmlns:cx3="http://schemas.microsoft.com/office/drawing/2016/5/9/chartex" xmlns:cx4="http://schemas.microsoft.com/office/drawing/2016/5/10/chartex" xmlns:cx5="http://schemas.microsoft.com/office/drawing/2016/5/11/chartex" xmlns:cx6="http://schemas.microsoft.com/office/drawing/2016/5/12/chartex" xmlns:cx7="http://schemas.microsoft.com/office/drawing/2016/5/13/chartex" xmlns:cx8="http://schemas.microsoft.com/office/drawing/2016/5/14/chartex" xmlns:mc="http://schemas.openxmlformats.org/markup-compatibility/2006" xmlns:aink="http://schemas.microsoft.com/office/drawing/2016/ink" xmlns:am3d="http://schemas.microsoft.com/office/drawing/2017/model3d" xmlns:o="urn:schemas-microsoft-com:office:office" xmlns:oel="http://schemas.microsoft.com/office/2019/extlst" xmlns:r="http://schemas.openxmlformats.org/officeDocument/2006/relationships" xmlns:m="http://schemas.openxmlformats.org/officeDocument/2006/math" xmlns:v="urn:schemas-microsoft-com:vml" xmlns:wp14="http://schemas.microsoft.com/office/word/2010/wordprocessingDrawing" xmlns:wp="http://schemas.openxmlformats.org/drawingml/2006/wordprocessingDrawing" xmlns:w10="urn:schemas-microsoft-com:office:word" xmlns:w="http://schemas.openxmlformats.org/wordprocessingml/2006/main" xmlns:w14="http://schemas.microsoft.com/office/word/2010/wordml" xmlns:w15="http://schemas.microsoft.com/office/word/2012/wordml" xmlns:w16cex="http://schemas.microsoft.com/office/word/2018/wordml/cex" xmlns:w16cid="http://schemas.microsoft.com/office/word/2016/wordml/cid" xmlns:w16="http://schemas.microsoft.com/office/word/2018/wordml" xmlns:w16du="http://schemas.microsoft.com/office/word/2023/wordml/word16du" xmlns:w16sdtdh="http://schemas.microsoft.com/office/word/2020/wordml/sdtdatahash" xmlns:w16se="http://schemas.microsoft.com/office/word/2015/wordml/symex" xmlns:wpg="http://schemas.microsoft.com/office/word/2010/wordprocessingGroup" xmlns:wpi="http://schemas.microsoft.com/office/word/2010/wordprocessingInk" xmlns:wne="http://schemas.microsoft.com/office/word/2006/wordml" xmlns:wps="http://schemas.microsoft.com/office/word/2010/wordprocessingShape" mc:Ignorable="w14 w15 w16se w16cid w16 w16cex w16sdtdh w16du wp14">
+<w:ftr xmlns:wpc="http://schemas.microsoft.com/office/word/2010/wordprocessingCanvas" xmlns:cx="http://schemas.microsoft.com/office/drawing/2014/chartex" xmlns:cx1="http://schemas.microsoft.com/office/drawing/2015/9/8/chartex" xmlns:cx2="http://schemas.microsoft.com/office/drawing/2015/10/21/chartex" xmlns:cx3="http://schemas.microsoft.com/office/drawing/2016/5/9/chartex" xmlns:cx4="http://schemas.microsoft.com/office/drawing/2016/5/10/chartex" xmlns:cx5="http://schemas.microsoft.com/office/drawing/2016/5/11/chartex" xmlns:cx6="http://schemas.microsoft.com/office/drawing/2016/5/12/chartex" xmlns:cx7="http://schemas.microsoft.com/office/drawing/2016/5/13/chartex" xmlns:cx8="http://schemas.microsoft.com/office/drawing/2016/5/14/chartex" xmlns:mc="http://schemas.openxmlformats.org/markup-compatibility/2006" xmlns:aink="http://schemas.microsoft.com/office/drawing/2016/ink" xmlns:am3d="http://schemas.microsoft.com/office/drawing/2017/model3d" xmlns:o="urn:schemas-microsoft-com:office:office" xmlns:oel="http://schemas.microsoft.com/office/2019/extlst" xmlns:r="http://schemas.openxmlformats.org/officeDocument/2006/relationships" xmlns:m="http://schemas.openxmlformats.org/officeDocument/2006/math" xmlns:v="urn:schemas-microsoft-com:vml" xmlns:wp14="http://schemas.microsoft.com/office/word/2010/wordprocessingDrawing" xmlns:wp="http://schemas.openxmlformats.org/drawingml/2006/wordprocessingDrawing" xmlns:w10="urn:schemas-microsoft-com:office:word" xmlns:w="http://schemas.openxmlformats.org/wordprocessingml/2006/main" xmlns:w14="http://schemas.microsoft.com/office/word/2010/wordml" xmlns:w15="http://schemas.microsoft.com/office/word/2012/wordml" xmlns:w16cex="http://schemas.microsoft.com/office/word/2018/wordml/cex" xmlns:w16cid="http://schemas.microsoft.com/office/word/2016/wordml/cid" xmlns:w16="http://schemas.microsoft.com/office/word/2018/wordml" xmlns:w16du="http://schemas.microsoft.com/office/word/2023/wordml/word16du" xmlns:w16sdtdh="http://schemas.microsoft.com/office/word/2020/wordml/sdtdatahash" xmlns:w16sdtfl="http://schemas.microsoft.com/office/word/2024/wordml/sdtformatlock" xmlns:w16se="http://schemas.microsoft.com/office/word/2015/wordml/symex" xmlns:wpg="http://schemas.microsoft.com/office/word/2010/wordprocessingGroup" xmlns:wpi="http://schemas.microsoft.com/office/word/2010/wordprocessingInk" xmlns:wne="http://schemas.microsoft.com/office/word/2006/wordml" xmlns:wps="http://schemas.microsoft.com/office/word/2010/wordprocessingShape" mc:Ignorable="w14 w15 w16se w16cid w16 w16cex w16sdtdh w16sdtfl w16du wp14">
   <w:sdt>
     <w:sdtPr>
       <w:rPr>
@@ -513,18 +2261,24 @@
 </file>
 
 <file path=word/footnotes.xml><?xml version="1.0" encoding="utf-8"?>
-<w:footnotes xmlns:w="http://schemas.openxmlformats.org/wordprocessingml/2006/main" xmlns:m="http://schemas.openxmlformats.org/officeDocument/2006/math" xmlns:r="http://schemas.openxmlformats.org/officeDocument/2006/relationships" xmlns:o="urn:schemas-microsoft-com:office:office" xmlns:v="urn:schemas-microsoft-com:vml" xmlns:w10="urn:schemas-microsoft-com:office:word" xmlns:a="http://schemas.openxmlformats.org/drawingml/2006/main" xmlns:pic="http://schemas.openxmlformats.org/drawingml/2006/picture" xmlns:wp="http://schemas.openxmlformats.org/drawingml/2006/wordprocessingDrawing">
+<w:footnotes xmlns:wpc="http://schemas.microsoft.com/office/word/2010/wordprocessingCanvas" xmlns:cx="http://schemas.microsoft.com/office/drawing/2014/chartex" xmlns:cx1="http://schemas.microsoft.com/office/drawing/2015/9/8/chartex" xmlns:cx2="http://schemas.microsoft.com/office/drawing/2015/10/21/chartex" xmlns:cx3="http://schemas.microsoft.com/office/drawing/2016/5/9/chartex" xmlns:cx4="http://schemas.microsoft.com/office/drawing/2016/5/10/chartex" xmlns:cx5="http://schemas.microsoft.com/office/drawing/2016/5/11/chartex" xmlns:cx6="http://schemas.microsoft.com/office/drawing/2016/5/12/chartex" xmlns:cx7="http://schemas.microsoft.com/office/drawing/2016/5/13/chartex" xmlns:cx8="http://schemas.microsoft.com/office/drawing/2016/5/14/chartex" xmlns:mc="http://schemas.openxmlformats.org/markup-compatibility/2006" xmlns:aink="http://schemas.microsoft.com/office/drawing/2016/ink" xmlns:am3d="http://schemas.microsoft.com/office/drawing/2017/model3d" xmlns:o="urn:schemas-microsoft-com:office:office" xmlns:oel="http://schemas.microsoft.com/office/2019/extlst" xmlns:r="http://schemas.openxmlformats.org/officeDocument/2006/relationships" xmlns:m="http://schemas.openxmlformats.org/officeDocument/2006/math" xmlns:v="urn:schemas-microsoft-com:vml" xmlns:wp14="http://schemas.microsoft.com/office/word/2010/wordprocessingDrawing" xmlns:wp="http://schemas.openxmlformats.org/drawingml/2006/wordprocessingDrawing" xmlns:w10="urn:schemas-microsoft-com:office:word" xmlns:w="http://schemas.openxmlformats.org/wordprocessingml/2006/main" xmlns:w14="http://schemas.microsoft.com/office/word/2010/wordml" xmlns:w15="http://schemas.microsoft.com/office/word/2012/wordml" xmlns:w16cex="http://schemas.microsoft.com/office/word/2018/wordml/cex" xmlns:w16cid="http://schemas.microsoft.com/office/word/2016/wordml/cid" xmlns:w16="http://schemas.microsoft.com/office/word/2018/wordml" xmlns:w16du="http://schemas.microsoft.com/office/word/2023/wordml/word16du" xmlns:w16sdtdh="http://schemas.microsoft.com/office/word/2020/wordml/sdtdatahash" xmlns:w16sdtfl="http://schemas.microsoft.com/office/word/2024/wordml/sdtformatlock" xmlns:w16se="http://schemas.microsoft.com/office/word/2015/wordml/symex" xmlns:wpg="http://schemas.microsoft.com/office/word/2010/wordprocessingGroup" xmlns:wpi="http://schemas.microsoft.com/office/word/2010/wordprocessingInk" xmlns:wne="http://schemas.microsoft.com/office/word/2006/wordml" xmlns:wps="http://schemas.microsoft.com/office/word/2010/wordprocessingShape" mc:Ignorable="w14 w15 w16se w16cid w16 w16cex w16sdtdh w16sdtfl w16du wp14">
+  <w:footnote w:type="separator" w:id="-1">
+    <w:p>
+      <w:pPr>
+        <w:spacing w:after="0"/>
+      </w:pPr>
+      <w:r>
+        <w:separator/>
+      </w:r>
+    </w:p>
+  </w:footnote>
   <w:footnote w:type="continuationSeparator" w:id="0">
     <w:p>
+      <w:pPr>
+        <w:spacing w:after="0"/>
+      </w:pPr>
       <w:r>
         <w:continuationSeparator/>
-      </w:r>
-    </w:p>
-  </w:footnote>
-  <w:footnote w:type="separator" w:id="-1">
-    <w:p>
-      <w:r>
-        <w:separator/>
       </w:r>
     </w:p>
   </w:footnote>
@@ -532,8 +2286,85 @@
 </file>
 
 <file path=word/numbering.xml><?xml version="1.0" encoding="utf-8"?>
-<w:numbering xmlns:aink="http://schemas.microsoft.com/office/drawing/2016/ink" xmlns:am3d="http://schemas.microsoft.com/office/drawing/2017/model3d" xmlns:cx="http://schemas.microsoft.com/office/drawing/2014/chartex" xmlns:cx1="http://schemas.microsoft.com/office/drawing/2015/9/8/chartex" xmlns:cx2="http://schemas.microsoft.com/office/drawing/2015/10/21/chartex" xmlns:cx3="http://schemas.microsoft.com/office/drawing/2016/5/9/chartex" xmlns:cx4="http://schemas.microsoft.com/office/drawing/2016/5/10/chartex" xmlns:cx5="http://schemas.microsoft.com/office/drawing/2016/5/11/chartex" xmlns:cx6="http://schemas.microsoft.com/office/drawing/2016/5/12/chartex" xmlns:cx7="http://schemas.microsoft.com/office/drawing/2016/5/13/chartex" xmlns:cx8="http://schemas.microsoft.com/office/drawing/2016/5/14/chartex" xmlns:m="http://schemas.openxmlformats.org/officeDocument/2006/math" xmlns:mc="http://schemas.openxmlformats.org/markup-compatibility/2006" xmlns:o="urn:schemas-microsoft-com:office:office" xmlns:oel="http://schemas.microsoft.com/office/2019/extlst" xmlns:r="http://schemas.openxmlformats.org/officeDocument/2006/relationships" xmlns:v="urn:schemas-microsoft-com:vml" xmlns:w="http://schemas.openxmlformats.org/wordprocessingml/2006/main" xmlns:w10="urn:schemas-microsoft-com:office:word" xmlns:w14="http://schemas.microsoft.com/office/word/2010/wordml" xmlns:w15="http://schemas.microsoft.com/office/word/2012/wordml" xmlns:w16="http://schemas.microsoft.com/office/word/2018/wordml" xmlns:w16cex="http://schemas.microsoft.com/office/word/2018/wordml/cex" xmlns:w16cid="http://schemas.microsoft.com/office/word/2016/wordml/cid" xmlns:w16du="http://schemas.microsoft.com/office/word/2023/wordml/word16du" xmlns:w16sdtdh="http://schemas.microsoft.com/office/word/2020/wordml/sdtdatahash" xmlns:w16se="http://schemas.microsoft.com/office/word/2015/wordml/symex" xmlns:wne="http://schemas.microsoft.com/office/word/2006/wordml" xmlns:wp="http://schemas.openxmlformats.org/drawingml/2006/wordprocessingDrawing" xmlns:wp14="http://schemas.microsoft.com/office/word/2010/wordprocessingDrawing" xmlns:wpc="http://schemas.microsoft.com/office/word/2010/wordprocessingCanvas" xmlns:wpg="http://schemas.microsoft.com/office/word/2010/wordprocessingGroup" xmlns:wpi="http://schemas.microsoft.com/office/word/2010/wordprocessingInk" xmlns:wps="http://schemas.microsoft.com/office/word/2010/wordprocessingShape" mc:Ignorable="w14 w15 w16se w16cid w16 w16cex w16sdtdh w16du wp14">
-  <w:abstractNum w15:restartNumberingAfterBreak="0" w:abstractNumId="0">
+<w:numbering xmlns:wpc="http://schemas.microsoft.com/office/word/2010/wordprocessingCanvas" xmlns:cx="http://schemas.microsoft.com/office/drawing/2014/chartex" xmlns:cx1="http://schemas.microsoft.com/office/drawing/2015/9/8/chartex" xmlns:cx2="http://schemas.microsoft.com/office/drawing/2015/10/21/chartex" xmlns:cx3="http://schemas.microsoft.com/office/drawing/2016/5/9/chartex" xmlns:cx4="http://schemas.microsoft.com/office/drawing/2016/5/10/chartex" xmlns:cx5="http://schemas.microsoft.com/office/drawing/2016/5/11/chartex" xmlns:cx6="http://schemas.microsoft.com/office/drawing/2016/5/12/chartex" xmlns:cx7="http://schemas.microsoft.com/office/drawing/2016/5/13/chartex" xmlns:cx8="http://schemas.microsoft.com/office/drawing/2016/5/14/chartex" xmlns:mc="http://schemas.openxmlformats.org/markup-compatibility/2006" xmlns:aink="http://schemas.microsoft.com/office/drawing/2016/ink" xmlns:am3d="http://schemas.microsoft.com/office/drawing/2017/model3d" xmlns:o="urn:schemas-microsoft-com:office:office" xmlns:oel="http://schemas.microsoft.com/office/2019/extlst" xmlns:r="http://schemas.openxmlformats.org/officeDocument/2006/relationships" xmlns:m="http://schemas.openxmlformats.org/officeDocument/2006/math" xmlns:v="urn:schemas-microsoft-com:vml" xmlns:wp14="http://schemas.microsoft.com/office/word/2010/wordprocessingDrawing" xmlns:wp="http://schemas.openxmlformats.org/drawingml/2006/wordprocessingDrawing" xmlns:w10="urn:schemas-microsoft-com:office:word" xmlns:w="http://schemas.openxmlformats.org/wordprocessingml/2006/main" xmlns:w14="http://schemas.microsoft.com/office/word/2010/wordml" xmlns:w15="http://schemas.microsoft.com/office/word/2012/wordml" xmlns:w16cex="http://schemas.microsoft.com/office/word/2018/wordml/cex" xmlns:w16cid="http://schemas.microsoft.com/office/word/2016/wordml/cid" xmlns:w16="http://schemas.microsoft.com/office/word/2018/wordml" xmlns:w16du="http://schemas.microsoft.com/office/word/2023/wordml/word16du" xmlns:w16sdtdh="http://schemas.microsoft.com/office/word/2020/wordml/sdtdatahash" xmlns:w16sdtfl="http://schemas.microsoft.com/office/word/2024/wordml/sdtformatlock" xmlns:w16se="http://schemas.microsoft.com/office/word/2015/wordml/symex" xmlns:wpg="http://schemas.microsoft.com/office/word/2010/wordprocessingGroup" xmlns:wpi="http://schemas.microsoft.com/office/word/2010/wordprocessingInk" xmlns:wne="http://schemas.microsoft.com/office/word/2006/wordml" xmlns:wps="http://schemas.microsoft.com/office/word/2010/wordprocessingShape" mc:Ignorable="w14 w15 w16se w16cid w16 w16cex w16sdtdh w16sdtfl w16du wp14">
+  <w:abstractNum w:abstractNumId="0" w15:restartNumberingAfterBreak="0">
+    <w:nsid w:val="0000A990"/>
+    <w:multiLevelType w:val="multilevel"/>
+    <w:tmpl w:val="C5BEC564"/>
+    <w:lvl w:ilvl="0">
+      <w:numFmt w:val="bullet"/>
+      <w:lvlText w:val=" "/>
+      <w:lvlJc w:val="left"/>
+      <w:pPr>
+        <w:ind w:left="720" w:hanging="360"/>
+      </w:pPr>
+    </w:lvl>
+    <w:lvl w:ilvl="1">
+      <w:numFmt w:val="bullet"/>
+      <w:lvlText w:val=" "/>
+      <w:lvlJc w:val="left"/>
+      <w:pPr>
+        <w:ind w:left="1440" w:hanging="360"/>
+      </w:pPr>
+    </w:lvl>
+    <w:lvl w:ilvl="2">
+      <w:numFmt w:val="bullet"/>
+      <w:lvlText w:val=" "/>
+      <w:lvlJc w:val="left"/>
+      <w:pPr>
+        <w:ind w:left="2160" w:hanging="360"/>
+      </w:pPr>
+    </w:lvl>
+    <w:lvl w:ilvl="3">
+      <w:numFmt w:val="bullet"/>
+      <w:lvlText w:val=" "/>
+      <w:lvlJc w:val="left"/>
+      <w:pPr>
+        <w:ind w:left="2880" w:hanging="360"/>
+      </w:pPr>
+    </w:lvl>
+    <w:lvl w:ilvl="4">
+      <w:numFmt w:val="bullet"/>
+      <w:lvlText w:val=" "/>
+      <w:lvlJc w:val="left"/>
+      <w:pPr>
+        <w:ind w:left="3600" w:hanging="360"/>
+      </w:pPr>
+    </w:lvl>
+    <w:lvl w:ilvl="5">
+      <w:numFmt w:val="bullet"/>
+      <w:lvlText w:val=" "/>
+      <w:lvlJc w:val="left"/>
+      <w:pPr>
+        <w:ind w:left="4320" w:hanging="360"/>
+      </w:pPr>
+    </w:lvl>
+    <w:lvl w:ilvl="6">
+      <w:numFmt w:val="bullet"/>
+      <w:lvlText w:val=" "/>
+      <w:lvlJc w:val="left"/>
+      <w:pPr>
+        <w:ind w:left="5040" w:hanging="360"/>
+      </w:pPr>
+    </w:lvl>
+    <w:lvl w:ilvl="7">
+      <w:numFmt w:val="bullet"/>
+      <w:lvlText w:val=" "/>
+      <w:lvlJc w:val="left"/>
+      <w:pPr>
+        <w:ind w:left="5760" w:hanging="360"/>
+      </w:pPr>
+    </w:lvl>
+    <w:lvl w:ilvl="8">
+      <w:numFmt w:val="bullet"/>
+      <w:lvlText w:val=" "/>
+      <w:lvlJc w:val="left"/>
+      <w:pPr>
+        <w:ind w:left="6480" w:hanging="360"/>
+      </w:pPr>
+    </w:lvl>
+  </w:abstractNum>
+  <w:abstractNum w:abstractNumId="1" w15:restartNumberingAfterBreak="0">
     <w:nsid w:val="170CD2DE"/>
     <w:multiLevelType w:val="multilevel"/>
     <w:tmpl w:val="FBAE0E66"/>
@@ -543,9 +2374,9 @@
       <w:lvlJc w:val="left"/>
       <w:pPr>
         <w:tabs>
-          <w:tab w:pos="0" w:val="num"/>
+          <w:tab w:val="num" w:pos="0"/>
         </w:tabs>
-        <w:ind w:hanging="480" w:left="480"/>
+        <w:ind w:left="480" w:hanging="480"/>
       </w:pPr>
     </w:lvl>
     <w:lvl w:ilvl="1">
@@ -554,9 +2385,9 @@
       <w:lvlJc w:val="left"/>
       <w:pPr>
         <w:tabs>
-          <w:tab w:pos="720" w:val="num"/>
+          <w:tab w:val="num" w:pos="720"/>
         </w:tabs>
-        <w:ind w:hanging="480" w:left="1200"/>
+        <w:ind w:left="1200" w:hanging="480"/>
       </w:pPr>
     </w:lvl>
     <w:lvl w:ilvl="2">
@@ -565,9 +2396,9 @@
       <w:lvlJc w:val="left"/>
       <w:pPr>
         <w:tabs>
-          <w:tab w:pos="1440" w:val="num"/>
+          <w:tab w:val="num" w:pos="1440"/>
         </w:tabs>
-        <w:ind w:hanging="480" w:left="1920"/>
+        <w:ind w:left="1920" w:hanging="480"/>
       </w:pPr>
     </w:lvl>
     <w:lvl w:ilvl="3">
@@ -576,9 +2407,9 @@
       <w:lvlJc w:val="left"/>
       <w:pPr>
         <w:tabs>
-          <w:tab w:pos="2160" w:val="num"/>
+          <w:tab w:val="num" w:pos="2160"/>
         </w:tabs>
-        <w:ind w:hanging="480" w:left="2640"/>
+        <w:ind w:left="2640" w:hanging="480"/>
       </w:pPr>
     </w:lvl>
     <w:lvl w:ilvl="4">
@@ -587,9 +2418,9 @@
       <w:lvlJc w:val="left"/>
       <w:pPr>
         <w:tabs>
-          <w:tab w:pos="2880" w:val="num"/>
+          <w:tab w:val="num" w:pos="2880"/>
         </w:tabs>
-        <w:ind w:hanging="480" w:left="3360"/>
+        <w:ind w:left="3360" w:hanging="480"/>
       </w:pPr>
     </w:lvl>
     <w:lvl w:ilvl="5">
@@ -598,9 +2429,9 @@
       <w:lvlJc w:val="left"/>
       <w:pPr>
         <w:tabs>
-          <w:tab w:pos="3600" w:val="num"/>
+          <w:tab w:val="num" w:pos="3600"/>
         </w:tabs>
-        <w:ind w:hanging="480" w:left="4080"/>
+        <w:ind w:left="4080" w:hanging="480"/>
       </w:pPr>
     </w:lvl>
     <w:lvl w:ilvl="6">
@@ -609,9 +2440,9 @@
       <w:lvlJc w:val="left"/>
       <w:pPr>
         <w:tabs>
-          <w:tab w:pos="4320" w:val="num"/>
+          <w:tab w:val="num" w:pos="4320"/>
         </w:tabs>
-        <w:ind w:hanging="480" w:left="4800"/>
+        <w:ind w:left="4800" w:hanging="480"/>
       </w:pPr>
     </w:lvl>
     <w:lvl w:ilvl="7">
@@ -620,9 +2451,9 @@
       <w:lvlJc w:val="left"/>
       <w:pPr>
         <w:tabs>
-          <w:tab w:pos="5040" w:val="num"/>
+          <w:tab w:val="num" w:pos="5040"/>
         </w:tabs>
-        <w:ind w:hanging="480" w:left="5520"/>
+        <w:ind w:left="5520" w:hanging="480"/>
       </w:pPr>
     </w:lvl>
     <w:lvl w:ilvl="8">
@@ -631,106 +2462,30 @@
       <w:lvlJc w:val="left"/>
       <w:pPr>
         <w:tabs>
-          <w:tab w:pos="5760" w:val="num"/>
+          <w:tab w:val="num" w:pos="5760"/>
         </w:tabs>
-        <w:ind w:hanging="480" w:left="6240"/>
+        <w:ind w:left="6240" w:hanging="480"/>
       </w:pPr>
     </w:lvl>
   </w:abstractNum>
-  <w:abstractNum w:abstractNumId="990">
-    <w:nsid w:val="0000A990"/>
-    <w:multiLevelType w:val="multilevel"/>
-    <w:lvl w:ilvl="0">
-      <w:numFmt w:val="bullet"/>
-      <w:lvlText w:val=" "/>
-      <w:lvlJc w:val="left"/>
-      <w:pPr>
-        <w:ind w:left="720" w:hanging="360"/>
-      </w:pPr>
-    </w:lvl>
-    <w:lvl w:ilvl="1">
-      <w:numFmt w:val="bullet"/>
-      <w:lvlText w:val=" "/>
-      <w:lvlJc w:val="left"/>
-      <w:pPr>
-        <w:ind w:left="1440" w:hanging="360"/>
-      </w:pPr>
-    </w:lvl>
-    <w:lvl w:ilvl="2">
-      <w:numFmt w:val="bullet"/>
-      <w:lvlText w:val=" "/>
-      <w:lvlJc w:val="left"/>
-      <w:pPr>
-        <w:ind w:left="2160" w:hanging="360"/>
-      </w:pPr>
-    </w:lvl>
-    <w:lvl w:ilvl="3">
-      <w:numFmt w:val="bullet"/>
-      <w:lvlText w:val=" "/>
-      <w:lvlJc w:val="left"/>
-      <w:pPr>
-        <w:ind w:left="2880" w:hanging="360"/>
-      </w:pPr>
-    </w:lvl>
-    <w:lvl w:ilvl="4">
-      <w:numFmt w:val="bullet"/>
-      <w:lvlText w:val=" "/>
-      <w:lvlJc w:val="left"/>
-      <w:pPr>
-        <w:ind w:left="3600" w:hanging="360"/>
-      </w:pPr>
-    </w:lvl>
-    <w:lvl w:ilvl="5">
-      <w:numFmt w:val="bullet"/>
-      <w:lvlText w:val=" "/>
-      <w:lvlJc w:val="left"/>
-      <w:pPr>
-        <w:ind w:left="4320" w:hanging="360"/>
-      </w:pPr>
-    </w:lvl>
-    <w:lvl w:ilvl="6">
-      <w:numFmt w:val="bullet"/>
-      <w:lvlText w:val=" "/>
-      <w:lvlJc w:val="left"/>
-      <w:pPr>
-        <w:ind w:left="5040" w:hanging="360"/>
-      </w:pPr>
-    </w:lvl>
-    <w:lvl w:ilvl="7">
-      <w:numFmt w:val="bullet"/>
-      <w:lvlText w:val=" "/>
-      <w:lvlJc w:val="left"/>
-      <w:pPr>
-        <w:ind w:left="5760" w:hanging="360"/>
-      </w:pPr>
-    </w:lvl>
-    <w:lvl w:ilvl="8">
-      <w:numFmt w:val="bullet"/>
-      <w:lvlText w:val=" "/>
-      <w:lvlJc w:val="left"/>
-      <w:pPr>
-        <w:ind w:left="6480" w:hanging="360"/>
-      </w:pPr>
-    </w:lvl>
-  </w:abstractNum>
-  <w:num w16cid:durableId="1651514795" w:numId="1">
+  <w:num w:numId="1" w16cid:durableId="1651514795">
+    <w:abstractNumId w:val="1"/>
+  </w:num>
+  <w:num w:numId="2" w16cid:durableId="1455322053">
     <w:abstractNumId w:val="0"/>
-  </w:num>
-  <w:num w:numId="1000">
-    <w:abstractNumId w:val="990"/>
   </w:num>
 </w:numbering>
 </file>
 
 <file path=word/styles.xml><?xml version="1.0" encoding="utf-8"?>
-<w:styles xmlns:mc="http://schemas.openxmlformats.org/markup-compatibility/2006" xmlns:r="http://schemas.openxmlformats.org/officeDocument/2006/relationships" xmlns:w="http://schemas.openxmlformats.org/wordprocessingml/2006/main" xmlns:w14="http://schemas.microsoft.com/office/word/2010/wordml" xmlns:w15="http://schemas.microsoft.com/office/word/2012/wordml" xmlns:w16="http://schemas.microsoft.com/office/word/2018/wordml" xmlns:w16cex="http://schemas.microsoft.com/office/word/2018/wordml/cex" xmlns:w16cid="http://schemas.microsoft.com/office/word/2016/wordml/cid" xmlns:w16du="http://schemas.microsoft.com/office/word/2023/wordml/word16du" xmlns:w16sdtdh="http://schemas.microsoft.com/office/word/2020/wordml/sdtdatahash" xmlns:w16se="http://schemas.microsoft.com/office/word/2015/wordml/symex" mc:Ignorable="w14 w15 w16se w16cid w16 w16cex w16sdtdh w16du">
+<w:styles xmlns:mc="http://schemas.openxmlformats.org/markup-compatibility/2006" xmlns:r="http://schemas.openxmlformats.org/officeDocument/2006/relationships" xmlns:w="http://schemas.openxmlformats.org/wordprocessingml/2006/main" xmlns:w14="http://schemas.microsoft.com/office/word/2010/wordml" xmlns:w15="http://schemas.microsoft.com/office/word/2012/wordml" xmlns:w16cex="http://schemas.microsoft.com/office/word/2018/wordml/cex" xmlns:w16cid="http://schemas.microsoft.com/office/word/2016/wordml/cid" xmlns:w16="http://schemas.microsoft.com/office/word/2018/wordml" xmlns:w16du="http://schemas.microsoft.com/office/word/2023/wordml/word16du" xmlns:w16sdtdh="http://schemas.microsoft.com/office/word/2020/wordml/sdtdatahash" xmlns:w16sdtfl="http://schemas.microsoft.com/office/word/2024/wordml/sdtformatlock" xmlns:w16se="http://schemas.microsoft.com/office/word/2015/wordml/symex" mc:Ignorable="w14 w15 w16se w16cid w16 w16cex w16sdtdh w16sdtfl w16du">
   <w:docDefaults>
     <w:rPrDefault>
       <w:rPr>
-        <w:rFonts w:asciiTheme="minorHAnsi" w:cstheme="minorBidi" w:eastAsiaTheme="minorHAnsi" w:hAnsiTheme="minorHAnsi"/>
+        <w:rFonts w:asciiTheme="minorHAnsi" w:eastAsiaTheme="minorHAnsi" w:hAnsiTheme="minorHAnsi" w:cstheme="minorBidi"/>
         <w:sz w:val="24"/>
         <w:szCs w:val="24"/>
-        <w:lang w:bidi="ar-SA" w:eastAsia="en-US" w:val="en-US"/>
+        <w:lang w:val="en-US" w:eastAsia="en-US" w:bidi="ar-SA"/>
       </w:rPr>
     </w:rPrDefault>
     <w:pPrDefault>
@@ -739,7 +2494,7 @@
       </w:pPr>
     </w:pPrDefault>
   </w:docDefaults>
-  <w:latentStyles w:count="376" w:defLockedState="0" w:defQFormat="0" w:defSemiHidden="0" w:defUIPriority="0" w:defUnhideWhenUsed="0">
+  <w:latentStyles w:defLockedState="0" w:defUIPriority="0" w:defSemiHidden="0" w:defUnhideWhenUsed="0" w:defQFormat="0" w:count="376">
     <w:lsdException w:name="Normal Table" w:semiHidden="1" w:unhideWhenUsed="1"/>
     <w:lsdException w:name="Table Simple 1" w:semiHidden="1" w:unhideWhenUsed="1"/>
     <w:lsdException w:name="Table Simple 2" w:semiHidden="1" w:unhideWhenUsed="1"/>
@@ -983,11 +2738,11 @@
     <w:lsdException w:name="Unresolved Mention" w:semiHidden="1" w:uiPriority="99" w:unhideWhenUsed="1"/>
     <w:lsdException w:name="Smart Link" w:semiHidden="1" w:uiPriority="99" w:unhideWhenUsed="1"/>
   </w:latentStyles>
-  <w:style w:default="1" w:styleId="Normal" w:type="paragraph">
+  <w:style w:type="paragraph" w:default="1" w:styleId="Normal">
     <w:name w:val="Normal"/>
     <w:qFormat/>
   </w:style>
-  <w:style w:styleId="Heading1" w:type="paragraph">
+  <w:style w:type="paragraph" w:styleId="Heading1">
     <w:name w:val="heading 1"/>
     <w:basedOn w:val="Normal"/>
     <w:next w:val="BodyText"/>
@@ -997,18 +2752,18 @@
     <w:pPr>
       <w:keepNext/>
       <w:keepLines/>
-      <w:spacing w:after="0" w:before="480" w:line="480" w:lineRule="auto"/>
+      <w:spacing w:before="480" w:after="0" w:line="480" w:lineRule="auto"/>
       <w:outlineLvl w:val="0"/>
     </w:pPr>
     <w:rPr>
-      <w:rFonts w:ascii="Times New Roman" w:cstheme="majorBidi" w:eastAsiaTheme="majorEastAsia" w:hAnsi="Times New Roman"/>
+      <w:rFonts w:ascii="Times New Roman" w:eastAsiaTheme="majorEastAsia" w:hAnsi="Times New Roman" w:cstheme="majorBidi"/>
       <w:b/>
       <w:bCs/>
-      <w:color w:themeColor="text1" w:val="000000"/>
+      <w:color w:val="000000" w:themeColor="text1"/>
       <w:szCs w:val="32"/>
     </w:rPr>
   </w:style>
-  <w:style w:styleId="Heading2" w:type="paragraph">
+  <w:style w:type="paragraph" w:styleId="Heading2">
     <w:name w:val="heading 2"/>
     <w:basedOn w:val="Normal"/>
     <w:next w:val="BodyText"/>
@@ -1019,18 +2774,18 @@
     <w:pPr>
       <w:keepNext/>
       <w:keepLines/>
-      <w:spacing w:after="0" w:before="200" w:line="480" w:lineRule="auto"/>
+      <w:spacing w:before="200" w:after="0" w:line="480" w:lineRule="auto"/>
       <w:outlineLvl w:val="1"/>
     </w:pPr>
     <w:rPr>
-      <w:rFonts w:ascii="Times New Roman" w:cstheme="majorBidi" w:eastAsiaTheme="majorEastAsia" w:hAnsi="Times New Roman"/>
+      <w:rFonts w:ascii="Times New Roman" w:eastAsiaTheme="majorEastAsia" w:hAnsi="Times New Roman" w:cstheme="majorBidi"/>
       <w:b/>
       <w:bCs/>
-      <w:color w:themeColor="text1" w:val="000000"/>
+      <w:color w:val="000000" w:themeColor="text1"/>
       <w:szCs w:val="28"/>
     </w:rPr>
   </w:style>
-  <w:style w:styleId="Heading3" w:type="paragraph">
+  <w:style w:type="paragraph" w:styleId="Heading3">
     <w:name w:val="heading 3"/>
     <w:basedOn w:val="Normal"/>
     <w:next w:val="BodyText"/>
@@ -1041,17 +2796,17 @@
     <w:pPr>
       <w:keepNext/>
       <w:keepLines/>
-      <w:spacing w:after="0" w:before="200"/>
+      <w:spacing w:before="200" w:after="0"/>
       <w:outlineLvl w:val="2"/>
     </w:pPr>
     <w:rPr>
-      <w:rFonts w:ascii="Times New Roman" w:cstheme="majorBidi" w:eastAsiaTheme="majorEastAsia" w:hAnsi="Times New Roman"/>
+      <w:rFonts w:ascii="Times New Roman" w:eastAsiaTheme="majorEastAsia" w:hAnsi="Times New Roman" w:cstheme="majorBidi"/>
       <w:bCs/>
       <w:i/>
-      <w:color w:themeColor="text1" w:val="000000"/>
-    </w:rPr>
-  </w:style>
-  <w:style w:styleId="Heading4" w:type="paragraph">
+      <w:color w:val="000000" w:themeColor="text1"/>
+    </w:rPr>
+  </w:style>
+  <w:style w:type="paragraph" w:styleId="Heading4">
     <w:name w:val="heading 4"/>
     <w:basedOn w:val="Normal"/>
     <w:next w:val="BodyText"/>
@@ -1061,17 +2816,17 @@
     <w:pPr>
       <w:keepNext/>
       <w:keepLines/>
-      <w:spacing w:after="0" w:before="200"/>
+      <w:spacing w:before="200" w:after="0"/>
       <w:outlineLvl w:val="3"/>
     </w:pPr>
     <w:rPr>
-      <w:rFonts w:asciiTheme="majorHAnsi" w:cstheme="majorBidi" w:eastAsiaTheme="majorEastAsia" w:hAnsiTheme="majorHAnsi"/>
+      <w:rFonts w:asciiTheme="majorHAnsi" w:eastAsiaTheme="majorEastAsia" w:hAnsiTheme="majorHAnsi" w:cstheme="majorBidi"/>
       <w:bCs/>
       <w:i/>
-      <w:color w:themeColor="accent1" w:val="4F81BD"/>
-    </w:rPr>
-  </w:style>
-  <w:style w:styleId="Heading5" w:type="paragraph">
+      <w:color w:val="4F81BD" w:themeColor="accent1"/>
+    </w:rPr>
+  </w:style>
+  <w:style w:type="paragraph" w:styleId="Heading5">
     <w:name w:val="heading 5"/>
     <w:basedOn w:val="Normal"/>
     <w:next w:val="BodyText"/>
@@ -1081,16 +2836,16 @@
     <w:pPr>
       <w:keepNext/>
       <w:keepLines/>
-      <w:spacing w:after="0" w:before="200"/>
+      <w:spacing w:before="200" w:after="0"/>
       <w:outlineLvl w:val="4"/>
     </w:pPr>
     <w:rPr>
-      <w:rFonts w:asciiTheme="majorHAnsi" w:cstheme="majorBidi" w:eastAsiaTheme="majorEastAsia" w:hAnsiTheme="majorHAnsi"/>
+      <w:rFonts w:asciiTheme="majorHAnsi" w:eastAsiaTheme="majorEastAsia" w:hAnsiTheme="majorHAnsi" w:cstheme="majorBidi"/>
       <w:iCs/>
-      <w:color w:themeColor="accent1" w:val="4F81BD"/>
-    </w:rPr>
-  </w:style>
-  <w:style w:styleId="Heading6" w:type="paragraph">
+      <w:color w:val="4F81BD" w:themeColor="accent1"/>
+    </w:rPr>
+  </w:style>
+  <w:style w:type="paragraph" w:styleId="Heading6">
     <w:name w:val="heading 6"/>
     <w:basedOn w:val="Normal"/>
     <w:next w:val="BodyText"/>
@@ -1100,15 +2855,15 @@
     <w:pPr>
       <w:keepNext/>
       <w:keepLines/>
-      <w:spacing w:after="0" w:before="200"/>
+      <w:spacing w:before="200" w:after="0"/>
       <w:outlineLvl w:val="5"/>
     </w:pPr>
     <w:rPr>
-      <w:rFonts w:asciiTheme="majorHAnsi" w:cstheme="majorBidi" w:eastAsiaTheme="majorEastAsia" w:hAnsiTheme="majorHAnsi"/>
-      <w:color w:themeColor="accent1" w:val="4F81BD"/>
-    </w:rPr>
-  </w:style>
-  <w:style w:styleId="Heading7" w:type="paragraph">
+      <w:rFonts w:asciiTheme="majorHAnsi" w:eastAsiaTheme="majorEastAsia" w:hAnsiTheme="majorHAnsi" w:cstheme="majorBidi"/>
+      <w:color w:val="4F81BD" w:themeColor="accent1"/>
+    </w:rPr>
+  </w:style>
+  <w:style w:type="paragraph" w:styleId="Heading7">
     <w:name w:val="heading 7"/>
     <w:basedOn w:val="Normal"/>
     <w:next w:val="BodyText"/>
@@ -1118,15 +2873,15 @@
     <w:pPr>
       <w:keepNext/>
       <w:keepLines/>
-      <w:spacing w:after="0" w:before="200"/>
+      <w:spacing w:before="200" w:after="0"/>
       <w:outlineLvl w:val="6"/>
     </w:pPr>
     <w:rPr>
-      <w:rFonts w:asciiTheme="majorHAnsi" w:cstheme="majorBidi" w:eastAsiaTheme="majorEastAsia" w:hAnsiTheme="majorHAnsi"/>
-      <w:color w:themeColor="accent1" w:val="4F81BD"/>
-    </w:rPr>
-  </w:style>
-  <w:style w:styleId="Heading8" w:type="paragraph">
+      <w:rFonts w:asciiTheme="majorHAnsi" w:eastAsiaTheme="majorEastAsia" w:hAnsiTheme="majorHAnsi" w:cstheme="majorBidi"/>
+      <w:color w:val="4F81BD" w:themeColor="accent1"/>
+    </w:rPr>
+  </w:style>
+  <w:style w:type="paragraph" w:styleId="Heading8">
     <w:name w:val="heading 8"/>
     <w:basedOn w:val="Normal"/>
     <w:next w:val="BodyText"/>
@@ -1136,15 +2891,15 @@
     <w:pPr>
       <w:keepNext/>
       <w:keepLines/>
-      <w:spacing w:after="0" w:before="200"/>
+      <w:spacing w:before="200" w:after="0"/>
       <w:outlineLvl w:val="7"/>
     </w:pPr>
     <w:rPr>
-      <w:rFonts w:asciiTheme="majorHAnsi" w:cstheme="majorBidi" w:eastAsiaTheme="majorEastAsia" w:hAnsiTheme="majorHAnsi"/>
-      <w:color w:themeColor="accent1" w:val="4F81BD"/>
-    </w:rPr>
-  </w:style>
-  <w:style w:styleId="Heading9" w:type="paragraph">
+      <w:rFonts w:asciiTheme="majorHAnsi" w:eastAsiaTheme="majorEastAsia" w:hAnsiTheme="majorHAnsi" w:cstheme="majorBidi"/>
+      <w:color w:val="4F81BD" w:themeColor="accent1"/>
+    </w:rPr>
+  </w:style>
+  <w:style w:type="paragraph" w:styleId="Heading9">
     <w:name w:val="heading 9"/>
     <w:basedOn w:val="Normal"/>
     <w:next w:val="BodyText"/>
@@ -1154,69 +2909,69 @@
     <w:pPr>
       <w:keepNext/>
       <w:keepLines/>
-      <w:spacing w:after="0" w:before="200"/>
+      <w:spacing w:before="200" w:after="0"/>
       <w:outlineLvl w:val="8"/>
     </w:pPr>
     <w:rPr>
-      <w:rFonts w:asciiTheme="majorHAnsi" w:cstheme="majorBidi" w:eastAsiaTheme="majorEastAsia" w:hAnsiTheme="majorHAnsi"/>
-      <w:color w:themeColor="accent1" w:val="4F81BD"/>
-    </w:rPr>
-  </w:style>
-  <w:style w:default="1" w:styleId="DefaultParagraphFont" w:type="character">
+      <w:rFonts w:asciiTheme="majorHAnsi" w:eastAsiaTheme="majorEastAsia" w:hAnsiTheme="majorHAnsi" w:cstheme="majorBidi"/>
+      <w:color w:val="4F81BD" w:themeColor="accent1"/>
+    </w:rPr>
+  </w:style>
+  <w:style w:type="character" w:default="1" w:styleId="DefaultParagraphFont">
     <w:name w:val="Default Paragraph Font"/>
     <w:uiPriority w:val="1"/>
     <w:semiHidden/>
     <w:unhideWhenUsed/>
   </w:style>
-  <w:style w:default="1" w:styleId="TableNormal" w:type="table">
+  <w:style w:type="table" w:default="1" w:styleId="TableNormal">
     <w:name w:val="Normal Table"/>
     <w:uiPriority w:val="99"/>
     <w:semiHidden/>
     <w:unhideWhenUsed/>
     <w:tblPr>
-      <w:tblInd w:type="dxa" w:w="0"/>
+      <w:tblInd w:w="0" w:type="dxa"/>
       <w:tblCellMar>
-        <w:top w:type="dxa" w:w="0"/>
-        <w:left w:type="dxa" w:w="108"/>
-        <w:bottom w:type="dxa" w:w="0"/>
-        <w:right w:type="dxa" w:w="108"/>
+        <w:top w:w="0" w:type="dxa"/>
+        <w:left w:w="108" w:type="dxa"/>
+        <w:bottom w:w="0" w:type="dxa"/>
+        <w:right w:w="108" w:type="dxa"/>
       </w:tblCellMar>
     </w:tblPr>
   </w:style>
-  <w:style w:default="1" w:styleId="NoList" w:type="numbering">
+  <w:style w:type="numbering" w:default="1" w:styleId="NoList">
     <w:name w:val="No List"/>
     <w:uiPriority w:val="99"/>
     <w:semiHidden/>
     <w:unhideWhenUsed/>
   </w:style>
-  <w:style w:styleId="BodyText" w:type="paragraph">
+  <w:style w:type="paragraph" w:styleId="BodyText">
     <w:name w:val="Body Text"/>
     <w:basedOn w:val="Normal"/>
     <w:qFormat/>
     <w:rsid w:val="00167C71"/>
     <w:pPr>
-      <w:spacing w:after="180" w:before="180" w:line="480" w:lineRule="auto"/>
+      <w:spacing w:before="180" w:after="180" w:line="480" w:lineRule="auto"/>
     </w:pPr>
     <w:rPr>
       <w:rFonts w:ascii="Times New Roman" w:hAnsi="Times New Roman"/>
     </w:rPr>
   </w:style>
-  <w:style w:customStyle="1" w:styleId="FirstParagraph" w:type="paragraph">
+  <w:style w:type="paragraph" w:customStyle="1" w:styleId="FirstParagraph">
     <w:name w:val="First Paragraph"/>
     <w:basedOn w:val="BodyText"/>
     <w:next w:val="BodyText"/>
     <w:qFormat/>
     <w:rsid w:val="00167C71"/>
   </w:style>
-  <w:style w:customStyle="1" w:styleId="Compact" w:type="paragraph">
+  <w:style w:type="paragraph" w:customStyle="1" w:styleId="Compact">
     <w:name w:val="Compact"/>
     <w:basedOn w:val="BodyText"/>
     <w:qFormat/>
     <w:pPr>
-      <w:spacing w:after="36" w:before="36"/>
+      <w:spacing w:before="36" w:after="36"/>
     </w:pPr>
   </w:style>
-  <w:style w:styleId="Title" w:type="paragraph">
+  <w:style w:type="paragraph" w:styleId="Title">
     <w:name w:val="Title"/>
     <w:basedOn w:val="Normal"/>
     <w:next w:val="BodyText"/>
@@ -1225,16 +2980,16 @@
     <w:pPr>
       <w:keepNext/>
       <w:keepLines/>
-      <w:spacing w:after="120" w:before="360"/>
+      <w:spacing w:before="360" w:after="120"/>
     </w:pPr>
     <w:rPr>
-      <w:rFonts w:ascii="Times New Roman" w:cstheme="majorBidi" w:eastAsiaTheme="majorEastAsia" w:hAnsi="Times New Roman"/>
+      <w:rFonts w:ascii="Times New Roman" w:eastAsiaTheme="majorEastAsia" w:hAnsi="Times New Roman" w:cstheme="majorBidi"/>
       <w:bCs/>
-      <w:color w:themeColor="text1" w:val="000000"/>
+      <w:color w:val="000000" w:themeColor="text1"/>
       <w:szCs w:val="36"/>
     </w:rPr>
   </w:style>
-  <w:style w:styleId="Subtitle" w:type="paragraph">
+  <w:style w:type="paragraph" w:styleId="Subtitle">
     <w:name w:val="Subtitle"/>
     <w:basedOn w:val="Title"/>
     <w:next w:val="BodyText"/>
@@ -1247,7 +3002,7 @@
       <w:szCs w:val="30"/>
     </w:rPr>
   </w:style>
-  <w:style w:customStyle="1" w:styleId="Author" w:type="paragraph">
+  <w:style w:type="paragraph" w:customStyle="1" w:styleId="Author">
     <w:name w:val="Author"/>
     <w:next w:val="BodyText"/>
     <w:qFormat/>
@@ -1261,7 +3016,7 @@
       <w:rFonts w:ascii="Times New Roman" w:hAnsi="Times New Roman"/>
     </w:rPr>
   </w:style>
-  <w:style w:styleId="Date" w:type="paragraph">
+  <w:style w:type="paragraph" w:styleId="Date">
     <w:name w:val="Date"/>
     <w:next w:val="BodyText"/>
     <w:qFormat/>
@@ -1275,7 +3030,7 @@
       <w:rFonts w:ascii="Times New Roman" w:hAnsi="Times New Roman"/>
     </w:rPr>
   </w:style>
-  <w:style w:customStyle="1" w:styleId="Abstract" w:type="paragraph">
+  <w:style w:type="paragraph" w:customStyle="1" w:styleId="Abstract">
     <w:name w:val="Abstract"/>
     <w:basedOn w:val="Normal"/>
     <w:next w:val="BodyText"/>
@@ -1291,7 +3046,7 @@
       <w:szCs w:val="20"/>
     </w:rPr>
   </w:style>
-  <w:style w:styleId="Bibliography" w:type="paragraph">
+  <w:style w:type="paragraph" w:styleId="Bibliography">
     <w:name w:val="Bibliography"/>
     <w:basedOn w:val="Normal"/>
     <w:qFormat/>
@@ -1300,7 +3055,7 @@
       <w:rFonts w:ascii="Times New Roman" w:hAnsi="Times New Roman"/>
     </w:rPr>
   </w:style>
-  <w:style w:styleId="BlockText" w:type="paragraph">
+  <w:style w:type="paragraph" w:styleId="BlockText">
     <w:name w:val="Block Text"/>
     <w:basedOn w:val="BodyText"/>
     <w:next w:val="BodyText"/>
@@ -1308,11 +3063,11 @@
     <w:unhideWhenUsed/>
     <w:qFormat/>
     <w:pPr>
-      <w:spacing w:after="100" w:before="100"/>
+      <w:spacing w:before="100" w:after="100"/>
       <w:ind w:left="480" w:right="480"/>
     </w:pPr>
   </w:style>
-  <w:style w:styleId="FootnoteText" w:type="paragraph">
+  <w:style w:type="paragraph" w:styleId="FootnoteText">
     <w:name w:val="footnote text"/>
     <w:basedOn w:val="Normal"/>
     <w:uiPriority w:val="9"/>
@@ -1323,18 +3078,18 @@
       <w:rFonts w:ascii="Times New Roman" w:hAnsi="Times New Roman"/>
     </w:rPr>
   </w:style>
-  <w:style w:customStyle="1" w:styleId="Table" w:type="table">
+  <w:style w:type="table" w:customStyle="1" w:styleId="Table">
     <w:name w:val="Table"/>
     <w:semiHidden/>
     <w:unhideWhenUsed/>
     <w:qFormat/>
     <w:tblPr>
-      <w:tblInd w:type="dxa" w:w="0"/>
+      <w:tblInd w:w="0" w:type="dxa"/>
       <w:tblCellMar>
-        <w:top w:type="dxa" w:w="0"/>
-        <w:left w:type="dxa" w:w="108"/>
-        <w:bottom w:type="dxa" w:w="0"/>
-        <w:right w:type="dxa" w:w="108"/>
+        <w:top w:w="0" w:type="dxa"/>
+        <w:left w:w="108" w:type="dxa"/>
+        <w:bottom w:w="0" w:type="dxa"/>
+        <w:right w:w="108" w:type="dxa"/>
       </w:tblCellMar>
     </w:tblPr>
     <w:tblStylePr w:type="firstRow">
@@ -1346,13 +3101,13 @@
       </w:trPr>
       <w:tcPr>
         <w:tcBorders>
-          <w:bottom w:color="auto" w:space="0" w:sz="0" w:val="single"/>
+          <w:bottom w:val="single" w:sz="0" w:space="0" w:color="auto"/>
         </w:tcBorders>
         <w:vAlign w:val="bottom"/>
       </w:tcPr>
     </w:tblStylePr>
   </w:style>
-  <w:style w:customStyle="1" w:styleId="DefinitionTerm" w:type="paragraph">
+  <w:style w:type="paragraph" w:customStyle="1" w:styleId="DefinitionTerm">
     <w:name w:val="Definition Term"/>
     <w:basedOn w:val="Normal"/>
     <w:next w:val="Definition"/>
@@ -1367,7 +3122,7 @@
       <w:b/>
     </w:rPr>
   </w:style>
-  <w:style w:customStyle="1" w:styleId="Definition" w:type="paragraph">
+  <w:style w:type="paragraph" w:customStyle="1" w:styleId="Definition">
     <w:name w:val="Definition"/>
     <w:basedOn w:val="Normal"/>
     <w:rsid w:val="007545A8"/>
@@ -1375,7 +3130,7 @@
       <w:rFonts w:ascii="Times New Roman" w:hAnsi="Times New Roman"/>
     </w:rPr>
   </w:style>
-  <w:style w:styleId="Caption" w:type="paragraph">
+  <w:style w:type="paragraph" w:styleId="Caption">
     <w:name w:val="caption"/>
     <w:basedOn w:val="Normal"/>
     <w:link w:val="CaptionChar"/>
@@ -1386,7 +3141,7 @@
       <w:i/>
     </w:rPr>
   </w:style>
-  <w:style w:customStyle="1" w:styleId="TableCaption" w:type="paragraph">
+  <w:style w:type="paragraph" w:customStyle="1" w:styleId="TableCaption">
     <w:name w:val="Table Caption"/>
     <w:basedOn w:val="Caption"/>
     <w:rsid w:val="00167C71"/>
@@ -1398,7 +3153,7 @@
       <w:i w:val="0"/>
     </w:rPr>
   </w:style>
-  <w:style w:customStyle="1" w:styleId="ImageCaption" w:type="paragraph">
+  <w:style w:type="paragraph" w:customStyle="1" w:styleId="ImageCaption">
     <w:name w:val="Image Caption"/>
     <w:basedOn w:val="Caption"/>
     <w:rsid w:val="00167C71"/>
@@ -1407,18 +3162,18 @@
       <w:i w:val="0"/>
     </w:rPr>
   </w:style>
-  <w:style w:customStyle="1" w:styleId="Figure" w:type="paragraph">
+  <w:style w:type="paragraph" w:customStyle="1" w:styleId="Figure">
     <w:name w:val="Figure"/>
     <w:basedOn w:val="Normal"/>
   </w:style>
-  <w:style w:customStyle="1" w:styleId="CaptionedFigure" w:type="paragraph">
+  <w:style w:type="paragraph" w:customStyle="1" w:styleId="CaptionedFigure">
     <w:name w:val="Captioned Figure"/>
     <w:basedOn w:val="Figure"/>
     <w:pPr>
       <w:keepNext/>
     </w:pPr>
   </w:style>
-  <w:style w:customStyle="1" w:styleId="CaptionChar" w:type="character">
+  <w:style w:type="character" w:customStyle="1" w:styleId="CaptionChar">
     <w:name w:val="Caption Char"/>
     <w:basedOn w:val="DefaultParagraphFont"/>
     <w:link w:val="Caption"/>
@@ -1427,15 +3182,16 @@
       <w:sz w:val="24"/>
     </w:rPr>
   </w:style>
-  <w:style w:customStyle="1" w:styleId="VerbatimChar" w:type="character">
+  <w:style w:type="character" w:customStyle="1" w:styleId="VerbatimChar">
     <w:name w:val="Verbatim Char"/>
     <w:basedOn w:val="CaptionChar"/>
+    <w:link w:val="SourceCode"/>
     <w:rPr>
       <w:rFonts w:ascii="Consolas" w:hAnsi="Consolas"/>
       <w:sz w:val="22"/>
     </w:rPr>
   </w:style>
-  <w:style w:customStyle="1" w:styleId="SectionNumber" w:type="character">
+  <w:style w:type="character" w:customStyle="1" w:styleId="SectionNumber">
     <w:name w:val="Section Number"/>
     <w:basedOn w:val="CaptionChar"/>
     <w:rPr>
@@ -1443,7 +3199,7 @@
       <w:sz w:val="24"/>
     </w:rPr>
   </w:style>
-  <w:style w:styleId="FootnoteReference" w:type="character">
+  <w:style w:type="character" w:styleId="FootnoteReference">
     <w:name w:val="footnote reference"/>
     <w:basedOn w:val="CaptionChar"/>
     <w:rsid w:val="007545A8"/>
@@ -1453,16 +3209,16 @@
       <w:vertAlign w:val="superscript"/>
     </w:rPr>
   </w:style>
-  <w:style w:styleId="Hyperlink" w:type="character">
+  <w:style w:type="character" w:styleId="Hyperlink">
     <w:name w:val="Hyperlink"/>
     <w:basedOn w:val="CaptionChar"/>
     <w:rPr>
       <w:rFonts w:ascii="Times New Roman" w:hAnsi="Times New Roman"/>
-      <w:color w:themeColor="accent1" w:val="4F81BD"/>
+      <w:color w:val="4F81BD" w:themeColor="accent1"/>
       <w:sz w:val="24"/>
     </w:rPr>
   </w:style>
-  <w:style w:styleId="TOCHeading" w:type="paragraph">
+  <w:style w:type="paragraph" w:styleId="TOCHeading">
     <w:name w:val="TOC Heading"/>
     <w:basedOn w:val="Heading1"/>
     <w:next w:val="BodyText"/>
@@ -1477,23 +3233,23 @@
       <w:rFonts w:asciiTheme="majorHAnsi" w:hAnsiTheme="majorHAnsi"/>
       <w:b w:val="0"/>
       <w:bCs w:val="0"/>
-      <w:color w:themeColor="accent1" w:themeShade="BF" w:val="365F91"/>
-    </w:rPr>
-  </w:style>
-  <w:style w:styleId="Footer" w:type="paragraph">
+      <w:color w:val="365F91" w:themeColor="accent1" w:themeShade="BF"/>
+    </w:rPr>
+  </w:style>
+  <w:style w:type="paragraph" w:styleId="Footer">
     <w:name w:val="footer"/>
     <w:basedOn w:val="Normal"/>
     <w:link w:val="FooterChar"/>
     <w:rsid w:val="00167C71"/>
     <w:pPr>
       <w:tabs>
-        <w:tab w:pos="4680" w:val="center"/>
-        <w:tab w:pos="9360" w:val="right"/>
+        <w:tab w:val="center" w:pos="4680"/>
+        <w:tab w:val="right" w:pos="9360"/>
       </w:tabs>
       <w:spacing w:after="0"/>
     </w:pPr>
   </w:style>
-  <w:style w:customStyle="1" w:styleId="FooterChar" w:type="character">
+  <w:style w:type="character" w:customStyle="1" w:styleId="FooterChar">
     <w:name w:val="Footer Char"/>
     <w:basedOn w:val="DefaultParagraphFont"/>
     <w:link w:val="Footer"/>
@@ -1503,7 +3259,7 @@
       <w:sz w:val="24"/>
     </w:rPr>
   </w:style>
-  <w:style w:styleId="PageNumber" w:type="character">
+  <w:style w:type="character" w:styleId="PageNumber">
     <w:name w:val="page number"/>
     <w:basedOn w:val="DefaultParagraphFont"/>
     <w:rsid w:val="00167C71"/>
@@ -1512,7 +3268,7 @@
       <w:sz w:val="24"/>
     </w:rPr>
   </w:style>
-  <w:style w:styleId="LineNumber" w:type="character">
+  <w:style w:type="character" w:styleId="LineNumber">
     <w:name w:val="line number"/>
     <w:basedOn w:val="DefaultParagraphFont"/>
     <w:rsid w:val="00167C71"/>
@@ -1521,20 +3277,20 @@
       <w:sz w:val="24"/>
     </w:rPr>
   </w:style>
-  <w:style w:styleId="TableofAuthorities" w:type="paragraph">
+  <w:style w:type="paragraph" w:styleId="TableofAuthorities">
     <w:name w:val="table of authorities"/>
     <w:basedOn w:val="Normal"/>
     <w:next w:val="Normal"/>
     <w:rsid w:val="007545A8"/>
     <w:pPr>
       <w:spacing w:after="0"/>
-      <w:ind w:hanging="240" w:left="240"/>
+      <w:ind w:left="240" w:hanging="240"/>
     </w:pPr>
     <w:rPr>
       <w:rFonts w:ascii="Times New Roman" w:hAnsi="Times New Roman"/>
     </w:rPr>
   </w:style>
-  <w:style w:styleId="BodyText2" w:type="paragraph">
+  <w:style w:type="paragraph" w:styleId="BodyText2">
     <w:name w:val="Body Text 2"/>
     <w:basedOn w:val="Normal"/>
     <w:link w:val="BodyText2Char"/>
@@ -1546,7 +3302,7 @@
       <w:rFonts w:ascii="Times New Roman" w:hAnsi="Times New Roman"/>
     </w:rPr>
   </w:style>
-  <w:style w:customStyle="1" w:styleId="BodyText2Char" w:type="character">
+  <w:style w:type="character" w:customStyle="1" w:styleId="BodyText2Char">
     <w:name w:val="Body Text 2 Char"/>
     <w:basedOn w:val="DefaultParagraphFont"/>
     <w:link w:val="BodyText2"/>
@@ -1555,7 +3311,7 @@
       <w:rFonts w:ascii="Times New Roman" w:hAnsi="Times New Roman"/>
     </w:rPr>
   </w:style>
-  <w:style w:styleId="EndnoteReference" w:type="character">
+  <w:style w:type="character" w:styleId="EndnoteReference">
     <w:name w:val="endnote reference"/>
     <w:basedOn w:val="DefaultParagraphFont"/>
     <w:rsid w:val="0030190A"/>
@@ -1565,7 +3321,7 @@
       <w:vertAlign w:val="superscript"/>
     </w:rPr>
   </w:style>
-  <w:style w:styleId="PlaceholderText" w:type="character">
+  <w:style w:type="character" w:styleId="PlaceholderText">
     <w:name w:val="Placeholder Text"/>
     <w:basedOn w:val="DefaultParagraphFont"/>
     <w:rsid w:val="00D373F1"/>
@@ -1573,7 +3329,7 @@
       <w:color w:val="666666"/>
     </w:rPr>
   </w:style>
-  <w:style w:customStyle="1" w:styleId="Equation" w:type="paragraph">
+  <w:style w:type="paragraph" w:customStyle="1" w:styleId="Equation">
     <w:name w:val="Equation"/>
     <w:basedOn w:val="Normal"/>
     <w:qFormat/>
@@ -1588,261 +3344,375 @@
     <w:basedOn w:val="Normal"/>
     <w:link w:val="VerbatimChar"/>
     <w:pPr>
-      <w:wordWrap w:val="off"/>
-      <w:shd w:val="clear" w:fill="f1f3f5"/>
+      <w:shd w:val="clear" w:color="auto" w:fill="F1F3F5"/>
+      <w:wordWrap w:val="0"/>
     </w:pPr>
   </w:style>
   <w:style w:type="character" w:customStyle="1" w:styleId="KeywordTok">
     <w:name w:val="KeywordTok"/>
     <w:basedOn w:val="VerbatimChar"/>
     <w:rPr>
+      <w:rFonts w:ascii="Consolas" w:hAnsi="Consolas"/>
       <w:b/>
-      <w:color w:val="003b4f"/>
-      <w:shd w:val="clear" w:fill="f1f3f5"/>
+      <w:color w:val="003B4F"/>
+      <w:sz w:val="22"/>
+      <w:shd w:val="clear" w:color="auto" w:fill="F1F3F5"/>
     </w:rPr>
   </w:style>
   <w:style w:type="character" w:customStyle="1" w:styleId="DataTypeTok">
     <w:name w:val="DataTypeTok"/>
     <w:basedOn w:val="VerbatimChar"/>
     <w:rPr>
-      <w:color w:val="ad0000"/>
-      <w:shd w:val="clear" w:fill="f1f3f5"/>
+      <w:rFonts w:ascii="Consolas" w:hAnsi="Consolas"/>
+      <w:color w:val="AD0000"/>
+      <w:sz w:val="22"/>
+      <w:shd w:val="clear" w:color="auto" w:fill="F1F3F5"/>
     </w:rPr>
   </w:style>
   <w:style w:type="character" w:customStyle="1" w:styleId="DecValTok">
     <w:name w:val="DecValTok"/>
     <w:basedOn w:val="VerbatimChar"/>
     <w:rPr>
-      <w:color w:val="ad0000"/>
-      <w:shd w:val="clear" w:fill="f1f3f5"/>
+      <w:rFonts w:ascii="Consolas" w:hAnsi="Consolas"/>
+      <w:color w:val="AD0000"/>
+      <w:sz w:val="22"/>
+      <w:shd w:val="clear" w:color="auto" w:fill="F1F3F5"/>
     </w:rPr>
   </w:style>
   <w:style w:type="character" w:customStyle="1" w:styleId="BaseNTok">
     <w:name w:val="BaseNTok"/>
     <w:basedOn w:val="VerbatimChar"/>
     <w:rPr>
-      <w:color w:val="ad0000"/>
-      <w:shd w:val="clear" w:fill="f1f3f5"/>
+      <w:rFonts w:ascii="Consolas" w:hAnsi="Consolas"/>
+      <w:color w:val="AD0000"/>
+      <w:sz w:val="22"/>
+      <w:shd w:val="clear" w:color="auto" w:fill="F1F3F5"/>
     </w:rPr>
   </w:style>
   <w:style w:type="character" w:customStyle="1" w:styleId="FloatTok">
     <w:name w:val="FloatTok"/>
     <w:basedOn w:val="VerbatimChar"/>
     <w:rPr>
-      <w:color w:val="ad0000"/>
-      <w:shd w:val="clear" w:fill="f1f3f5"/>
+      <w:rFonts w:ascii="Consolas" w:hAnsi="Consolas"/>
+      <w:color w:val="AD0000"/>
+      <w:sz w:val="22"/>
+      <w:shd w:val="clear" w:color="auto" w:fill="F1F3F5"/>
     </w:rPr>
   </w:style>
   <w:style w:type="character" w:customStyle="1" w:styleId="ConstantTok">
     <w:name w:val="ConstantTok"/>
     <w:basedOn w:val="VerbatimChar"/>
     <w:rPr>
-      <w:color w:val="8f5902"/>
-      <w:shd w:val="clear" w:fill="f1f3f5"/>
+      <w:rFonts w:ascii="Consolas" w:hAnsi="Consolas"/>
+      <w:color w:val="8F5902"/>
+      <w:sz w:val="22"/>
+      <w:shd w:val="clear" w:color="auto" w:fill="F1F3F5"/>
     </w:rPr>
   </w:style>
   <w:style w:type="character" w:customStyle="1" w:styleId="CharTok">
     <w:name w:val="CharTok"/>
     <w:basedOn w:val="VerbatimChar"/>
     <w:rPr>
-      <w:color w:val="20794d"/>
-      <w:shd w:val="clear" w:fill="f1f3f5"/>
+      <w:rFonts w:ascii="Consolas" w:hAnsi="Consolas"/>
+      <w:color w:val="20794D"/>
+      <w:sz w:val="22"/>
+      <w:shd w:val="clear" w:color="auto" w:fill="F1F3F5"/>
     </w:rPr>
   </w:style>
   <w:style w:type="character" w:customStyle="1" w:styleId="SpecialCharTok">
     <w:name w:val="SpecialCharTok"/>
     <w:basedOn w:val="VerbatimChar"/>
     <w:rPr>
-      <w:color w:val="5e5e5e"/>
-      <w:shd w:val="clear" w:fill="f1f3f5"/>
+      <w:rFonts w:ascii="Consolas" w:hAnsi="Consolas"/>
+      <w:color w:val="5E5E5E"/>
+      <w:sz w:val="22"/>
+      <w:shd w:val="clear" w:color="auto" w:fill="F1F3F5"/>
     </w:rPr>
   </w:style>
   <w:style w:type="character" w:customStyle="1" w:styleId="StringTok">
     <w:name w:val="StringTok"/>
     <w:basedOn w:val="VerbatimChar"/>
     <w:rPr>
-      <w:color w:val="20794d"/>
-      <w:shd w:val="clear" w:fill="f1f3f5"/>
+      <w:rFonts w:ascii="Consolas" w:hAnsi="Consolas"/>
+      <w:color w:val="20794D"/>
+      <w:sz w:val="22"/>
+      <w:shd w:val="clear" w:color="auto" w:fill="F1F3F5"/>
     </w:rPr>
   </w:style>
   <w:style w:type="character" w:customStyle="1" w:styleId="VerbatimStringTok">
     <w:name w:val="VerbatimStringTok"/>
     <w:basedOn w:val="VerbatimChar"/>
     <w:rPr>
-      <w:color w:val="20794d"/>
-      <w:shd w:val="clear" w:fill="f1f3f5"/>
+      <w:rFonts w:ascii="Consolas" w:hAnsi="Consolas"/>
+      <w:color w:val="20794D"/>
+      <w:sz w:val="22"/>
+      <w:shd w:val="clear" w:color="auto" w:fill="F1F3F5"/>
     </w:rPr>
   </w:style>
   <w:style w:type="character" w:customStyle="1" w:styleId="SpecialStringTok">
     <w:name w:val="SpecialStringTok"/>
     <w:basedOn w:val="VerbatimChar"/>
     <w:rPr>
-      <w:color w:val="20794d"/>
-      <w:shd w:val="clear" w:fill="f1f3f5"/>
+      <w:rFonts w:ascii="Consolas" w:hAnsi="Consolas"/>
+      <w:color w:val="20794D"/>
+      <w:sz w:val="22"/>
+      <w:shd w:val="clear" w:color="auto" w:fill="F1F3F5"/>
     </w:rPr>
   </w:style>
   <w:style w:type="character" w:customStyle="1" w:styleId="ImportTok">
     <w:name w:val="ImportTok"/>
     <w:basedOn w:val="VerbatimChar"/>
     <w:rPr>
-      <w:color w:val="00769e"/>
-      <w:shd w:val="clear" w:fill="f1f3f5"/>
+      <w:rFonts w:ascii="Consolas" w:hAnsi="Consolas"/>
+      <w:color w:val="00769E"/>
+      <w:sz w:val="22"/>
+      <w:shd w:val="clear" w:color="auto" w:fill="F1F3F5"/>
     </w:rPr>
   </w:style>
   <w:style w:type="character" w:customStyle="1" w:styleId="CommentTok">
     <w:name w:val="CommentTok"/>
     <w:basedOn w:val="VerbatimChar"/>
     <w:rPr>
-      <w:color w:val="5e5e5e"/>
-      <w:shd w:val="clear" w:fill="f1f3f5"/>
+      <w:rFonts w:ascii="Consolas" w:hAnsi="Consolas"/>
+      <w:color w:val="5E5E5E"/>
+      <w:sz w:val="22"/>
+      <w:shd w:val="clear" w:color="auto" w:fill="F1F3F5"/>
     </w:rPr>
   </w:style>
   <w:style w:type="character" w:customStyle="1" w:styleId="DocumentationTok">
     <w:name w:val="DocumentationTok"/>
     <w:basedOn w:val="VerbatimChar"/>
     <w:rPr>
+      <w:rFonts w:ascii="Consolas" w:hAnsi="Consolas"/>
       <w:i/>
-      <w:color w:val="5e5e5e"/>
-      <w:shd w:val="clear" w:fill="f1f3f5"/>
+      <w:color w:val="5E5E5E"/>
+      <w:sz w:val="22"/>
+      <w:shd w:val="clear" w:color="auto" w:fill="F1F3F5"/>
     </w:rPr>
   </w:style>
   <w:style w:type="character" w:customStyle="1" w:styleId="AnnotationTok">
     <w:name w:val="AnnotationTok"/>
     <w:basedOn w:val="VerbatimChar"/>
     <w:rPr>
-      <w:color w:val="5e5e5e"/>
-      <w:shd w:val="clear" w:fill="f1f3f5"/>
+      <w:rFonts w:ascii="Consolas" w:hAnsi="Consolas"/>
+      <w:color w:val="5E5E5E"/>
+      <w:sz w:val="22"/>
+      <w:shd w:val="clear" w:color="auto" w:fill="F1F3F5"/>
     </w:rPr>
   </w:style>
   <w:style w:type="character" w:customStyle="1" w:styleId="CommentVarTok">
     <w:name w:val="CommentVarTok"/>
     <w:basedOn w:val="VerbatimChar"/>
     <w:rPr>
+      <w:rFonts w:ascii="Consolas" w:hAnsi="Consolas"/>
       <w:i/>
-      <w:color w:val="5e5e5e"/>
-      <w:shd w:val="clear" w:fill="f1f3f5"/>
+      <w:color w:val="5E5E5E"/>
+      <w:sz w:val="22"/>
+      <w:shd w:val="clear" w:color="auto" w:fill="F1F3F5"/>
     </w:rPr>
   </w:style>
   <w:style w:type="character" w:customStyle="1" w:styleId="OtherTok">
     <w:name w:val="OtherTok"/>
     <w:basedOn w:val="VerbatimChar"/>
     <w:rPr>
-      <w:color w:val="003b4f"/>
-      <w:shd w:val="clear" w:fill="f1f3f5"/>
+      <w:rFonts w:ascii="Consolas" w:hAnsi="Consolas"/>
+      <w:color w:val="003B4F"/>
+      <w:sz w:val="22"/>
+      <w:shd w:val="clear" w:color="auto" w:fill="F1F3F5"/>
     </w:rPr>
   </w:style>
   <w:style w:type="character" w:customStyle="1" w:styleId="FunctionTok">
     <w:name w:val="FunctionTok"/>
     <w:basedOn w:val="VerbatimChar"/>
     <w:rPr>
-      <w:color w:val="4758ab"/>
-      <w:shd w:val="clear" w:fill="f1f3f5"/>
+      <w:rFonts w:ascii="Consolas" w:hAnsi="Consolas"/>
+      <w:color w:val="4758AB"/>
+      <w:sz w:val="22"/>
+      <w:shd w:val="clear" w:color="auto" w:fill="F1F3F5"/>
     </w:rPr>
   </w:style>
   <w:style w:type="character" w:customStyle="1" w:styleId="VariableTok">
     <w:name w:val="VariableTok"/>
     <w:basedOn w:val="VerbatimChar"/>
     <w:rPr>
+      <w:rFonts w:ascii="Consolas" w:hAnsi="Consolas"/>
       <w:color w:val="111111"/>
-      <w:shd w:val="clear" w:fill="f1f3f5"/>
+      <w:sz w:val="22"/>
+      <w:shd w:val="clear" w:color="auto" w:fill="F1F3F5"/>
     </w:rPr>
   </w:style>
   <w:style w:type="character" w:customStyle="1" w:styleId="ControlFlowTok">
     <w:name w:val="ControlFlowTok"/>
     <w:basedOn w:val="VerbatimChar"/>
     <w:rPr>
+      <w:rFonts w:ascii="Consolas" w:hAnsi="Consolas"/>
       <w:b/>
-      <w:color w:val="003b4f"/>
-      <w:shd w:val="clear" w:fill="f1f3f5"/>
+      <w:color w:val="003B4F"/>
+      <w:sz w:val="22"/>
+      <w:shd w:val="clear" w:color="auto" w:fill="F1F3F5"/>
     </w:rPr>
   </w:style>
   <w:style w:type="character" w:customStyle="1" w:styleId="OperatorTok">
     <w:name w:val="OperatorTok"/>
     <w:basedOn w:val="VerbatimChar"/>
     <w:rPr>
-      <w:color w:val="5e5e5e"/>
-      <w:shd w:val="clear" w:fill="f1f3f5"/>
+      <w:rFonts w:ascii="Consolas" w:hAnsi="Consolas"/>
+      <w:color w:val="5E5E5E"/>
+      <w:sz w:val="22"/>
+      <w:shd w:val="clear" w:color="auto" w:fill="F1F3F5"/>
     </w:rPr>
   </w:style>
   <w:style w:type="character" w:customStyle="1" w:styleId="BuiltInTok">
     <w:name w:val="BuiltInTok"/>
     <w:basedOn w:val="VerbatimChar"/>
     <w:rPr>
-      <w:color w:val="003b4f"/>
-      <w:shd w:val="clear" w:fill="f1f3f5"/>
+      <w:rFonts w:ascii="Consolas" w:hAnsi="Consolas"/>
+      <w:color w:val="003B4F"/>
+      <w:sz w:val="22"/>
+      <w:shd w:val="clear" w:color="auto" w:fill="F1F3F5"/>
     </w:rPr>
   </w:style>
   <w:style w:type="character" w:customStyle="1" w:styleId="ExtensionTok">
     <w:name w:val="ExtensionTok"/>
     <w:basedOn w:val="VerbatimChar"/>
     <w:rPr>
-      <w:color w:val="003b4f"/>
-      <w:shd w:val="clear" w:fill="f1f3f5"/>
+      <w:rFonts w:ascii="Consolas" w:hAnsi="Consolas"/>
+      <w:color w:val="003B4F"/>
+      <w:sz w:val="22"/>
+      <w:shd w:val="clear" w:color="auto" w:fill="F1F3F5"/>
     </w:rPr>
   </w:style>
   <w:style w:type="character" w:customStyle="1" w:styleId="PreprocessorTok">
     <w:name w:val="PreprocessorTok"/>
     <w:basedOn w:val="VerbatimChar"/>
     <w:rPr>
-      <w:color w:val="ad0000"/>
-      <w:shd w:val="clear" w:fill="f1f3f5"/>
+      <w:rFonts w:ascii="Consolas" w:hAnsi="Consolas"/>
+      <w:color w:val="AD0000"/>
+      <w:sz w:val="22"/>
+      <w:shd w:val="clear" w:color="auto" w:fill="F1F3F5"/>
     </w:rPr>
   </w:style>
   <w:style w:type="character" w:customStyle="1" w:styleId="AttributeTok">
     <w:name w:val="AttributeTok"/>
     <w:basedOn w:val="VerbatimChar"/>
     <w:rPr>
+      <w:rFonts w:ascii="Consolas" w:hAnsi="Consolas"/>
       <w:color w:val="657422"/>
-      <w:shd w:val="clear" w:fill="f1f3f5"/>
+      <w:sz w:val="22"/>
+      <w:shd w:val="clear" w:color="auto" w:fill="F1F3F5"/>
     </w:rPr>
   </w:style>
   <w:style w:type="character" w:customStyle="1" w:styleId="RegionMarkerTok">
     <w:name w:val="RegionMarkerTok"/>
     <w:basedOn w:val="VerbatimChar"/>
     <w:rPr>
-      <w:color w:val="003b4f"/>
-      <w:shd w:val="clear" w:fill="f1f3f5"/>
+      <w:rFonts w:ascii="Consolas" w:hAnsi="Consolas"/>
+      <w:color w:val="003B4F"/>
+      <w:sz w:val="22"/>
+      <w:shd w:val="clear" w:color="auto" w:fill="F1F3F5"/>
     </w:rPr>
   </w:style>
   <w:style w:type="character" w:customStyle="1" w:styleId="InformationTok">
     <w:name w:val="InformationTok"/>
     <w:basedOn w:val="VerbatimChar"/>
     <w:rPr>
-      <w:color w:val="5e5e5e"/>
-      <w:shd w:val="clear" w:fill="f1f3f5"/>
+      <w:rFonts w:ascii="Consolas" w:hAnsi="Consolas"/>
+      <w:color w:val="5E5E5E"/>
+      <w:sz w:val="22"/>
+      <w:shd w:val="clear" w:color="auto" w:fill="F1F3F5"/>
     </w:rPr>
   </w:style>
   <w:style w:type="character" w:customStyle="1" w:styleId="WarningTok">
     <w:name w:val="WarningTok"/>
     <w:basedOn w:val="VerbatimChar"/>
     <w:rPr>
+      <w:rFonts w:ascii="Consolas" w:hAnsi="Consolas"/>
       <w:i/>
-      <w:color w:val="5e5e5e"/>
-      <w:shd w:val="clear" w:fill="f1f3f5"/>
+      <w:color w:val="5E5E5E"/>
+      <w:sz w:val="22"/>
+      <w:shd w:val="clear" w:color="auto" w:fill="F1F3F5"/>
     </w:rPr>
   </w:style>
   <w:style w:type="character" w:customStyle="1" w:styleId="AlertTok">
     <w:name w:val="AlertTok"/>
     <w:basedOn w:val="VerbatimChar"/>
     <w:rPr>
-      <w:color w:val="ad0000"/>
-      <w:shd w:val="clear" w:fill="f1f3f5"/>
+      <w:rFonts w:ascii="Consolas" w:hAnsi="Consolas"/>
+      <w:color w:val="AD0000"/>
+      <w:sz w:val="22"/>
+      <w:shd w:val="clear" w:color="auto" w:fill="F1F3F5"/>
     </w:rPr>
   </w:style>
   <w:style w:type="character" w:customStyle="1" w:styleId="ErrorTok">
     <w:name w:val="ErrorTok"/>
     <w:basedOn w:val="VerbatimChar"/>
     <w:rPr>
-      <w:color w:val="ad0000"/>
-      <w:shd w:val="clear" w:fill="f1f3f5"/>
+      <w:rFonts w:ascii="Consolas" w:hAnsi="Consolas"/>
+      <w:color w:val="AD0000"/>
+      <w:sz w:val="22"/>
+      <w:shd w:val="clear" w:color="auto" w:fill="F1F3F5"/>
     </w:rPr>
   </w:style>
   <w:style w:type="character" w:customStyle="1" w:styleId="NormalTok">
     <w:name w:val="NormalTok"/>
     <w:basedOn w:val="VerbatimChar"/>
     <w:rPr>
-      <w:color w:val="003b4f"/>
-      <w:shd w:val="clear" w:fill="f1f3f5"/>
+      <w:rFonts w:ascii="Consolas" w:hAnsi="Consolas"/>
+      <w:color w:val="003B4F"/>
+      <w:sz w:val="22"/>
+      <w:shd w:val="clear" w:color="auto" w:fill="F1F3F5"/>
+    </w:rPr>
+  </w:style>
+  <w:style w:type="character" w:styleId="CommentReference">
+    <w:name w:val="annotation reference"/>
+    <w:basedOn w:val="DefaultParagraphFont"/>
+    <w:rsid w:val="00FE4A42"/>
+    <w:rPr>
+      <w:sz w:val="16"/>
+      <w:szCs w:val="16"/>
+    </w:rPr>
+  </w:style>
+  <w:style w:type="paragraph" w:styleId="CommentText">
+    <w:name w:val="annotation text"/>
+    <w:basedOn w:val="Normal"/>
+    <w:link w:val="CommentTextChar"/>
+    <w:rsid w:val="00FE4A42"/>
+    <w:rPr>
+      <w:sz w:val="20"/>
+      <w:szCs w:val="20"/>
+    </w:rPr>
+  </w:style>
+  <w:style w:type="character" w:customStyle="1" w:styleId="CommentTextChar">
+    <w:name w:val="Comment Text Char"/>
+    <w:basedOn w:val="DefaultParagraphFont"/>
+    <w:link w:val="CommentText"/>
+    <w:rsid w:val="00FE4A42"/>
+    <w:rPr>
+      <w:sz w:val="20"/>
+      <w:szCs w:val="20"/>
+    </w:rPr>
+  </w:style>
+  <w:style w:type="paragraph" w:styleId="CommentSubject">
+    <w:name w:val="annotation subject"/>
+    <w:basedOn w:val="CommentText"/>
+    <w:next w:val="CommentText"/>
+    <w:link w:val="CommentSubjectChar"/>
+    <w:rsid w:val="00FE4A42"/>
+    <w:rPr>
+      <w:b/>
+      <w:bCs/>
+    </w:rPr>
+  </w:style>
+  <w:style w:type="character" w:customStyle="1" w:styleId="CommentSubjectChar">
+    <w:name w:val="Comment Subject Char"/>
+    <w:basedOn w:val="CommentTextChar"/>
+    <w:link w:val="CommentSubject"/>
+    <w:rsid w:val="00FE4A42"/>
+    <w:rPr>
+      <w:b/>
+      <w:bCs/>
+      <w:sz w:val="20"/>
+      <w:szCs w:val="20"/>
     </w:rPr>
   </w:style>
 </w:styles>
@@ -2164,4 +4034,16 @@
   </a:objectDefaults>
   <a:extraClrSchemeLst/>
 </a:theme>
+</file>
+
+<file path=customXml/item1.xml><?xml version="1.0" encoding="utf-8"?>
+<b:Sources xmlns:b="http://schemas.openxmlformats.org/officeDocument/2006/bibliography" xmlns="http://schemas.openxmlformats.org/officeDocument/2006/bibliography" SelectedStyle="\APASixthEditionOfficeOnline.xsl" StyleName="APA" Version="6"/>
+</file>
+
+<file path=customXml/itemProps1.xml><?xml version="1.0" encoding="utf-8"?>
+<ds:datastoreItem xmlns:ds="http://schemas.openxmlformats.org/officeDocument/2006/customXml" ds:itemID="{5A13A97A-6423-4340-940D-8123D6EC662F}">
+  <ds:schemaRefs>
+    <ds:schemaRef ds:uri="http://schemas.openxmlformats.org/officeDocument/2006/bibliography"/>
+  </ds:schemaRefs>
+</ds:datastoreItem>
 </file>
</xml_diff>